<commit_message>
Loại bỏ các lớp và bảng liên quan đến đơn hàng và thanh toán (DonDatHang, ChiTietDonHang, ThanhToan) - giảm từ 18 xuống 15 lớp, cập nhật mô tả nghiệp vụ UC03-UC05 loại bỏ tham chiếu đến báo cáo mua hàng/công nợ, điều chỉnh mục lục chương 7 gộp phần thiết kế báo cáo thống kê (7.3.1-7.3.6) vào thiết kế giao diện, cập nhật tiêu đề hình 4.3 và mô tả sơ đồ lớp từ "kiểm kê, đơn hàng và thanh toán" th
</commit_message>
<xml_diff>
--- a/VIII.HUST/Phân tích và thiết kế hệ thống/BaoCao/BaoCao_QuanLyKhoHang.docx
+++ b/VIII.HUST/Phân tích và thiết kế hệ thống/BaoCao/BaoCao_QuanLyKhoHang.docx
@@ -2443,163 +2443,7 @@
           <w:color w:val="000000"/>
           <w:sz w:val="24"/>
         </w:rPr>
-        <w:t>7.3  Thiết kế báo cáo thống kê chi tiết</w:t>
-      </w:r>
-      <w:r>
-        <w:rPr>
-          <w:rFonts w:ascii="Times New Roman" w:hAnsi="Times New Roman" w:eastAsia="Times New Roman"/>
-          <w:color w:val="000000"/>
-          <w:sz w:val="24"/>
-        </w:rPr>
-        <w:tab/>
-      </w:r>
-    </w:p>
-    <w:p>
-      <w:pPr>
-        <w:tabs>
-          <w:tab w:pos="8787" w:val="right" w:leader="dot"/>
-        </w:tabs>
-        <w:spacing w:after="40" w:before="20" w:line="276" w:lineRule="auto"/>
-        <w:ind w:firstLine="0" w:left="567"/>
-      </w:pPr>
-      <w:r>
-        <w:rPr>
-          <w:rFonts w:ascii="Times New Roman" w:hAnsi="Times New Roman" w:eastAsia="Times New Roman"/>
-          <w:b w:val="0"/>
-          <w:color w:val="000000"/>
-          <w:sz w:val="24"/>
-        </w:rPr>
-        <w:t>7.3.1  Báo cáo nhập -- xuất -- tồn</w:t>
-      </w:r>
-      <w:r>
-        <w:rPr>
-          <w:rFonts w:ascii="Times New Roman" w:hAnsi="Times New Roman" w:eastAsia="Times New Roman"/>
-          <w:color w:val="000000"/>
-          <w:sz w:val="24"/>
-        </w:rPr>
-        <w:tab/>
-      </w:r>
-    </w:p>
-    <w:p>
-      <w:pPr>
-        <w:tabs>
-          <w:tab w:pos="8787" w:val="right" w:leader="dot"/>
-        </w:tabs>
-        <w:spacing w:after="40" w:before="20" w:line="276" w:lineRule="auto"/>
-        <w:ind w:firstLine="0" w:left="567"/>
-      </w:pPr>
-      <w:r>
-        <w:rPr>
-          <w:rFonts w:ascii="Times New Roman" w:hAnsi="Times New Roman" w:eastAsia="Times New Roman"/>
-          <w:b w:val="0"/>
-          <w:color w:val="000000"/>
-          <w:sz w:val="24"/>
-        </w:rPr>
-        <w:t>7.3.2  Báo cáo hàng tồn kho thấp</w:t>
-      </w:r>
-      <w:r>
-        <w:rPr>
-          <w:rFonts w:ascii="Times New Roman" w:hAnsi="Times New Roman" w:eastAsia="Times New Roman"/>
-          <w:color w:val="000000"/>
-          <w:sz w:val="24"/>
-        </w:rPr>
-        <w:tab/>
-      </w:r>
-    </w:p>
-    <w:p>
-      <w:pPr>
-        <w:tabs>
-          <w:tab w:pos="8787" w:val="right" w:leader="dot"/>
-        </w:tabs>
-        <w:spacing w:after="40" w:before="20" w:line="276" w:lineRule="auto"/>
-        <w:ind w:firstLine="0" w:left="567"/>
-      </w:pPr>
-      <w:r>
-        <w:rPr>
-          <w:rFonts w:ascii="Times New Roman" w:hAnsi="Times New Roman" w:eastAsia="Times New Roman"/>
-          <w:b w:val="0"/>
-          <w:color w:val="000000"/>
-          <w:sz w:val="24"/>
-        </w:rPr>
-        <w:t>7.3.3  Báo cáo hàng bán chạy / xuất nhiều</w:t>
-      </w:r>
-      <w:r>
-        <w:rPr>
-          <w:rFonts w:ascii="Times New Roman" w:hAnsi="Times New Roman" w:eastAsia="Times New Roman"/>
-          <w:color w:val="000000"/>
-          <w:sz w:val="24"/>
-        </w:rPr>
-        <w:tab/>
-      </w:r>
-    </w:p>
-    <w:p>
-      <w:pPr>
-        <w:tabs>
-          <w:tab w:pos="8787" w:val="right" w:leader="dot"/>
-        </w:tabs>
-        <w:spacing w:after="40" w:before="20" w:line="276" w:lineRule="auto"/>
-        <w:ind w:firstLine="0" w:left="567"/>
-      </w:pPr>
-      <w:r>
-        <w:rPr>
-          <w:rFonts w:ascii="Times New Roman" w:hAnsi="Times New Roman" w:eastAsia="Times New Roman"/>
-          <w:b w:val="0"/>
-          <w:color w:val="000000"/>
-          <w:sz w:val="24"/>
-        </w:rPr>
-        <w:t>7.3.4  Báo cáo doanh thu và công nợ theo khách hàng</w:t>
-      </w:r>
-      <w:r>
-        <w:rPr>
-          <w:rFonts w:ascii="Times New Roman" w:hAnsi="Times New Roman" w:eastAsia="Times New Roman"/>
-          <w:color w:val="000000"/>
-          <w:sz w:val="24"/>
-        </w:rPr>
-        <w:tab/>
-      </w:r>
-    </w:p>
-    <w:p>
-      <w:pPr>
-        <w:tabs>
-          <w:tab w:pos="8787" w:val="right" w:leader="dot"/>
-        </w:tabs>
-        <w:spacing w:after="40" w:before="20" w:line="276" w:lineRule="auto"/>
-        <w:ind w:firstLine="0" w:left="567"/>
-      </w:pPr>
-      <w:r>
-        <w:rPr>
-          <w:rFonts w:ascii="Times New Roman" w:hAnsi="Times New Roman" w:eastAsia="Times New Roman"/>
-          <w:b w:val="0"/>
-          <w:color w:val="000000"/>
-          <w:sz w:val="24"/>
-        </w:rPr>
-        <w:t>7.3.5  Báo cáo mua hàng theo nhà cung cấp</w:t>
-      </w:r>
-      <w:r>
-        <w:rPr>
-          <w:rFonts w:ascii="Times New Roman" w:hAnsi="Times New Roman" w:eastAsia="Times New Roman"/>
-          <w:color w:val="000000"/>
-          <w:sz w:val="24"/>
-        </w:rPr>
-        <w:tab/>
-      </w:r>
-    </w:p>
-    <w:p>
-      <w:pPr>
-        <w:tabs>
-          <w:tab w:pos="8787" w:val="right" w:leader="dot"/>
-        </w:tabs>
-        <w:spacing w:after="40" w:before="20" w:line="276" w:lineRule="auto"/>
-        <w:ind w:firstLine="0" w:left="567"/>
-      </w:pPr>
-      <w:r>
-        <w:rPr>
-          <w:rFonts w:ascii="Times New Roman" w:hAnsi="Times New Roman" w:eastAsia="Times New Roman"/>
-          <w:b w:val="0"/>
-          <w:color w:val="000000"/>
-          <w:sz w:val="24"/>
-        </w:rPr>
-        <w:t>7.3.6  Định dạng xuất báo cáo</w:t>
+        <w:t>7.3  Thiết kế giao diện</w:t>
       </w:r>
       <w:r>
         <w:rPr>
@@ -2625,7 +2469,7 @@
           <w:color w:val="000000"/>
           <w:sz w:val="24"/>
         </w:rPr>
-        <w:t>7.4  Thiết kế giao diện</w:t>
+        <w:t>7.4  Kết luận chương</w:t>
       </w:r>
       <w:r>
         <w:rPr>
@@ -2634,6 +2478,25 @@
           <w:sz w:val="24"/>
         </w:rPr>
         <w:tab/>
+      </w:r>
+    </w:p>
+    <w:p>
+      <w:r>
+        <w:br w:type="page"/>
+      </w:r>
+    </w:p>
+    <w:p>
+      <w:pPr>
+        <w:pStyle w:val="Heading1"/>
+      </w:pPr>
+      <w:r>
+        <w:rPr>
+          <w:rFonts w:ascii="Times New Roman" w:hAnsi="Times New Roman" w:eastAsia="Times New Roman"/>
+          <w:b/>
+          <w:color w:val="000000"/>
+          <w:sz w:val="28"/>
+        </w:rPr>
+        <w:t>Danh sách hình vẽ</w:t>
       </w:r>
     </w:p>
     <w:p>
@@ -2651,7 +2514,7 @@
           <w:color w:val="000000"/>
           <w:sz w:val="24"/>
         </w:rPr>
-        <w:t>7.5  Kết luận chương</w:t>
+        <w:t>2.1  Sơ đồ hoạt động quy trình nhập kho</w:t>
       </w:r>
       <w:r>
         <w:rPr>
@@ -2660,25 +2523,6 @@
           <w:sz w:val="24"/>
         </w:rPr>
         <w:tab/>
-      </w:r>
-    </w:p>
-    <w:p>
-      <w:r>
-        <w:br w:type="page"/>
-      </w:r>
-    </w:p>
-    <w:p>
-      <w:pPr>
-        <w:pStyle w:val="Heading1"/>
-      </w:pPr>
-      <w:r>
-        <w:rPr>
-          <w:rFonts w:ascii="Times New Roman" w:hAnsi="Times New Roman" w:eastAsia="Times New Roman"/>
-          <w:b/>
-          <w:color w:val="000000"/>
-          <w:sz w:val="28"/>
-        </w:rPr>
-        <w:t>Danh sách hình vẽ</w:t>
       </w:r>
     </w:p>
     <w:p>
@@ -2696,7 +2540,7 @@
           <w:color w:val="000000"/>
           <w:sz w:val="24"/>
         </w:rPr>
-        <w:t>2.1  Sơ đồ hoạt động quy trình nhập kho</w:t>
+        <w:t>2.2  Sơ đồ hoạt động quy trình xuất kho</w:t>
       </w:r>
       <w:r>
         <w:rPr>
@@ -2722,7 +2566,7 @@
           <w:color w:val="000000"/>
           <w:sz w:val="24"/>
         </w:rPr>
-        <w:t>2.2  Sơ đồ hoạt động quy trình xuất kho</w:t>
+        <w:t>2.3  Sơ đồ hoạt động quy trình kiểm kê tồn kho</w:t>
       </w:r>
       <w:r>
         <w:rPr>
@@ -2748,7 +2592,7 @@
           <w:color w:val="000000"/>
           <w:sz w:val="24"/>
         </w:rPr>
-        <w:t>2.3  Sơ đồ hoạt động quy trình kiểm kê tồn kho</w:t>
+        <w:t>3.1  Sơ đồ phân cấp chức năng (BFD) hệ thống quản lý kho hàng</w:t>
       </w:r>
       <w:r>
         <w:rPr>
@@ -2774,7 +2618,7 @@
           <w:color w:val="000000"/>
           <w:sz w:val="24"/>
         </w:rPr>
-        <w:t>3.1  Sơ đồ phân cấp chức năng (BFD) hệ thống quản lý kho hàng</w:t>
+        <w:t>3.2  DFD cấp 0 (Context Diagram) – Hệ thống quản lý kho hàng</w:t>
       </w:r>
       <w:r>
         <w:rPr>
@@ -2800,7 +2644,7 @@
           <w:color w:val="000000"/>
           <w:sz w:val="24"/>
         </w:rPr>
-        <w:t>3.2  DFD cấp 0 (Context Diagram) – Hệ thống quản lý kho hàng</w:t>
+        <w:t>3.3  DFD cấp 1 – Phân rã các luồng dữ liệu trong hệ thống quản lý kho hàng</w:t>
       </w:r>
       <w:r>
         <w:rPr>
@@ -2826,7 +2670,7 @@
           <w:color w:val="000000"/>
           <w:sz w:val="24"/>
         </w:rPr>
-        <w:t>3.3  DFD cấp 1 – Phân rã các luồng dữ liệu trong hệ thống quản lý kho hàng</w:t>
+        <w:t>3.4  Sơ đồ use case tổng quát của hệ thống quản lý kho hàng</w:t>
       </w:r>
       <w:r>
         <w:rPr>
@@ -2852,7 +2696,7 @@
           <w:color w:val="000000"/>
           <w:sz w:val="24"/>
         </w:rPr>
-        <w:t>3.4  Sơ đồ use case tổng quát của hệ thống quản lý kho hàng</w:t>
+        <w:t>3.5  Sơ đồ use case phân rã -- Quản lý người dùng</w:t>
       </w:r>
       <w:r>
         <w:rPr>
@@ -2878,7 +2722,7 @@
           <w:color w:val="000000"/>
           <w:sz w:val="24"/>
         </w:rPr>
-        <w:t>3.5  Sơ đồ use case phân rã -- Quản lý người dùng</w:t>
+        <w:t>3.6  Sơ đồ use case phân rã -- Quản lý đối tác</w:t>
       </w:r>
       <w:r>
         <w:rPr>
@@ -2904,7 +2748,7 @@
           <w:color w:val="000000"/>
           <w:sz w:val="24"/>
         </w:rPr>
-        <w:t>3.6  Sơ đồ use case phân rã -- Quản lý đối tác</w:t>
+        <w:t>3.7  Sơ đồ use case phân rã -- Quản lý hàng hóa và kho</w:t>
       </w:r>
       <w:r>
         <w:rPr>
@@ -2930,7 +2774,7 @@
           <w:color w:val="000000"/>
           <w:sz w:val="24"/>
         </w:rPr>
-        <w:t>3.7  Sơ đồ use case phân rã -- Quản lý hàng hóa và kho</w:t>
+        <w:t>3.8  Sơ đồ use case phân rã -- Quản lý nhập xuất</w:t>
       </w:r>
       <w:r>
         <w:rPr>
@@ -2956,7 +2800,7 @@
           <w:color w:val="000000"/>
           <w:sz w:val="24"/>
         </w:rPr>
-        <w:t>3.8  Sơ đồ use case phân rã -- Quản lý nhập xuất</w:t>
+        <w:t>4.1  Sơ đồ lớp danh mục (Master Data)</w:t>
       </w:r>
       <w:r>
         <w:rPr>
@@ -2982,7 +2826,7 @@
           <w:color w:val="000000"/>
           <w:sz w:val="24"/>
         </w:rPr>
-        <w:t>4.1  Sơ đồ lớp danh mục (Master Data)</w:t>
+        <w:t>4.2  Sơ đồ lớp nghiệp vụ nhập xuất kho</w:t>
       </w:r>
       <w:r>
         <w:rPr>
@@ -3008,7 +2852,7 @@
           <w:color w:val="000000"/>
           <w:sz w:val="24"/>
         </w:rPr>
-        <w:t>4.2  Sơ đồ lớp nghiệp vụ nhập xuất kho</w:t>
+        <w:t>4.3  Sơ đồ lớp kiểm kê và lịch sử thao tác</w:t>
       </w:r>
       <w:r>
         <w:rPr>
@@ -3034,7 +2878,7 @@
           <w:color w:val="000000"/>
           <w:sz w:val="24"/>
         </w:rPr>
-        <w:t>4.3  Sơ đồ lớp kiểm kê, đơn hàng và thanh toán</w:t>
+        <w:t>4.4  Biểu đồ lớp trong ca sử dụng UC05 -- Quản lý hàng hóa</w:t>
       </w:r>
       <w:r>
         <w:rPr>
@@ -3060,7 +2904,7 @@
           <w:color w:val="000000"/>
           <w:sz w:val="24"/>
         </w:rPr>
-        <w:t>4.4  Biểu đồ lớp trong ca sử dụng UC05 -- Quản lý hàng hóa</w:t>
+        <w:t>4.5  Biểu đồ lớp trong ca sử dụng UC09 -- Lập phiếu nhập kho</w:t>
       </w:r>
       <w:r>
         <w:rPr>
@@ -3086,7 +2930,7 @@
           <w:color w:val="000000"/>
           <w:sz w:val="24"/>
         </w:rPr>
-        <w:t>4.5  Biểu đồ lớp trong ca sử dụng UC09 -- Lập phiếu nhập kho</w:t>
+        <w:t>4.6  Biểu đồ lớp trong ca sử dụng UC10 -- Lập phiếu xuất kho</w:t>
       </w:r>
       <w:r>
         <w:rPr>
@@ -3112,7 +2956,7 @@
           <w:color w:val="000000"/>
           <w:sz w:val="24"/>
         </w:rPr>
-        <w:t>4.6  Biểu đồ lớp trong ca sử dụng UC10 -- Lập phiếu xuất kho</w:t>
+        <w:t>5.1  Sequence diagram UC05 -- Quản lý hàng hóa</w:t>
       </w:r>
       <w:r>
         <w:rPr>
@@ -3138,7 +2982,7 @@
           <w:color w:val="000000"/>
           <w:sz w:val="24"/>
         </w:rPr>
-        <w:t>5.1  Sequence diagram UC05 -- Quản lý hàng hóa</w:t>
+        <w:t>5.2  Sequence diagram UC06 -- Tìm kiếm hàng hóa</w:t>
       </w:r>
       <w:r>
         <w:rPr>
@@ -3164,7 +3008,7 @@
           <w:color w:val="000000"/>
           <w:sz w:val="24"/>
         </w:rPr>
-        <w:t>5.2  Sequence diagram UC06 -- Tìm kiếm hàng hóa</w:t>
+        <w:t>5.3  Sequence diagram UC09 -- Lập phiếu nhập kho</w:t>
       </w:r>
       <w:r>
         <w:rPr>
@@ -3190,7 +3034,7 @@
           <w:color w:val="000000"/>
           <w:sz w:val="24"/>
         </w:rPr>
-        <w:t>5.3  Sequence diagram UC09 -- Lập phiếu nhập kho</w:t>
+        <w:t>5.4  Sequence diagram UC10 -- Lập phiếu xuất kho</w:t>
       </w:r>
       <w:r>
         <w:rPr>
@@ -3216,7 +3060,7 @@
           <w:color w:val="000000"/>
           <w:sz w:val="24"/>
         </w:rPr>
-        <w:t>5.4  Sequence diagram UC10 -- Lập phiếu xuất kho</w:t>
+        <w:t>5.5  State Machine Diagram – Trạng thái phiếu nhập kho</w:t>
       </w:r>
       <w:r>
         <w:rPr>
@@ -3242,7 +3086,7 @@
           <w:color w:val="000000"/>
           <w:sz w:val="24"/>
         </w:rPr>
-        <w:t>5.5  State Machine Diagram – Trạng thái phiếu nhập kho</w:t>
+        <w:t>5.6  State Machine Diagram – Trạng thái phiếu xuất kho</w:t>
       </w:r>
       <w:r>
         <w:rPr>
@@ -3268,7 +3112,7 @@
           <w:color w:val="000000"/>
           <w:sz w:val="24"/>
         </w:rPr>
-        <w:t>5.6  State Machine Diagram – Trạng thái phiếu xuất kho</w:t>
+        <w:t>6.1  Component Diagram – Kiến trúc thành phần hệ thống quản lý kho hàng</w:t>
       </w:r>
       <w:r>
         <w:rPr>
@@ -3294,7 +3138,7 @@
           <w:color w:val="000000"/>
           <w:sz w:val="24"/>
         </w:rPr>
-        <w:t>6.1  Component Diagram – Kiến trúc thành phần hệ thống quản lý kho hàng</w:t>
+        <w:t>7.1  Sơ đồ ERD -- Danh mục (Master Data)</w:t>
       </w:r>
       <w:r>
         <w:rPr>
@@ -3320,32 +3164,6 @@
           <w:color w:val="000000"/>
           <w:sz w:val="24"/>
         </w:rPr>
-        <w:t>7.1  Sơ đồ ERD -- Danh mục (Master Data)</w:t>
-      </w:r>
-      <w:r>
-        <w:rPr>
-          <w:rFonts w:ascii="Times New Roman" w:hAnsi="Times New Roman" w:eastAsia="Times New Roman"/>
-          <w:color w:val="000000"/>
-          <w:sz w:val="24"/>
-        </w:rPr>
-        <w:tab/>
-      </w:r>
-    </w:p>
-    <w:p>
-      <w:pPr>
-        <w:tabs>
-          <w:tab w:pos="8787" w:val="right" w:leader="dot"/>
-        </w:tabs>
-        <w:spacing w:after="40" w:before="20" w:line="276" w:lineRule="auto"/>
-        <w:ind w:firstLine="0" w:left="283"/>
-      </w:pPr>
-      <w:r>
-        <w:rPr>
-          <w:rFonts w:ascii="Times New Roman" w:hAnsi="Times New Roman" w:eastAsia="Times New Roman"/>
-          <w:b w:val="0"/>
-          <w:color w:val="000000"/>
-          <w:sz w:val="24"/>
-        </w:rPr>
         <w:t>7.2  Sơ đồ ERD -- Nghiệp vụ (Transaction)</w:t>
       </w:r>
       <w:r>
@@ -3597,7 +3415,7 @@
           <w:color w:val="000000"/>
           <w:sz w:val="24"/>
         </w:rPr>
-        <w:t>• Quản lý kho: Giám sát tồn kho, phê duyệt phiếu nhập/xuất, xem báo cáo.</w:t>
+        <w:t>• Quản lý kho: Giám sát tồn kho, phê duyệt phiếu nhập/xuất, cảnh báo tồn kho thấp.</w:t>
       </w:r>
     </w:p>
     <w:p>
@@ -4787,7 +4605,7 @@
           <w:color w:val="000000"/>
           <w:sz w:val="24"/>
         </w:rPr>
-        <w:t>: Nhân viên kho hoặc quản lý kho thêm, cập nhật và tra cứu thông tin nhà cung cấp. Thông tin nhà cung cấp được sử dụng khi lập phiếu nhập kho và báo cáo mua hàng.</w:t>
+        <w:t>: Nhân viên kho hoặc quản lý kho thêm, cập nhật và tra cứu thông tin nhà cung cấp. Thông tin nhà cung cấp được sử dụng khi lập phiếu nhập kho.</w:t>
       </w:r>
     </w:p>
     <w:p>
@@ -4857,7 +4675,7 @@
           <w:color w:val="000000"/>
           <w:sz w:val="24"/>
         </w:rPr>
-        <w:t>: Tương tự như quản lý nhà cung cấp, nghiệp vụ này lưu trữ và quản lý thông tin khách hàng để phục vụ lập phiếu xuất kho, theo dõi giao dịch và báo cáo công nợ.</w:t>
+        <w:t>: Tương tự như quản lý nhà cung cấp, nghiệp vụ này lưu trữ và quản lý thông tin khách hàng để phục vụ lập phiếu xuất kho và theo dõi giao dịch.</w:t>
       </w:r>
     </w:p>
     <w:p>
@@ -4927,7 +4745,7 @@
           <w:color w:val="000000"/>
           <w:sz w:val="24"/>
         </w:rPr>
-        <w:t>: Nhân viên kho nhập và quản lý thông tin hàng hóa bao gồm mã, tên, nhóm hàng, đơn vị tính, giá nhập, giá xuất, mô tả và trạng thái. Hàng hóa được phân loại theo nhóm để dễ tra cứu và báo cáo.</w:t>
+        <w:t>: Nhân viên kho nhập và quản lý thông tin hàng hóa bao gồm mã, tên, nhóm hàng, đơn vị tính, giá nhập, giá xuất, mô tả và trạng thái. Hàng hóa được phân loại theo nhóm để dễ tra cứu và quản lý.</w:t>
       </w:r>
     </w:p>
     <w:p>
@@ -6702,7 +6520,7 @@
       <w:r>
         <w:drawing>
           <wp:inline xmlns:a="http://schemas.openxmlformats.org/drawingml/2006/main" xmlns:pic="http://schemas.openxmlformats.org/drawingml/2006/picture">
-            <wp:extent cx="5580000" cy="7889773"/>
+            <wp:extent cx="5580000" cy="2723197"/>
             <wp:docPr id="6" name="Picture 6"/>
             <wp:cNvGraphicFramePr>
               <a:graphicFrameLocks noChangeAspect="1"/>
@@ -6723,7 +6541,7 @@
                   <pic:spPr>
                     <a:xfrm>
                       <a:off x="0" y="0"/>
-                      <a:ext cx="5580000" cy="7889773"/>
+                      <a:ext cx="5580000" cy="2723197"/>
                     </a:xfrm>
                     <a:prstGeom prst="rect"/>
                   </pic:spPr>
@@ -8800,7 +8618,7 @@
           <w:color w:val="000000"/>
           <w:sz w:val="24"/>
         </w:rPr>
-        <w:t>• KhachHang: Lưu thông tin khách hàng: mã, tên, địa chỉ, liên hệ, email, mã số thuế. Liên kết với phiếu xuất kho và đơn hàng.</w:t>
+        <w:t>• KhachHang: Lưu thông tin khách hàng: mã, tên, địa chỉ, liên hệ, email, mã số thuế. Liên kết với phiếu xuất kho.</w:t>
       </w:r>
     </w:p>
     <w:p>
@@ -8926,7 +8744,21 @@
           <w:color w:val="000000"/>
           <w:sz w:val="24"/>
         </w:rPr>
-        <w:t>• DonDatHang: Lưu thông tin đơn đặt hàng: mã, khách hàng, ngày đặt, ngày giao, trạng thái.</w:t>
+        <w:t>• LichSuThaoTac: Lưu log thao tác: mã, người dùng, hành động, thời gian, đối tượng.</w:t>
+      </w:r>
+    </w:p>
+    <w:p>
+      <w:pPr>
+        <w:spacing w:line="276" w:lineRule="auto" w:after="120"/>
+        <w:ind w:firstLine="567"/>
+      </w:pPr>
+      <w:r>
+        <w:rPr>
+          <w:rFonts w:ascii="Times New Roman" w:hAnsi="Times New Roman" w:eastAsia="Times New Roman"/>
+          <w:color w:val="000000"/>
+          <w:sz w:val="24"/>
+        </w:rPr>
+        <w:t>Sơ đồ lớp tổng thể được trình bày thành ba sơ đồ con để dễ quan sát, tránh chồng chéo và đảm bảo chữ hiển thị rõ ràng:</w:t>
       </w:r>
     </w:p>
     <w:p>
@@ -8940,7 +8772,7 @@
           <w:color w:val="000000"/>
           <w:sz w:val="24"/>
         </w:rPr>
-        <w:t>• ChiTietDonHang: Lưu chi tiết đơn hàng: mã đơn, mã hàng, số lượng, giá, thành tiền.</w:t>
+        <w:t>• Sơ đồ lớp danh mục (Master Data): bao gồm các lớp lưu thông tin cơ bản, ít thay đổi của hệ thống: NguoiDung, HangHoa, NhomHangHoa, DonViTinh, NhaCungCap, KhachHang, Kho, TonKho.</w:t>
       </w:r>
     </w:p>
     <w:p>
@@ -8954,7 +8786,7 @@
           <w:color w:val="000000"/>
           <w:sz w:val="24"/>
         </w:rPr>
-        <w:t>• ThanhToan: Lưu thông tin thanh toán: mã, phiếu liên quan, số tiền, ngày, phương thức.</w:t>
+        <w:t>• Sơ đồ lớp nghiệp vụ nhập xuất: bao gồm các lớp liên quan đến phiếu nhập kho và phiếu xuất kho: PhieuNhapKho, ChiTietPhieuNhap, PhieuXuatKho, ChiTietPhieuXuat.</w:t>
       </w:r>
     </w:p>
     <w:p>
@@ -8968,63 +8800,7 @@
           <w:color w:val="000000"/>
           <w:sz w:val="24"/>
         </w:rPr>
-        <w:t>• LichSuThaoTac: Lưu log thao tác: mã, người dùng, hành động, thời gian, đối tượng.</w:t>
-      </w:r>
-    </w:p>
-    <w:p>
-      <w:pPr>
-        <w:spacing w:line="276" w:lineRule="auto" w:after="120"/>
-        <w:ind w:firstLine="567"/>
-      </w:pPr>
-      <w:r>
-        <w:rPr>
-          <w:rFonts w:ascii="Times New Roman" w:hAnsi="Times New Roman" w:eastAsia="Times New Roman"/>
-          <w:color w:val="000000"/>
-          <w:sz w:val="24"/>
-        </w:rPr>
-        <w:t>Sơ đồ lớp tổng thể được trình bày thành ba sơ đồ con để dễ quan sát, tránh chồng chéo và đảm bảo chữ hiển thị rõ ràng:</w:t>
-      </w:r>
-    </w:p>
-    <w:p>
-      <w:pPr>
-        <w:spacing w:line="276" w:lineRule="auto" w:after="60"/>
-        <w:ind w:firstLine="0" w:left="567"/>
-      </w:pPr>
-      <w:r>
-        <w:rPr>
-          <w:rFonts w:ascii="Times New Roman" w:hAnsi="Times New Roman" w:eastAsia="Times New Roman"/>
-          <w:color w:val="000000"/>
-          <w:sz w:val="24"/>
-        </w:rPr>
-        <w:t>• Sơ đồ lớp danh mục (Master Data): bao gồm các lớp lưu thông tin cơ bản, ít thay đổi của hệ thống: NguoiDung, HangHoa, NhomHangHoa, DonViTinh, NhaCungCap, KhachHang, Kho, TonKho.</w:t>
-      </w:r>
-    </w:p>
-    <w:p>
-      <w:pPr>
-        <w:spacing w:line="276" w:lineRule="auto" w:after="60"/>
-        <w:ind w:firstLine="0" w:left="567"/>
-      </w:pPr>
-      <w:r>
-        <w:rPr>
-          <w:rFonts w:ascii="Times New Roman" w:hAnsi="Times New Roman" w:eastAsia="Times New Roman"/>
-          <w:color w:val="000000"/>
-          <w:sz w:val="24"/>
-        </w:rPr>
-        <w:t>• Sơ đồ lớp nghiệp vụ nhập xuất: bao gồm các lớp liên quan đến phiếu nhập kho và phiếu xuất kho: PhieuNhapKho, ChiTietPhieuNhap, PhieuXuatKho, ChiTietPhieuXuat.</w:t>
-      </w:r>
-    </w:p>
-    <w:p>
-      <w:pPr>
-        <w:spacing w:line="276" w:lineRule="auto" w:after="60"/>
-        <w:ind w:firstLine="0" w:left="567"/>
-      </w:pPr>
-      <w:r>
-        <w:rPr>
-          <w:rFonts w:ascii="Times New Roman" w:hAnsi="Times New Roman" w:eastAsia="Times New Roman"/>
-          <w:color w:val="000000"/>
-          <w:sz w:val="24"/>
-        </w:rPr>
-        <w:t>• Sơ đồ lớp kiểm kê, đơn hàng và thanh toán: bao gồm các lớp liên quan đến kiểm kê, đơn đặt hàng, thanh toán và log thao tác: PhieuKiemKe, ChiTietKiemKe, DonDatHang, ChiTietDonHang, ThanhToan, LichSuThaoTac.</w:t>
+        <w:t>• Sơ đồ lớp kiểm kê và log: bao gồm các lớp liên quan đến kiểm kê và ghi nhận thao tác: PhieuKiemKe, ChiTietKiemKe, LichSuThaoTac.</w:t>
       </w:r>
     </w:p>
     <w:p>
@@ -9150,7 +8926,7 @@
       <w:r>
         <w:drawing>
           <wp:inline xmlns:a="http://schemas.openxmlformats.org/drawingml/2006/main" xmlns:pic="http://schemas.openxmlformats.org/drawingml/2006/picture">
-            <wp:extent cx="5580000" cy="7221176"/>
+            <wp:extent cx="5580000" cy="3471210"/>
             <wp:docPr id="14" name="Picture 14"/>
             <wp:cNvGraphicFramePr>
               <a:graphicFrameLocks noChangeAspect="1"/>
@@ -9171,7 +8947,7 @@
                   <pic:spPr>
                     <a:xfrm>
                       <a:off x="0" y="0"/>
-                      <a:ext cx="5580000" cy="7221176"/>
+                      <a:ext cx="5580000" cy="3471210"/>
                     </a:xfrm>
                     <a:prstGeom prst="rect"/>
                   </pic:spPr>
@@ -9195,7 +8971,7 @@
           <w:color w:val="000000"/>
           <w:sz w:val="22"/>
         </w:rPr>
-        <w:t>Hình 4.3: Sơ đồ lớp kiểm kê, đơn hàng và thanh toán</w:t>
+        <w:t>Hình 4.3: Sơ đồ lớp kiểm kê và lịch sử thao tác</w:t>
       </w:r>
     </w:p>
     <w:p>
@@ -10122,7 +9898,7 @@
           <w:color w:val="000000"/>
           <w:sz w:val="24"/>
         </w:rPr>
-        <w:t>Chương 4 đã trình bày sơ đồ lớp tổng thể với 18 lớp chính của hệ thống, mô tả chi tiết thuộc tính và quan hệ giữa các lớp. Đồng thời phân tích sâu ba biểu đồ lớp trong ca sử dụng quan trọng: UC05 (quản lý hàng hóa), UC09 (lập phiếu nhập kho) và UC10 (lập phiếu xuất kho). Các lớp và quan hệ được xác định là cơ sở để thiết kế tương tác (Sequence Diagram) trong Chương 5 và thiết kế chi tiết trong Chương 6, 7.</w:t>
+        <w:t>Chương 4 đã trình bày sơ đồ lớp tổng thể với 15 lớp chính của hệ thống, mô tả chi tiết thuộc tính và quan hệ giữa các lớp. Đồng thời phân tích sâu ba biểu đồ lớp trong ca sử dụng quan trọng: UC05 (quản lý hàng hóa), UC09 (lập phiếu nhập kho) và UC10 (lập phiếu xuất kho). Các lớp và quan hệ được xác định là cơ sở để thiết kế tương tác (Sequence Diagram) trong Chương 5 và thiết kế chi tiết trong Chương 6, 7.</w:t>
       </w:r>
     </w:p>
     <w:p>
@@ -12495,165 +12271,6 @@
                 <w:color w:val="000000"/>
                 <w:sz w:val="22"/>
               </w:rPr>
-              <w:t>DonDatHang</w:t>
-            </w:r>
-          </w:p>
-        </w:tc>
-        <w:tc>
-          <w:tcPr>
-            <w:tcW w:type="dxa" w:w="3024"/>
-          </w:tcPr>
-          <w:p>
-            <w:r/>
-            <w:r>
-              <w:rPr>
-                <w:rFonts w:ascii="Times New Roman" w:hAnsi="Times New Roman" w:eastAsia="Times New Roman"/>
-                <w:b w:val="0"/>
-                <w:color w:val="000000"/>
-                <w:sz w:val="22"/>
-              </w:rPr>
-              <w:t>MaDonHang, MaKhachHang, NgayDat, NgayGiao, TrangThai</w:t>
-            </w:r>
-          </w:p>
-        </w:tc>
-        <w:tc>
-          <w:tcPr>
-            <w:tcW w:type="dxa" w:w="3024"/>
-          </w:tcPr>
-          <w:p>
-            <w:r/>
-            <w:r>
-              <w:rPr>
-                <w:rFonts w:ascii="Times New Roman" w:hAnsi="Times New Roman" w:eastAsia="Times New Roman"/>
-                <w:b w:val="0"/>
-                <w:color w:val="000000"/>
-                <w:sz w:val="22"/>
-              </w:rPr>
-              <w:t>Thông tin đơn đặt hàng: khách hàng, ngày đặt, ngày giao.</w:t>
-            </w:r>
-          </w:p>
-        </w:tc>
-      </w:tr>
-      <w:tr>
-        <w:tc>
-          <w:tcPr>
-            <w:tcW w:type="dxa" w:w="3024"/>
-          </w:tcPr>
-          <w:p>
-            <w:r/>
-            <w:r>
-              <w:rPr>
-                <w:rFonts w:ascii="Times New Roman" w:hAnsi="Times New Roman" w:eastAsia="Times New Roman"/>
-                <w:b w:val="0"/>
-                <w:color w:val="000000"/>
-                <w:sz w:val="22"/>
-              </w:rPr>
-              <w:t>ChiTietDonHang</w:t>
-            </w:r>
-          </w:p>
-        </w:tc>
-        <w:tc>
-          <w:tcPr>
-            <w:tcW w:type="dxa" w:w="3024"/>
-          </w:tcPr>
-          <w:p>
-            <w:r/>
-            <w:r>
-              <w:rPr>
-                <w:rFonts w:ascii="Times New Roman" w:hAnsi="Times New Roman" w:eastAsia="Times New Roman"/>
-                <w:b w:val="0"/>
-                <w:color w:val="000000"/>
-                <w:sz w:val="22"/>
-              </w:rPr>
-              <w:t>MaChiTiet, MaDonHang, MaHangHoa, SoLuong, DonGia, ThanhTien</w:t>
-            </w:r>
-          </w:p>
-        </w:tc>
-        <w:tc>
-          <w:tcPr>
-            <w:tcW w:type="dxa" w:w="3024"/>
-          </w:tcPr>
-          <w:p>
-            <w:r/>
-            <w:r>
-              <w:rPr>
-                <w:rFonts w:ascii="Times New Roman" w:hAnsi="Times New Roman" w:eastAsia="Times New Roman"/>
-                <w:b w:val="0"/>
-                <w:color w:val="000000"/>
-                <w:sz w:val="22"/>
-              </w:rPr>
-              <w:t>Chi tiết đơn hàng: hàng hóa, số lượng, giá.</w:t>
-            </w:r>
-          </w:p>
-        </w:tc>
-      </w:tr>
-      <w:tr>
-        <w:tc>
-          <w:tcPr>
-            <w:tcW w:type="dxa" w:w="3024"/>
-          </w:tcPr>
-          <w:p>
-            <w:r/>
-            <w:r>
-              <w:rPr>
-                <w:rFonts w:ascii="Times New Roman" w:hAnsi="Times New Roman" w:eastAsia="Times New Roman"/>
-                <w:b w:val="0"/>
-                <w:color w:val="000000"/>
-                <w:sz w:val="22"/>
-              </w:rPr>
-              <w:t>ThanhToan</w:t>
-            </w:r>
-          </w:p>
-        </w:tc>
-        <w:tc>
-          <w:tcPr>
-            <w:tcW w:type="dxa" w:w="3024"/>
-          </w:tcPr>
-          <w:p>
-            <w:r/>
-            <w:r>
-              <w:rPr>
-                <w:rFonts w:ascii="Times New Roman" w:hAnsi="Times New Roman" w:eastAsia="Times New Roman"/>
-                <w:b w:val="0"/>
-                <w:color w:val="000000"/>
-                <w:sz w:val="22"/>
-              </w:rPr>
-              <w:t>MaThanhToan, MaPhieu, LoaiPhieu, SoTien, NgayThanhToan, PhuongThuc</w:t>
-            </w:r>
-          </w:p>
-        </w:tc>
-        <w:tc>
-          <w:tcPr>
-            <w:tcW w:type="dxa" w:w="3024"/>
-          </w:tcPr>
-          <w:p>
-            <w:r/>
-            <w:r>
-              <w:rPr>
-                <w:rFonts w:ascii="Times New Roman" w:hAnsi="Times New Roman" w:eastAsia="Times New Roman"/>
-                <w:b w:val="0"/>
-                <w:color w:val="000000"/>
-                <w:sz w:val="22"/>
-              </w:rPr>
-              <w:t>Thông tin thanh toán: phiếu liên quan, số tiền, phương thức.</w:t>
-            </w:r>
-          </w:p>
-        </w:tc>
-      </w:tr>
-      <w:tr>
-        <w:tc>
-          <w:tcPr>
-            <w:tcW w:type="dxa" w:w="3024"/>
-          </w:tcPr>
-          <w:p>
-            <w:r/>
-            <w:r>
-              <w:rPr>
-                <w:rFonts w:ascii="Times New Roman" w:hAnsi="Times New Roman" w:eastAsia="Times New Roman"/>
-                <w:b w:val="0"/>
-                <w:color w:val="000000"/>
-                <w:sz w:val="22"/>
-              </w:rPr>
               <w:t>LichSuThaoTac</w:t>
             </w:r>
           </w:p>
@@ -13052,59 +12669,6 @@
                 <w:sz w:val="22"/>
               </w:rPr>
               <w:t>Một khách hàng có nhiều phiếu xuất.</w:t>
-            </w:r>
-          </w:p>
-        </w:tc>
-      </w:tr>
-      <w:tr>
-        <w:tc>
-          <w:tcPr>
-            <w:tcW w:type="dxa" w:w="3024"/>
-          </w:tcPr>
-          <w:p>
-            <w:r/>
-            <w:r>
-              <w:rPr>
-                <w:rFonts w:ascii="Times New Roman" w:hAnsi="Times New Roman" w:eastAsia="Times New Roman"/>
-                <w:b w:val="0"/>
-                <w:color w:val="000000"/>
-                <w:sz w:val="22"/>
-              </w:rPr>
-              <w:t>KhachHang -- DonDatHang</w:t>
-            </w:r>
-          </w:p>
-        </w:tc>
-        <w:tc>
-          <w:tcPr>
-            <w:tcW w:type="dxa" w:w="3024"/>
-          </w:tcPr>
-          <w:p>
-            <w:r/>
-            <w:r>
-              <w:rPr>
-                <w:rFonts w:ascii="Times New Roman" w:hAnsi="Times New Roman" w:eastAsia="Times New Roman"/>
-                <w:b w:val="0"/>
-                <w:color w:val="000000"/>
-                <w:sz w:val="22"/>
-              </w:rPr>
-              <w:t>1..n</w:t>
-            </w:r>
-          </w:p>
-        </w:tc>
-        <w:tc>
-          <w:tcPr>
-            <w:tcW w:type="dxa" w:w="3024"/>
-          </w:tcPr>
-          <w:p>
-            <w:r/>
-            <w:r>
-              <w:rPr>
-                <w:rFonts w:ascii="Times New Roman" w:hAnsi="Times New Roman" w:eastAsia="Times New Roman"/>
-                <w:b w:val="0"/>
-                <w:color w:val="000000"/>
-                <w:sz w:val="22"/>
-              </w:rPr>
-              <w:t>Một khách hàng đặt nhiều đơn hàng.</w:t>
             </w:r>
           </w:p>
         </w:tc>
@@ -13547,59 +13111,6 @@
                 <w:color w:val="000000"/>
                 <w:sz w:val="22"/>
               </w:rPr>
-              <w:t>DonDatHang -- ChiTietDonHang</w:t>
-            </w:r>
-          </w:p>
-        </w:tc>
-        <w:tc>
-          <w:tcPr>
-            <w:tcW w:type="dxa" w:w="3024"/>
-          </w:tcPr>
-          <w:p>
-            <w:r/>
-            <w:r>
-              <w:rPr>
-                <w:rFonts w:ascii="Times New Roman" w:hAnsi="Times New Roman" w:eastAsia="Times New Roman"/>
-                <w:b w:val="0"/>
-                <w:color w:val="000000"/>
-                <w:sz w:val="22"/>
-              </w:rPr>
-              <w:t>1..n</w:t>
-            </w:r>
-          </w:p>
-        </w:tc>
-        <w:tc>
-          <w:tcPr>
-            <w:tcW w:type="dxa" w:w="3024"/>
-          </w:tcPr>
-          <w:p>
-            <w:r/>
-            <w:r>
-              <w:rPr>
-                <w:rFonts w:ascii="Times New Roman" w:hAnsi="Times New Roman" w:eastAsia="Times New Roman"/>
-                <w:b w:val="0"/>
-                <w:color w:val="000000"/>
-                <w:sz w:val="22"/>
-              </w:rPr>
-              <w:t>Một đơn hàng có nhiều dòng chi tiết.</w:t>
-            </w:r>
-          </w:p>
-        </w:tc>
-      </w:tr>
-      <w:tr>
-        <w:tc>
-          <w:tcPr>
-            <w:tcW w:type="dxa" w:w="3024"/>
-          </w:tcPr>
-          <w:p>
-            <w:r/>
-            <w:r>
-              <w:rPr>
-                <w:rFonts w:ascii="Times New Roman" w:hAnsi="Times New Roman" w:eastAsia="Times New Roman"/>
-                <w:b w:val="0"/>
-                <w:color w:val="000000"/>
-                <w:sz w:val="22"/>
-              </w:rPr>
               <w:t>NhomHangHoa -- HangHoa</w:t>
             </w:r>
           </w:p>
@@ -13692,112 +13203,6 @@
           </w:p>
         </w:tc>
       </w:tr>
-      <w:tr>
-        <w:tc>
-          <w:tcPr>
-            <w:tcW w:type="dxa" w:w="3024"/>
-          </w:tcPr>
-          <w:p>
-            <w:r/>
-            <w:r>
-              <w:rPr>
-                <w:rFonts w:ascii="Times New Roman" w:hAnsi="Times New Roman" w:eastAsia="Times New Roman"/>
-                <w:b w:val="0"/>
-                <w:color w:val="000000"/>
-                <w:sz w:val="22"/>
-              </w:rPr>
-              <w:t>PhieuNhapKho -- ThanhToan</w:t>
-            </w:r>
-          </w:p>
-        </w:tc>
-        <w:tc>
-          <w:tcPr>
-            <w:tcW w:type="dxa" w:w="3024"/>
-          </w:tcPr>
-          <w:p>
-            <w:r/>
-            <w:r>
-              <w:rPr>
-                <w:rFonts w:ascii="Times New Roman" w:hAnsi="Times New Roman" w:eastAsia="Times New Roman"/>
-                <w:b w:val="0"/>
-                <w:color w:val="000000"/>
-                <w:sz w:val="22"/>
-              </w:rPr>
-              <w:t>1..n</w:t>
-            </w:r>
-          </w:p>
-        </w:tc>
-        <w:tc>
-          <w:tcPr>
-            <w:tcW w:type="dxa" w:w="3024"/>
-          </w:tcPr>
-          <w:p>
-            <w:r/>
-            <w:r>
-              <w:rPr>
-                <w:rFonts w:ascii="Times New Roman" w:hAnsi="Times New Roman" w:eastAsia="Times New Roman"/>
-                <w:b w:val="0"/>
-                <w:color w:val="000000"/>
-                <w:sz w:val="22"/>
-              </w:rPr>
-              <w:t>Một phiếu nhập có nhiều lần thanh toán.</w:t>
-            </w:r>
-          </w:p>
-        </w:tc>
-      </w:tr>
-      <w:tr>
-        <w:tc>
-          <w:tcPr>
-            <w:tcW w:type="dxa" w:w="3024"/>
-          </w:tcPr>
-          <w:p>
-            <w:r/>
-            <w:r>
-              <w:rPr>
-                <w:rFonts w:ascii="Times New Roman" w:hAnsi="Times New Roman" w:eastAsia="Times New Roman"/>
-                <w:b w:val="0"/>
-                <w:color w:val="000000"/>
-                <w:sz w:val="22"/>
-              </w:rPr>
-              <w:t>PhieuXuatKho -- ThanhToan</w:t>
-            </w:r>
-          </w:p>
-        </w:tc>
-        <w:tc>
-          <w:tcPr>
-            <w:tcW w:type="dxa" w:w="3024"/>
-          </w:tcPr>
-          <w:p>
-            <w:r/>
-            <w:r>
-              <w:rPr>
-                <w:rFonts w:ascii="Times New Roman" w:hAnsi="Times New Roman" w:eastAsia="Times New Roman"/>
-                <w:b w:val="0"/>
-                <w:color w:val="000000"/>
-                <w:sz w:val="22"/>
-              </w:rPr>
-              <w:t>1..n</w:t>
-            </w:r>
-          </w:p>
-        </w:tc>
-        <w:tc>
-          <w:tcPr>
-            <w:tcW w:type="dxa" w:w="3024"/>
-          </w:tcPr>
-          <w:p>
-            <w:r/>
-            <w:r>
-              <w:rPr>
-                <w:rFonts w:ascii="Times New Roman" w:hAnsi="Times New Roman" w:eastAsia="Times New Roman"/>
-                <w:b w:val="0"/>
-                <w:color w:val="000000"/>
-                <w:sz w:val="22"/>
-              </w:rPr>
-              <w:t>Một phiếu xuất có nhiều lần thanh toán.</w:t>
-            </w:r>
-          </w:p>
-        </w:tc>
-      </w:tr>
     </w:tbl>
     <w:p/>
     <w:p>
@@ -14329,7 +13734,7 @@
           <w:color w:val="000000"/>
           <w:sz w:val="24"/>
         </w:rPr>
-        <w:t>• UI Layer: Trang đăng nhập, Dashboard, Quản lý hàng hóa, Quản lý phiếu nhập/xuất, Báo cáo.</w:t>
+        <w:t>• UI Layer: Trang đăng nhập, Dashboard, Quản lý hàng hóa, Quản lý phiếu nhập/xuất, Quản lý kiểm kê.</w:t>
       </w:r>
     </w:p>
     <w:p>
@@ -14343,7 +13748,7 @@
           <w:color w:val="000000"/>
           <w:sz w:val="24"/>
         </w:rPr>
-        <w:t>• Controller Layer: NguoiDungController, HangHoaController, PhieuNhapController, PhieuXuatController, BaoCaoController.</w:t>
+        <w:t>• Controller Layer: NguoiDungController, HangHoaController, PhieuNhapController, PhieuXuatController, KhoController.</w:t>
       </w:r>
     </w:p>
     <w:p>
@@ -14357,7 +13762,7 @@
           <w:color w:val="000000"/>
           <w:sz w:val="24"/>
         </w:rPr>
-        <w:t>• Service Layer: AuthService (xác thực), TonKhoService (quản lý tồn kho), BaoCaoService (báo cáo), ThongBaoService (thông báo).</w:t>
+        <w:t>• Service Layer: AuthService (xác thực), TonKhoService (quản lý tồn kho), ThongBaoService (thông báo cảnh báo tồn kho).</w:t>
       </w:r>
     </w:p>
     <w:p>
@@ -14371,7 +13776,7 @@
           <w:color w:val="000000"/>
           <w:sz w:val="24"/>
         </w:rPr>
-        <w:t>• DAO Layer: NguoiDungDAO, HangHoaDAO, PhieuNhapDAO, PhieuXuatDAO, TonKhoDAO, BaoCaoDAO.</w:t>
+        <w:t>• DAO Layer: NguoiDungDAO, HangHoaDAO, PhieuNhapDAO, PhieuXuatDAO, TonKhoDAO, KhoDAO.</w:t>
       </w:r>
     </w:p>
     <w:p>
@@ -14399,7 +13804,7 @@
           <w:color w:val="000000"/>
           <w:sz w:val="24"/>
         </w:rPr>
-        <w:t>Các dịch vụ chuyên biệt như xác thực, báo cáo và quản lý tồn kho được tách riêng để dễ bảo trì và mở rộng. Kiến trúc này cho phép thay đổi tầng giao diện hoặc cơ sở dữ liệu mà không ảnh hưởng đến logic nghiệp vụ.</w:t>
+        <w:t>Các dịch vụ chuyên biệt như xác thực và quản lý tồn kho được tách riêng để dễ bảo trì và mở rộng. Kiến trúc này cho phép thay đổi tầng giao diện hoặc cơ sở dữ liệu mà không ảnh hưởng đến logic nghiệp vụ.</w:t>
       </w:r>
     </w:p>
     <w:p>
@@ -14411,7 +13816,7 @@
       <w:r>
         <w:drawing>
           <wp:inline xmlns:a="http://schemas.openxmlformats.org/drawingml/2006/main" xmlns:pic="http://schemas.openxmlformats.org/drawingml/2006/picture">
-            <wp:extent cx="5580000" cy="7221176"/>
+            <wp:extent cx="5580000" cy="3657229"/>
             <wp:docPr id="24" name="Picture 24"/>
             <wp:cNvGraphicFramePr>
               <a:graphicFrameLocks noChangeAspect="1"/>
@@ -14432,7 +13837,7 @@
                   <pic:spPr>
                     <a:xfrm>
                       <a:off x="0" y="0"/>
-                      <a:ext cx="5580000" cy="7221176"/>
+                      <a:ext cx="5580000" cy="3657229"/>
                     </a:xfrm>
                     <a:prstGeom prst="rect"/>
                   </pic:spPr>
@@ -14484,7 +13889,7 @@
           <w:color w:val="000000"/>
           <w:sz w:val="24"/>
         </w:rPr>
-        <w:t>Chương 6 đã mô tả chi tiết 18 lớp trong hệ thống với đầy đủ thuộc tính, liệt kê 19 quan hệ giữa các lớp và đặc tả các phương thức chính của 5 lớp quan trọng (NguoiDung, HangHoa, PhieuNhapKho, PhieuXuatKho, TonKho). Đồng thời trình bày thiết kế thành phần phần mềm theo kiến trúc phân lớp với 5 tầng. Các thiết kế này là nền tảng để xây dựng mô hình cơ sở dữ liệu và triển khai giao diện trong Chương 7.</w:t>
+        <w:t>Chương 6 đã mô tả chi tiết 15 lớp trong hệ thống với đầy đủ thuộc tính, liệt kê 15 quan hệ giữa các lớp và đặc tả các phương thức chính của 5 lớp quan trọng (NguoiDung, HangHoa, PhieuNhapKho, PhieuXuatKho, TonKho). Đồng thời trình bày thiết kế thành phần phần mềm theo kiến trúc phân lớp với 5 tầng. Các thiết kế này là nền tảng để xây dựng mô hình cơ sở dữ liệu và triển khai giao diện trong Chương 7.</w:t>
       </w:r>
     </w:p>
     <w:p>
@@ -14526,7 +13931,7 @@
           <w:color w:val="000000"/>
           <w:sz w:val="24"/>
         </w:rPr>
-        <w:t>Cơ sở dữ liệu của hệ thống quản lý kho hàng được thiết kế theo mô hình quan hệ, bao gồm 16 bảng chính. Các bảng được liên kết với nhau thông qua khóa chính và khóa ngoại, đảm bảo tính toàn vẹn dữ liệu và hỗ trợ truy vấn hiệu quả.</w:t>
+        <w:t>Cơ sở dữ liệu của hệ thống quản lý kho hàng được thiết kế theo mô hình quan hệ, bao gồm 15 bảng chính. Các bảng được liên kết với nhau thông qua khóa chính và khóa ngoại, đảm bảo tính toàn vẹn dữ liệu và hỗ trợ truy vấn hiệu quả.</w:t>
       </w:r>
     </w:p>
     <w:p>
@@ -15111,42 +14516,6 @@
                 <w:color w:val="000000"/>
                 <w:sz w:val="22"/>
               </w:rPr>
-              <w:t>DonDatHang</w:t>
-            </w:r>
-          </w:p>
-        </w:tc>
-        <w:tc>
-          <w:tcPr>
-            <w:tcW w:type="dxa" w:w="4535"/>
-          </w:tcPr>
-          <w:p>
-            <w:r/>
-            <w:r>
-              <w:rPr>
-                <w:rFonts w:ascii="Times New Roman" w:hAnsi="Times New Roman" w:eastAsia="Times New Roman"/>
-                <w:b w:val="0"/>
-                <w:color w:val="000000"/>
-                <w:sz w:val="22"/>
-              </w:rPr>
-              <w:t>Lưu đơn đặt hàng: mã, mã khách, ngày đặt, ngày giao, trạng thái.</w:t>
-            </w:r>
-          </w:p>
-        </w:tc>
-      </w:tr>
-      <w:tr>
-        <w:tc>
-          <w:tcPr>
-            <w:tcW w:type="dxa" w:w="4535"/>
-          </w:tcPr>
-          <w:p>
-            <w:r/>
-            <w:r>
-              <w:rPr>
-                <w:rFonts w:ascii="Times New Roman" w:hAnsi="Times New Roman" w:eastAsia="Times New Roman"/>
-                <w:b w:val="0"/>
-                <w:color w:val="000000"/>
-                <w:sz w:val="22"/>
-              </w:rPr>
               <w:t>LichSuThaoTac</w:t>
             </w:r>
           </w:p>
@@ -15210,7 +14579,7 @@
           <w:color w:val="000000"/>
           <w:sz w:val="24"/>
         </w:rPr>
-        <w:t>• ERD nghiệp vụ (Transaction): mô tả các bảng giao dịch bao gồm PhieuNhapKho, ChiTietPhieuNhap, PhieuXuatKho, ChiTietPhieuXuat, PhieuKiemKe, ChiTietKiemKe, DonDatHang, ChiTietDonHang, ThanhToan, LichSuThaoTac.</w:t>
+        <w:t>• ERD nghiệp vụ (Transaction): mô tả các bảng giao dịch bao gồm PhieuNhapKho, ChiTietPhieuNhap, PhieuXuatKho, ChiTietPhieuXuat, PhieuKiemKe, ChiTietKiemKe, LichSuThaoTac.</w:t>
       </w:r>
     </w:p>
     <w:p>
@@ -15279,7 +14648,7 @@
       <w:r>
         <w:drawing>
           <wp:inline xmlns:a="http://schemas.openxmlformats.org/drawingml/2006/main" xmlns:pic="http://schemas.openxmlformats.org/drawingml/2006/picture">
-            <wp:extent cx="5580000" cy="7221176"/>
+            <wp:extent cx="5580000" cy="3213542"/>
             <wp:docPr id="26" name="Picture 26"/>
             <wp:cNvGraphicFramePr>
               <a:graphicFrameLocks noChangeAspect="1"/>
@@ -15300,7 +14669,7 @@
                   <pic:spPr>
                     <a:xfrm>
                       <a:off x="0" y="0"/>
-                      <a:ext cx="5580000" cy="7221176"/>
+                      <a:ext cx="5580000" cy="3213542"/>
                     </a:xfrm>
                     <a:prstGeom prst="rect"/>
                   </pic:spPr>
@@ -17192,7 +16561,7 @@
           <w:color w:val="000000"/>
           <w:sz w:val="26"/>
         </w:rPr>
-        <w:t>7.3 Thiết kế báo cáo thống kê chi tiết</w:t>
+        <w:t>7.3 Thiết kế giao diện</w:t>
       </w:r>
     </w:p>
     <w:p>
@@ -17206,7 +16575,147 @@
           <w:color w:val="000000"/>
           <w:sz w:val="24"/>
         </w:rPr>
-        <w:t>Hệ thống cung cấp các báo cáo thống kê đa dạng phục vụ công tác quản trị kho, điều phối nhập xuất và ra quyết định kinh doanh. Các báo cáo được xây dựng dựa trên dữ liệu từ các bảng</w:t>
+        <w:t>Hệ thống được thiết kế theo mô hình ứng dụng web với giao diện thân thiện, hỗ trợ tiếng Việt đầy đủ, responsive trên cả máy tính và máy tính bảng. Các màn hình chính bao gồm:</w:t>
+      </w:r>
+    </w:p>
+    <w:p>
+      <w:pPr>
+        <w:spacing w:line="276" w:lineRule="auto" w:after="60"/>
+        <w:ind w:firstLine="0" w:left="567"/>
+      </w:pPr>
+      <w:r>
+        <w:rPr>
+          <w:rFonts w:ascii="Times New Roman" w:hAnsi="Times New Roman" w:eastAsia="Times New Roman"/>
+          <w:color w:val="000000"/>
+          <w:sz w:val="24"/>
+        </w:rPr>
+        <w:t>• Màn hình đăng nhập: Form nhập tên đăng nhập, mật khẩu, nút “Đăng nhập”. Sau khi đăng nhập, hệ thống chuyển hướng đến giao diện phù hợp với vai trò.</w:t>
+      </w:r>
+    </w:p>
+    <w:p>
+      <w:pPr>
+        <w:spacing w:line="276" w:lineRule="auto" w:after="60"/>
+        <w:ind w:firstLine="0" w:left="567"/>
+      </w:pPr>
+      <w:r>
+        <w:rPr>
+          <w:rFonts w:ascii="Times New Roman" w:hAnsi="Times New Roman" w:eastAsia="Times New Roman"/>
+          <w:color w:val="000000"/>
+          <w:sz w:val="24"/>
+        </w:rPr>
+        <w:t>• Trang chủ / Dashboard: Hiển thị tổng quan: số lượng hàng hóa, tổng giá trị tồn kho, phiếu nhập/xuất chờ duyệt, cảnh báo tồn kho thấp.</w:t>
+      </w:r>
+    </w:p>
+    <w:p>
+      <w:pPr>
+        <w:spacing w:line="276" w:lineRule="auto" w:after="60"/>
+        <w:ind w:firstLine="0" w:left="567"/>
+      </w:pPr>
+      <w:r>
+        <w:rPr>
+          <w:rFonts w:ascii="Times New Roman" w:hAnsi="Times New Roman" w:eastAsia="Times New Roman"/>
+          <w:color w:val="000000"/>
+          <w:sz w:val="24"/>
+        </w:rPr>
+        <w:t>• Quản lý hàng hóa: Danh sách hàng hóa dạng bảng với phân trang, form thêm/sửa hàng hóa, bộ lọc theo nhóm hàng và trạng thái, nút tìm kiếm và xuất Excel.</w:t>
+      </w:r>
+    </w:p>
+    <w:p>
+      <w:pPr>
+        <w:spacing w:line="276" w:lineRule="auto" w:after="60"/>
+        <w:ind w:firstLine="0" w:left="567"/>
+      </w:pPr>
+      <w:r>
+        <w:rPr>
+          <w:rFonts w:ascii="Times New Roman" w:hAnsi="Times New Roman" w:eastAsia="Times New Roman"/>
+          <w:color w:val="000000"/>
+          <w:sz w:val="24"/>
+        </w:rPr>
+        <w:t>• Quản lý nhà cung cấp / khách hàng: Danh sách đối tác, form thêm/sửa, tìm kiếm theo tên hoặc mã.</w:t>
+      </w:r>
+    </w:p>
+    <w:p>
+      <w:pPr>
+        <w:spacing w:line="276" w:lineRule="auto" w:after="60"/>
+        <w:ind w:firstLine="0" w:left="567"/>
+      </w:pPr>
+      <w:r>
+        <w:rPr>
+          <w:rFonts w:ascii="Times New Roman" w:hAnsi="Times New Roman" w:eastAsia="Times New Roman"/>
+          <w:color w:val="000000"/>
+          <w:sz w:val="24"/>
+        </w:rPr>
+        <w:t>• Quản lý kho: Danh sách kho, form thêm/sửa kho, xem chi tiết tồn kho tại từng kho.</w:t>
+      </w:r>
+    </w:p>
+    <w:p>
+      <w:pPr>
+        <w:spacing w:line="276" w:lineRule="auto" w:after="60"/>
+        <w:ind w:firstLine="0" w:left="567"/>
+      </w:pPr>
+      <w:r>
+        <w:rPr>
+          <w:rFonts w:ascii="Times New Roman" w:hAnsi="Times New Roman" w:eastAsia="Times New Roman"/>
+          <w:color w:val="000000"/>
+          <w:sz w:val="24"/>
+        </w:rPr>
+        <w:t>• Quản lý nhập kho: Danh sách phiếu nhập với bộ lọc theo trạng thái và ngày, form lập phiếu nhập (chọn NCC, kho, thêm dòng hàng), form chi tiết phiếu và nút duyệt/từ chối.</w:t>
+      </w:r>
+    </w:p>
+    <w:p>
+      <w:pPr>
+        <w:spacing w:line="276" w:lineRule="auto" w:after="60"/>
+        <w:ind w:firstLine="0" w:left="567"/>
+      </w:pPr>
+      <w:r>
+        <w:rPr>
+          <w:rFonts w:ascii="Times New Roman" w:hAnsi="Times New Roman" w:eastAsia="Times New Roman"/>
+          <w:color w:val="000000"/>
+          <w:sz w:val="24"/>
+        </w:rPr>
+        <w:t>• Quản lý xuất kho: Danh sách phiếu xuất, form lập phiếu xuất (chọn khách hàng, kho, thêm dòng hàng với kiểm tra tồn kho), form chi tiết và nút duyệt/từ chối.</w:t>
+      </w:r>
+    </w:p>
+    <w:p>
+      <w:pPr>
+        <w:spacing w:line="276" w:lineRule="auto" w:after="60"/>
+        <w:ind w:firstLine="0" w:left="567"/>
+      </w:pPr>
+      <w:r>
+        <w:rPr>
+          <w:rFonts w:ascii="Times New Roman" w:hAnsi="Times New Roman" w:eastAsia="Times New Roman"/>
+          <w:color w:val="000000"/>
+          <w:sz w:val="24"/>
+        </w:rPr>
+        <w:t>• Quản lý kiểm kê: Danh sách phiếu kiểm kê, form lập phiếu kiểm kê (chọn kho, nhập số lượng thực tế), hiển thị chênh lệch tự động.</w:t>
+      </w:r>
+    </w:p>
+    <w:p>
+      <w:pPr>
+        <w:spacing w:line="276" w:lineRule="auto" w:after="60"/>
+        <w:ind w:firstLine="0" w:left="567"/>
+      </w:pPr>
+      <w:r>
+        <w:rPr>
+          <w:rFonts w:ascii="Times New Roman" w:hAnsi="Times New Roman" w:eastAsia="Times New Roman"/>
+          <w:color w:val="000000"/>
+          <w:sz w:val="24"/>
+        </w:rPr>
+        <w:t>• Quản lý tài khoản: Danh sách tài khoản, form thêm/sửa, phân quyền (chỉ quản trị viên).</w:t>
+      </w:r>
+    </w:p>
+    <w:p>
+      <w:pPr>
+        <w:pStyle w:val="Heading2"/>
+      </w:pPr>
+      <w:r>
+        <w:rPr>
+          <w:rFonts w:ascii="Times New Roman" w:hAnsi="Times New Roman" w:eastAsia="Times New Roman"/>
+          <w:b/>
+          <w:color w:val="000000"/>
+          <w:sz w:val="26"/>
+        </w:rPr>
+        <w:t>7.4 Kết luận chương</w:t>
       </w:r>
     </w:p>
     <w:p>
@@ -17220,763 +16729,7 @@
           <w:color w:val="000000"/>
           <w:sz w:val="24"/>
         </w:rPr>
-        <w:t>,</w:t>
-      </w:r>
-    </w:p>
-    <w:p>
-      <w:pPr>
-        <w:spacing w:line="276" w:lineRule="auto" w:after="120"/>
-        <w:ind w:firstLine="567"/>
-      </w:pPr>
-      <w:r>
-        <w:rPr>
-          <w:rFonts w:ascii="Times New Roman" w:hAnsi="Times New Roman" w:eastAsia="Times New Roman"/>
-          <w:color w:val="000000"/>
-          <w:sz w:val="24"/>
-        </w:rPr>
-        <w:t>,</w:t>
-      </w:r>
-    </w:p>
-    <w:p>
-      <w:pPr>
-        <w:spacing w:line="276" w:lineRule="auto" w:after="120"/>
-        <w:ind w:firstLine="567"/>
-      </w:pPr>
-      <w:r>
-        <w:rPr>
-          <w:rFonts w:ascii="Times New Roman" w:hAnsi="Times New Roman" w:eastAsia="Times New Roman"/>
-          <w:color w:val="000000"/>
-          <w:sz w:val="24"/>
-        </w:rPr>
-        <w:t>,</w:t>
-      </w:r>
-    </w:p>
-    <w:p>
-      <w:pPr>
-        <w:spacing w:line="276" w:lineRule="auto" w:after="120"/>
-        <w:ind w:firstLine="567"/>
-      </w:pPr>
-      <w:r>
-        <w:rPr>
-          <w:rFonts w:ascii="Times New Roman" w:hAnsi="Times New Roman" w:eastAsia="Times New Roman"/>
-          <w:color w:val="000000"/>
-          <w:sz w:val="24"/>
-        </w:rPr>
-        <w:t>,</w:t>
-      </w:r>
-    </w:p>
-    <w:p>
-      <w:pPr>
-        <w:spacing w:line="276" w:lineRule="auto" w:after="120"/>
-        <w:ind w:firstLine="567"/>
-      </w:pPr>
-      <w:r>
-        <w:rPr>
-          <w:rFonts w:ascii="Times New Roman" w:hAnsi="Times New Roman" w:eastAsia="Times New Roman"/>
-          <w:color w:val="000000"/>
-          <w:sz w:val="24"/>
-        </w:rPr>
-        <w:t>và</w:t>
-      </w:r>
-    </w:p>
-    <w:p>
-      <w:pPr>
-        <w:spacing w:line="276" w:lineRule="auto" w:after="120"/>
-        <w:ind w:firstLine="567"/>
-      </w:pPr>
-      <w:r>
-        <w:rPr>
-          <w:rFonts w:ascii="Times New Roman" w:hAnsi="Times New Roman" w:eastAsia="Times New Roman"/>
-          <w:color w:val="000000"/>
-          <w:sz w:val="24"/>
-        </w:rPr>
-        <w:t>.</w:t>
-      </w:r>
-    </w:p>
-    <w:p>
-      <w:pPr>
-        <w:pStyle w:val="Heading3"/>
-      </w:pPr>
-      <w:r>
-        <w:rPr>
-          <w:rFonts w:ascii="Times New Roman" w:hAnsi="Times New Roman" w:eastAsia="Times New Roman"/>
-          <w:b/>
-          <w:color w:val="000000"/>
-          <w:sz w:val="24"/>
-        </w:rPr>
-        <w:t>7.3.1 Báo cáo nhập -- xuất -- tồn</w:t>
-      </w:r>
-    </w:p>
-    <w:p>
-      <w:pPr>
-        <w:spacing w:line="276" w:lineRule="auto" w:after="120"/>
-        <w:ind w:firstLine="567"/>
-      </w:pPr>
-      <w:r>
-        <w:rPr>
-          <w:rFonts w:ascii="Times New Roman" w:hAnsi="Times New Roman" w:eastAsia="Times New Roman"/>
-          <w:color w:val="000000"/>
-          <w:sz w:val="24"/>
-        </w:rPr>
-        <w:t>Báo cáo tổng hợp số lượng và giá trị nhập, xuất và tồn kho của từng hàng hóa trong khoảng thời gian cho trước. Đây là báo cáo quan trọng nhất, phục vụ kế toán và quản trị.</w:t>
-      </w:r>
-    </w:p>
-    <w:p>
-      <w:pPr>
-        <w:spacing w:line="276" w:lineRule="auto" w:after="60"/>
-        <w:ind w:firstLine="0" w:left="567"/>
-      </w:pPr>
-      <w:r>
-        <w:rPr>
-          <w:rFonts w:ascii="Times New Roman" w:hAnsi="Times New Roman" w:eastAsia="Times New Roman"/>
-          <w:color w:val="000000"/>
-          <w:sz w:val="24"/>
-        </w:rPr>
-        <w:t>• Đầu vào: Mã kho (tùy chọn), mã hàng hóa (tùy chọn), ngày bắt đầu, ngày kết thúc.</w:t>
-      </w:r>
-    </w:p>
-    <w:p>
-      <w:pPr>
-        <w:spacing w:line="276" w:lineRule="auto" w:after="60"/>
-        <w:ind w:firstLine="0" w:left="567"/>
-      </w:pPr>
-      <w:r>
-        <w:rPr>
-          <w:rFonts w:ascii="Times New Roman" w:hAnsi="Times New Roman" w:eastAsia="Times New Roman"/>
-          <w:color w:val="000000"/>
-          <w:sz w:val="24"/>
-        </w:rPr>
-        <w:t>• Công thức: Tồn cuối kỳ = Tồn đầu kỳ + Nhập trong kỳ - Xuất trong kỳ.</w:t>
-      </w:r>
-    </w:p>
-    <w:p>
-      <w:pPr>
-        <w:spacing w:line="276" w:lineRule="auto" w:after="60"/>
-        <w:ind w:firstLine="0" w:left="567"/>
-      </w:pPr>
-      <w:r>
-        <w:rPr>
-          <w:rFonts w:ascii="Times New Roman" w:hAnsi="Times New Roman" w:eastAsia="Times New Roman"/>
-          <w:color w:val="000000"/>
-          <w:sz w:val="24"/>
-        </w:rPr>
-        <w:t>• Đầu ra: Bảng gồm mã hàng, tên hàng, đơn vị tính, tồn đầu, số lượng nhập, số lượng xuất, tồn cuối, giá trị tồn (tồn cuối giá nhập).</w:t>
-      </w:r>
-    </w:p>
-    <w:p>
-      <w:pPr>
-        <w:spacing w:line="276" w:lineRule="auto" w:after="60"/>
-        <w:ind w:firstLine="0" w:left="567"/>
-      </w:pPr>
-      <w:r>
-        <w:rPr>
-          <w:rFonts w:ascii="Times New Roman" w:hAnsi="Times New Roman" w:eastAsia="Times New Roman"/>
-          <w:color w:val="000000"/>
-          <w:sz w:val="24"/>
-        </w:rPr>
-        <w:t>• Sử dụng: Kế toán đối chiếu số liệu, quản lý kho kiểm tra luân chuyển hàng.</w:t>
-      </w:r>
-    </w:p>
-    <w:p>
-      <w:pPr>
-        <w:pStyle w:val="Heading3"/>
-      </w:pPr>
-      <w:r>
-        <w:rPr>
-          <w:rFonts w:ascii="Times New Roman" w:hAnsi="Times New Roman" w:eastAsia="Times New Roman"/>
-          <w:b/>
-          <w:color w:val="000000"/>
-          <w:sz w:val="24"/>
-        </w:rPr>
-        <w:t>7.3.2 Báo cáo hàng tồn kho thấp</w:t>
-      </w:r>
-    </w:p>
-    <w:p>
-      <w:pPr>
-        <w:spacing w:line="276" w:lineRule="auto" w:after="120"/>
-        <w:ind w:firstLine="567"/>
-      </w:pPr>
-      <w:r>
-        <w:rPr>
-          <w:rFonts w:ascii="Times New Roman" w:hAnsi="Times New Roman" w:eastAsia="Times New Roman"/>
-          <w:color w:val="000000"/>
-          <w:sz w:val="24"/>
-        </w:rPr>
-        <w:t>Báo cáo cảnh báo các hàng hóa có số lượng tồn kho dưới ngưỡng tối thiểu cho phép, hỗ trợ quyết định đặt hàng bổ sung.</w:t>
-      </w:r>
-    </w:p>
-    <w:p>
-      <w:pPr>
-        <w:spacing w:line="276" w:lineRule="auto" w:after="60"/>
-        <w:ind w:firstLine="0" w:left="567"/>
-      </w:pPr>
-      <w:r>
-        <w:rPr>
-          <w:rFonts w:ascii="Times New Roman" w:hAnsi="Times New Roman" w:eastAsia="Times New Roman"/>
-          <w:color w:val="000000"/>
-          <w:sz w:val="24"/>
-        </w:rPr>
-        <w:t>• Đầu vào: Mã kho, ngưỡng cảnh báo (mặc định hoặc cấu hình theo từng hàng hóa).</w:t>
-      </w:r>
-    </w:p>
-    <w:p>
-      <w:pPr>
-        <w:spacing w:line="276" w:lineRule="auto" w:after="60"/>
-        <w:ind w:firstLine="0" w:left="567"/>
-      </w:pPr>
-      <w:r>
-        <w:rPr>
-          <w:rFonts w:ascii="Times New Roman" w:hAnsi="Times New Roman" w:eastAsia="Times New Roman"/>
-          <w:color w:val="000000"/>
-          <w:sz w:val="24"/>
-        </w:rPr>
-        <w:t>• Điều kiện: SoLuongTon &lt;= NguongCanhBao.</w:t>
-      </w:r>
-    </w:p>
-    <w:p>
-      <w:pPr>
-        <w:spacing w:line="276" w:lineRule="auto" w:after="60"/>
-        <w:ind w:firstLine="0" w:left="567"/>
-      </w:pPr>
-      <w:r>
-        <w:rPr>
-          <w:rFonts w:ascii="Times New Roman" w:hAnsi="Times New Roman" w:eastAsia="Times New Roman"/>
-          <w:color w:val="000000"/>
-          <w:sz w:val="24"/>
-        </w:rPr>
-        <w:t>• Đầu ra: Danh sách hàng cần nhập bổ sung, gồm mã hàng, tên hàng, tồn hiện tại, ngưỡng cảnh báo, đề xuất số lượng nhập và nhà cung cấp gần nhất.</w:t>
-      </w:r>
-    </w:p>
-    <w:p>
-      <w:pPr>
-        <w:spacing w:line="276" w:lineRule="auto" w:after="60"/>
-        <w:ind w:firstLine="0" w:left="567"/>
-      </w:pPr>
-      <w:r>
-        <w:rPr>
-          <w:rFonts w:ascii="Times New Roman" w:hAnsi="Times New Roman" w:eastAsia="Times New Roman"/>
-          <w:color w:val="000000"/>
-          <w:sz w:val="24"/>
-        </w:rPr>
-        <w:t>• Sử dụng: Quản lý kho lên kế hoạch mua hàng, tránh tình trạng thiếu hàng.</w:t>
-      </w:r>
-    </w:p>
-    <w:p>
-      <w:pPr>
-        <w:pStyle w:val="Heading3"/>
-      </w:pPr>
-      <w:r>
-        <w:rPr>
-          <w:rFonts w:ascii="Times New Roman" w:hAnsi="Times New Roman" w:eastAsia="Times New Roman"/>
-          <w:b/>
-          <w:color w:val="000000"/>
-          <w:sz w:val="24"/>
-        </w:rPr>
-        <w:t>7.3.3 Báo cáo hàng bán chạy / xuất nhiều</w:t>
-      </w:r>
-    </w:p>
-    <w:p>
-      <w:pPr>
-        <w:spacing w:line="276" w:lineRule="auto" w:after="120"/>
-        <w:ind w:firstLine="567"/>
-      </w:pPr>
-      <w:r>
-        <w:rPr>
-          <w:rFonts w:ascii="Times New Roman" w:hAnsi="Times New Roman" w:eastAsia="Times New Roman"/>
-          <w:color w:val="000000"/>
-          <w:sz w:val="24"/>
-        </w:rPr>
-        <w:t>Báo cáo thống kê các hàng hóa có lượng xuất kho cao nhất trong khoảng thời gian, hỗ trợ dự báo nhu cầu và điều chỉnh tồn kho.</w:t>
-      </w:r>
-    </w:p>
-    <w:p>
-      <w:pPr>
-        <w:spacing w:line="276" w:lineRule="auto" w:after="60"/>
-        <w:ind w:firstLine="0" w:left="567"/>
-      </w:pPr>
-      <w:r>
-        <w:rPr>
-          <w:rFonts w:ascii="Times New Roman" w:hAnsi="Times New Roman" w:eastAsia="Times New Roman"/>
-          <w:color w:val="000000"/>
-          <w:sz w:val="24"/>
-        </w:rPr>
-        <w:t>• Đầu vào: Khoảng thời gian, số lượng top N (ví dụ top 10, 20), mã kho (tùy chọn).</w:t>
-      </w:r>
-    </w:p>
-    <w:p>
-      <w:pPr>
-        <w:spacing w:line="276" w:lineRule="auto" w:after="60"/>
-        <w:ind w:firstLine="0" w:left="567"/>
-      </w:pPr>
-      <w:r>
-        <w:rPr>
-          <w:rFonts w:ascii="Times New Roman" w:hAnsi="Times New Roman" w:eastAsia="Times New Roman"/>
-          <w:color w:val="000000"/>
-          <w:sz w:val="24"/>
-        </w:rPr>
-        <w:t>• Đầu ra: Bảng xếp hạng gồm mã hàng, tên hàng, tổng số lượng xuất, tổng giá trị xuất, tỷ trọng so với tổng xuất.</w:t>
-      </w:r>
-    </w:p>
-    <w:p>
-      <w:pPr>
-        <w:spacing w:line="276" w:lineRule="auto" w:after="60"/>
-        <w:ind w:firstLine="0" w:left="567"/>
-      </w:pPr>
-      <w:r>
-        <w:rPr>
-          <w:rFonts w:ascii="Times New Roman" w:hAnsi="Times New Roman" w:eastAsia="Times New Roman"/>
-          <w:color w:val="000000"/>
-          <w:sz w:val="24"/>
-        </w:rPr>
-        <w:t>• Sử dụng: Bộ phận kinh doanh điều chỉnh chiến lược bán hàng, quản lý kho dự trù hàng bán chạy.</w:t>
-      </w:r>
-    </w:p>
-    <w:p>
-      <w:pPr>
-        <w:pStyle w:val="Heading3"/>
-      </w:pPr>
-      <w:r>
-        <w:rPr>
-          <w:rFonts w:ascii="Times New Roman" w:hAnsi="Times New Roman" w:eastAsia="Times New Roman"/>
-          <w:b/>
-          <w:color w:val="000000"/>
-          <w:sz w:val="24"/>
-        </w:rPr>
-        <w:t>7.3.4 Báo cáo doanh thu và công nợ theo khách hàng</w:t>
-      </w:r>
-    </w:p>
-    <w:p>
-      <w:pPr>
-        <w:spacing w:line="276" w:lineRule="auto" w:after="120"/>
-        <w:ind w:firstLine="567"/>
-      </w:pPr>
-      <w:r>
-        <w:rPr>
-          <w:rFonts w:ascii="Times New Roman" w:hAnsi="Times New Roman" w:eastAsia="Times New Roman"/>
-          <w:color w:val="000000"/>
-          <w:sz w:val="24"/>
-        </w:rPr>
-        <w:t>Báo cáo tổng giá trị xuất kho và tổng tiền thanh toán theo từng khách hàng, giúp theo dõi công nợ.</w:t>
-      </w:r>
-    </w:p>
-    <w:p>
-      <w:pPr>
-        <w:spacing w:line="276" w:lineRule="auto" w:after="60"/>
-        <w:ind w:firstLine="0" w:left="567"/>
-      </w:pPr>
-      <w:r>
-        <w:rPr>
-          <w:rFonts w:ascii="Times New Roman" w:hAnsi="Times New Roman" w:eastAsia="Times New Roman"/>
-          <w:color w:val="000000"/>
-          <w:sz w:val="24"/>
-        </w:rPr>
-        <w:t>• Đầu vào: Mã khách hàng (tùy chọn), khoảng thời gian.</w:t>
-      </w:r>
-    </w:p>
-    <w:p>
-      <w:pPr>
-        <w:spacing w:line="276" w:lineRule="auto" w:after="60"/>
-        <w:ind w:firstLine="0" w:left="567"/>
-      </w:pPr>
-      <w:r>
-        <w:rPr>
-          <w:rFonts w:ascii="Times New Roman" w:hAnsi="Times New Roman" w:eastAsia="Times New Roman"/>
-          <w:color w:val="000000"/>
-          <w:sz w:val="24"/>
-        </w:rPr>
-        <w:t>• Công thức: Công nợ = Tổng giá trị phiếu xuất - Tổng tiền đã thanh toán.</w:t>
-      </w:r>
-    </w:p>
-    <w:p>
-      <w:pPr>
-        <w:spacing w:line="276" w:lineRule="auto" w:after="60"/>
-        <w:ind w:firstLine="0" w:left="567"/>
-      </w:pPr>
-      <w:r>
-        <w:rPr>
-          <w:rFonts w:ascii="Times New Roman" w:hAnsi="Times New Roman" w:eastAsia="Times New Roman"/>
-          <w:color w:val="000000"/>
-          <w:sz w:val="24"/>
-        </w:rPr>
-        <w:t>• Đầu ra: Bảng gồm mã khách, tên khách, tổng giá trị xuất, đã thanh toán, còn nợ, thời gian nợ.</w:t>
-      </w:r>
-    </w:p>
-    <w:p>
-      <w:pPr>
-        <w:spacing w:line="276" w:lineRule="auto" w:after="60"/>
-        <w:ind w:firstLine="0" w:left="567"/>
-      </w:pPr>
-      <w:r>
-        <w:rPr>
-          <w:rFonts w:ascii="Times New Roman" w:hAnsi="Times New Roman" w:eastAsia="Times New Roman"/>
-          <w:color w:val="000000"/>
-          <w:sz w:val="24"/>
-        </w:rPr>
-        <w:t>• Sử dụng: Kế toán theo dõi công nợ, bộ phận kinh doanh đánh giá khách hàng.</w:t>
-      </w:r>
-    </w:p>
-    <w:p>
-      <w:pPr>
-        <w:pStyle w:val="Heading3"/>
-      </w:pPr>
-      <w:r>
-        <w:rPr>
-          <w:rFonts w:ascii="Times New Roman" w:hAnsi="Times New Roman" w:eastAsia="Times New Roman"/>
-          <w:b/>
-          <w:color w:val="000000"/>
-          <w:sz w:val="24"/>
-        </w:rPr>
-        <w:t>7.3.5 Báo cáo mua hàng theo nhà cung cấp</w:t>
-      </w:r>
-    </w:p>
-    <w:p>
-      <w:pPr>
-        <w:spacing w:line="276" w:lineRule="auto" w:after="120"/>
-        <w:ind w:firstLine="567"/>
-      </w:pPr>
-      <w:r>
-        <w:rPr>
-          <w:rFonts w:ascii="Times New Roman" w:hAnsi="Times New Roman" w:eastAsia="Times New Roman"/>
-          <w:color w:val="000000"/>
-          <w:sz w:val="24"/>
-        </w:rPr>
-        <w:t>Báo cáo tổng giá trị nhập kho từ từng nhà cung cấp trong khoảng thời gian, giúp đánh giá đối tác.</w:t>
-      </w:r>
-    </w:p>
-    <w:p>
-      <w:pPr>
-        <w:spacing w:line="276" w:lineRule="auto" w:after="60"/>
-        <w:ind w:firstLine="0" w:left="567"/>
-      </w:pPr>
-      <w:r>
-        <w:rPr>
-          <w:rFonts w:ascii="Times New Roman" w:hAnsi="Times New Roman" w:eastAsia="Times New Roman"/>
-          <w:color w:val="000000"/>
-          <w:sz w:val="24"/>
-        </w:rPr>
-        <w:t>• Đầu vào: Mã nhà cung cấp (tùy chọn), khoảng thời gian.</w:t>
-      </w:r>
-    </w:p>
-    <w:p>
-      <w:pPr>
-        <w:spacing w:line="276" w:lineRule="auto" w:after="60"/>
-        <w:ind w:firstLine="0" w:left="567"/>
-      </w:pPr>
-      <w:r>
-        <w:rPr>
-          <w:rFonts w:ascii="Times New Roman" w:hAnsi="Times New Roman" w:eastAsia="Times New Roman"/>
-          <w:color w:val="000000"/>
-          <w:sz w:val="24"/>
-        </w:rPr>
-        <w:t>• Đầu ra: Bảng gồm mã NCC, tên NCC, số phiếu nhập, tổng số lượng hàng, tổng giá trị nhập, tỷ trọng.</w:t>
-      </w:r>
-    </w:p>
-    <w:p>
-      <w:pPr>
-        <w:spacing w:line="276" w:lineRule="auto" w:after="60"/>
-        <w:ind w:firstLine="0" w:left="567"/>
-      </w:pPr>
-      <w:r>
-        <w:rPr>
-          <w:rFonts w:ascii="Times New Roman" w:hAnsi="Times New Roman" w:eastAsia="Times New Roman"/>
-          <w:color w:val="000000"/>
-          <w:sz w:val="24"/>
-        </w:rPr>
-        <w:t>• Sử dụng: Đánh giá nhà cung cấp, đàm phán giá, điều chỉnh danh sách đối tác.</w:t>
-      </w:r>
-    </w:p>
-    <w:p>
-      <w:pPr>
-        <w:pStyle w:val="Heading3"/>
-      </w:pPr>
-      <w:r>
-        <w:rPr>
-          <w:rFonts w:ascii="Times New Roman" w:hAnsi="Times New Roman" w:eastAsia="Times New Roman"/>
-          <w:b/>
-          <w:color w:val="000000"/>
-          <w:sz w:val="24"/>
-        </w:rPr>
-        <w:t>7.3.6 Định dạng xuất báo cáo</w:t>
-      </w:r>
-    </w:p>
-    <w:p>
-      <w:pPr>
-        <w:spacing w:line="276" w:lineRule="auto" w:after="120"/>
-        <w:ind w:firstLine="567"/>
-      </w:pPr>
-      <w:r>
-        <w:rPr>
-          <w:rFonts w:ascii="Times New Roman" w:hAnsi="Times New Roman" w:eastAsia="Times New Roman"/>
-          <w:color w:val="000000"/>
-          <w:sz w:val="24"/>
-        </w:rPr>
-        <w:t>Các báo cáo hỗ trợ xuất dưới nhiều định dạng để phục vụ các nhu cầu khác nhau:</w:t>
-      </w:r>
-    </w:p>
-    <w:p>
-      <w:pPr>
-        <w:spacing w:line="276" w:lineRule="auto" w:after="60"/>
-        <w:ind w:firstLine="0" w:left="567"/>
-      </w:pPr>
-      <w:r>
-        <w:rPr>
-          <w:rFonts w:ascii="Times New Roman" w:hAnsi="Times New Roman" w:eastAsia="Times New Roman"/>
-          <w:color w:val="000000"/>
-          <w:sz w:val="24"/>
-        </w:rPr>
-        <w:t>• Trên giao diện web: Bảng dữ liệu có phân trang, sắp xếp theo cột, tìm kiếm nhanh và biểu đồ trực quan (cột, đường, tròn).</w:t>
-      </w:r>
-    </w:p>
-    <w:p>
-      <w:pPr>
-        <w:spacing w:line="276" w:lineRule="auto" w:after="60"/>
-        <w:ind w:firstLine="0" w:left="567"/>
-      </w:pPr>
-      <w:r>
-        <w:rPr>
-          <w:rFonts w:ascii="Times New Roman" w:hAnsi="Times New Roman" w:eastAsia="Times New Roman"/>
-          <w:color w:val="000000"/>
-          <w:sz w:val="24"/>
-        </w:rPr>
-        <w:t>• Xuất file PDF: Mẫu báo cáo chuẩn với tiêu đề, ngày lập, người lập, chữ ký -- phù hợp để in và lưu trữ.</w:t>
-      </w:r>
-    </w:p>
-    <w:p>
-      <w:pPr>
-        <w:spacing w:line="276" w:lineRule="auto" w:after="60"/>
-        <w:ind w:firstLine="0" w:left="567"/>
-      </w:pPr>
-      <w:r>
-        <w:rPr>
-          <w:rFonts w:ascii="Times New Roman" w:hAnsi="Times New Roman" w:eastAsia="Times New Roman"/>
-          <w:color w:val="000000"/>
-          <w:sz w:val="24"/>
-        </w:rPr>
-        <w:t>• Xuất file Excel (CSV): Dữ liệu thô để xử lý thêm bằng Excel hoặc gửi email.</w:t>
-      </w:r>
-    </w:p>
-    <w:p>
-      <w:pPr>
-        <w:spacing w:line="276" w:lineRule="auto" w:after="60"/>
-        <w:ind w:firstLine="0" w:left="567"/>
-      </w:pPr>
-      <w:r>
-        <w:rPr>
-          <w:rFonts w:ascii="Times New Roman" w:hAnsi="Times New Roman" w:eastAsia="Times New Roman"/>
-          <w:color w:val="000000"/>
-          <w:sz w:val="24"/>
-        </w:rPr>
-        <w:t>• In trực tiếp: Mẫu in A4 với định dạng chuẩn, hỗ trợ in ngay từ trình duyệt.</w:t>
-      </w:r>
-    </w:p>
-    <w:p>
-      <w:pPr>
-        <w:pStyle w:val="Heading2"/>
-      </w:pPr>
-      <w:r>
-        <w:rPr>
-          <w:rFonts w:ascii="Times New Roman" w:hAnsi="Times New Roman" w:eastAsia="Times New Roman"/>
-          <w:b/>
-          <w:color w:val="000000"/>
-          <w:sz w:val="26"/>
-        </w:rPr>
-        <w:t>7.4 Thiết kế giao diện</w:t>
-      </w:r>
-    </w:p>
-    <w:p>
-      <w:pPr>
-        <w:spacing w:line="276" w:lineRule="auto" w:after="120"/>
-        <w:ind w:firstLine="567"/>
-      </w:pPr>
-      <w:r>
-        <w:rPr>
-          <w:rFonts w:ascii="Times New Roman" w:hAnsi="Times New Roman" w:eastAsia="Times New Roman"/>
-          <w:color w:val="000000"/>
-          <w:sz w:val="24"/>
-        </w:rPr>
-        <w:t>Hệ thống được thiết kế theo mô hình ứng dụng web với giao diện thân thiện, hỗ trợ tiếng Việt đầy đủ, responsive trên cả máy tính và máy tính bảng. Các màn hình chính bao gồm:</w:t>
-      </w:r>
-    </w:p>
-    <w:p>
-      <w:pPr>
-        <w:spacing w:line="276" w:lineRule="auto" w:after="60"/>
-        <w:ind w:firstLine="0" w:left="567"/>
-      </w:pPr>
-      <w:r>
-        <w:rPr>
-          <w:rFonts w:ascii="Times New Roman" w:hAnsi="Times New Roman" w:eastAsia="Times New Roman"/>
-          <w:color w:val="000000"/>
-          <w:sz w:val="24"/>
-        </w:rPr>
-        <w:t>• Màn hình đăng nhập: Form nhập tên đăng nhập, mật khẩu, nút “Đăng nhập”. Sau khi đăng nhập, hệ thống chuyển hướng đến giao diện phù hợp với vai trò.</w:t>
-      </w:r>
-    </w:p>
-    <w:p>
-      <w:pPr>
-        <w:spacing w:line="276" w:lineRule="auto" w:after="60"/>
-        <w:ind w:firstLine="0" w:left="567"/>
-      </w:pPr>
-      <w:r>
-        <w:rPr>
-          <w:rFonts w:ascii="Times New Roman" w:hAnsi="Times New Roman" w:eastAsia="Times New Roman"/>
-          <w:color w:val="000000"/>
-          <w:sz w:val="24"/>
-        </w:rPr>
-        <w:t>• Trang chủ / Dashboard: Hiển thị tổng quan: số lượng hàng hóa, tổng giá trị tồn kho, phiếu nhập/xuất chờ duyệt, cảnh báo tồn kho thấp, biểu đồ nhập xuất theo tháng.</w:t>
-      </w:r>
-    </w:p>
-    <w:p>
-      <w:pPr>
-        <w:spacing w:line="276" w:lineRule="auto" w:after="60"/>
-        <w:ind w:firstLine="0" w:left="567"/>
-      </w:pPr>
-      <w:r>
-        <w:rPr>
-          <w:rFonts w:ascii="Times New Roman" w:hAnsi="Times New Roman" w:eastAsia="Times New Roman"/>
-          <w:color w:val="000000"/>
-          <w:sz w:val="24"/>
-        </w:rPr>
-        <w:t>• Quản lý hàng hóa: Danh sách hàng hóa dạng bảng với phân trang, form thêm/sửa hàng hóa, bộ lọc theo nhóm hàng và trạng thái, nút tìm kiếm và xuất Excel.</w:t>
-      </w:r>
-    </w:p>
-    <w:p>
-      <w:pPr>
-        <w:spacing w:line="276" w:lineRule="auto" w:after="60"/>
-        <w:ind w:firstLine="0" w:left="567"/>
-      </w:pPr>
-      <w:r>
-        <w:rPr>
-          <w:rFonts w:ascii="Times New Roman" w:hAnsi="Times New Roman" w:eastAsia="Times New Roman"/>
-          <w:color w:val="000000"/>
-          <w:sz w:val="24"/>
-        </w:rPr>
-        <w:t>• Quản lý nhà cung cấp / khách hàng: Danh sách đối tác, form thêm/sửa, tìm kiếm theo tên hoặc mã.</w:t>
-      </w:r>
-    </w:p>
-    <w:p>
-      <w:pPr>
-        <w:spacing w:line="276" w:lineRule="auto" w:after="60"/>
-        <w:ind w:firstLine="0" w:left="567"/>
-      </w:pPr>
-      <w:r>
-        <w:rPr>
-          <w:rFonts w:ascii="Times New Roman" w:hAnsi="Times New Roman" w:eastAsia="Times New Roman"/>
-          <w:color w:val="000000"/>
-          <w:sz w:val="24"/>
-        </w:rPr>
-        <w:t>• Quản lý kho: Danh sách kho, form thêm/sửa kho, xem chi tiết tồn kho tại từng kho.</w:t>
-      </w:r>
-    </w:p>
-    <w:p>
-      <w:pPr>
-        <w:spacing w:line="276" w:lineRule="auto" w:after="60"/>
-        <w:ind w:firstLine="0" w:left="567"/>
-      </w:pPr>
-      <w:r>
-        <w:rPr>
-          <w:rFonts w:ascii="Times New Roman" w:hAnsi="Times New Roman" w:eastAsia="Times New Roman"/>
-          <w:color w:val="000000"/>
-          <w:sz w:val="24"/>
-        </w:rPr>
-        <w:t>• Quản lý nhập kho: Danh sách phiếu nhập với bộ lọc theo trạng thái và ngày, form lập phiếu nhập (chọn NCC, kho, thêm dòng hàng), form chi tiết phiếu và nút duyệt/từ chối.</w:t>
-      </w:r>
-    </w:p>
-    <w:p>
-      <w:pPr>
-        <w:spacing w:line="276" w:lineRule="auto" w:after="60"/>
-        <w:ind w:firstLine="0" w:left="567"/>
-      </w:pPr>
-      <w:r>
-        <w:rPr>
-          <w:rFonts w:ascii="Times New Roman" w:hAnsi="Times New Roman" w:eastAsia="Times New Roman"/>
-          <w:color w:val="000000"/>
-          <w:sz w:val="24"/>
-        </w:rPr>
-        <w:t>• Quản lý xuất kho: Danh sách phiếu xuất, form lập phiếu xuất (chọn khách hàng, kho, thêm dòng hàng với kiểm tra tồn kho), form chi tiết và nút duyệt/từ chối.</w:t>
-      </w:r>
-    </w:p>
-    <w:p>
-      <w:pPr>
-        <w:spacing w:line="276" w:lineRule="auto" w:after="60"/>
-        <w:ind w:firstLine="0" w:left="567"/>
-      </w:pPr>
-      <w:r>
-        <w:rPr>
-          <w:rFonts w:ascii="Times New Roman" w:hAnsi="Times New Roman" w:eastAsia="Times New Roman"/>
-          <w:color w:val="000000"/>
-          <w:sz w:val="24"/>
-        </w:rPr>
-        <w:t>• Quản lý kiểm kê: Danh sách phiếu kiểm kê, form lập phiếu kiểm kê (chọn kho, nhập số lượng thực tế), hiển thị chênh lệch tự động.</w:t>
-      </w:r>
-    </w:p>
-    <w:p>
-      <w:pPr>
-        <w:spacing w:line="276" w:lineRule="auto" w:after="60"/>
-        <w:ind w:firstLine="0" w:left="567"/>
-      </w:pPr>
-      <w:r>
-        <w:rPr>
-          <w:rFonts w:ascii="Times New Roman" w:hAnsi="Times New Roman" w:eastAsia="Times New Roman"/>
-          <w:color w:val="000000"/>
-          <w:sz w:val="24"/>
-        </w:rPr>
-        <w:t>• Quản lý đơn hàng: Danh sách đơn đặt hàng, form tạo đơn, theo dõi trạng thái đơn.</w:t>
-      </w:r>
-    </w:p>
-    <w:p>
-      <w:pPr>
-        <w:spacing w:line="276" w:lineRule="auto" w:after="60"/>
-        <w:ind w:firstLine="0" w:left="567"/>
-      </w:pPr>
-      <w:r>
-        <w:rPr>
-          <w:rFonts w:ascii="Times New Roman" w:hAnsi="Times New Roman" w:eastAsia="Times New Roman"/>
-          <w:color w:val="000000"/>
-          <w:sz w:val="24"/>
-        </w:rPr>
-        <w:t>• Báo cáo thống kê: Bộ chọn loại báo cáo, form nhập điều kiện, hiển thị báo cáo dạng bảng + biểu đồ, nút xuất PDF/Excel.</w:t>
-      </w:r>
-    </w:p>
-    <w:p>
-      <w:pPr>
-        <w:spacing w:line="276" w:lineRule="auto" w:after="60"/>
-        <w:ind w:firstLine="0" w:left="567"/>
-      </w:pPr>
-      <w:r>
-        <w:rPr>
-          <w:rFonts w:ascii="Times New Roman" w:hAnsi="Times New Roman" w:eastAsia="Times New Roman"/>
-          <w:color w:val="000000"/>
-          <w:sz w:val="24"/>
-        </w:rPr>
-        <w:t>• Quản lý tài khoản: Danh sách tài khoản, form thêm/sửa, phân quyền (chỉ quản trị viên).</w:t>
-      </w:r>
-    </w:p>
-    <w:p>
-      <w:pPr>
-        <w:pStyle w:val="Heading2"/>
-      </w:pPr>
-      <w:r>
-        <w:rPr>
-          <w:rFonts w:ascii="Times New Roman" w:hAnsi="Times New Roman" w:eastAsia="Times New Roman"/>
-          <w:b/>
-          <w:color w:val="000000"/>
-          <w:sz w:val="26"/>
-        </w:rPr>
-        <w:t>7.5 Kết luận chương</w:t>
-      </w:r>
-    </w:p>
-    <w:p>
-      <w:pPr>
-        <w:spacing w:line="276" w:lineRule="auto" w:after="120"/>
-        <w:ind w:firstLine="567"/>
-      </w:pPr>
-      <w:r>
-        <w:rPr>
-          <w:rFonts w:ascii="Times New Roman" w:hAnsi="Times New Roman" w:eastAsia="Times New Roman"/>
-          <w:color w:val="000000"/>
-          <w:sz w:val="24"/>
-        </w:rPr>
-        <w:t>Chương 7 đã trình bày thiết kế cơ sở dữ liệu với mô hình quan hệ tổng thể gồm 16 bảng, đặc tả chi tiết 4 bảng quan trọng (HangHoa, TonKho, PhieuNhapKho, PhieuXuatKho) với đầy đủ thuộc tính, kiểu dữ liệu và ràng buộc. Thiết kế 6 loại báo cáo thống kê chi tiết với đầu vào, công thức, đầu ra và mục đích sử dụng. Cuối cùng, mô tả thiết kế giao diện với 11 màn hình chính. Kết hợp với các chương trước, báo cáo đã hoàn thiện phân tích và thiết kế hệ thống quản lý kho hàng từ khâu khảo sát hiện trạng, mô tả nghiệp vụ, phân tích chức năng, phân tích hành vi và tương tác, đến thiết kế chi tiết các lớp, cơ sở dữ liệu và giao diện.</w:t>
+        <w:t>Chương 7 đã trình bày thiết kế cơ sở dữ liệu với mô hình quan hệ tổng thể gồm 15 bảng, đặc tả chi tiết 4 bảng quan trọng (HangHoa, TonKho, PhieuNhapKho, PhieuXuatKho) với đầy đủ thuộc tính, kiểu dữ liệu và ràng buộc. Cuối cùng, mô tả thiết kế giao diện với 9 màn hình chính. Kết hợp với các chương trước, báo cáo đã hoàn thiện phân tích và thiết kế hệ thống quản lý kho hàng từ khâu khảo sát hiện trạng, mô tả nghiệp vụ, phân tích chức năng, phân tích hành vi và tương tác, đến thiết kế chi tiết các lớp, cơ sở dữ liệu và giao diện.</w:t>
       </w:r>
     </w:p>
     <w:sectPr>

</xml_diff>

<commit_message>
Rút gọn mô tả phương pháp phân tích-thiết kế trong báo cáo Word - loại bỏ các câu nhấn mạnh "không dùng DFD/BFD" (xuất hiện 5 lần ở mục 1.5.2, 2.1, 3.0, 7.4), thay thế cụm "phân tích và thiết kế hướng đối tượng" bằng "hướng đối tượng (UML)", gộp dòng "Chuỗi UML OO:" vào câu trước, điều chỉnh câu kết luận chương 1 từ "khẳng định hướng đối tượng" thành "hướng đối tượng", sửa "Cả
</commit_message>
<xml_diff>
--- a/VIII.HUST/Phân tích và thiết kế hệ thống/BaoCao/BaoCao_QuanLyKhoHang.docx
+++ b/VIII.HUST/Phân tích và thiết kế hệ thống/BaoCao/BaoCao_QuanLyKhoHang.docx
@@ -3819,7 +3819,77 @@
           <w:color w:val="000000"/>
           <w:sz w:val="24"/>
         </w:rPr>
-        <w:t>, không dùng các sơ đồ phân tích cấu trúc/hành vi kiểu cổ điển như</w:t>
+        <w:t>(UML):</w:t>
+      </w:r>
+    </w:p>
+    <w:p>
+      <w:pPr>
+        <w:spacing w:line="276" w:lineRule="auto" w:after="60"/>
+        <w:ind w:firstLine="0" w:left="567"/>
+      </w:pPr>
+      <w:r>
+        <w:rPr>
+          <w:rFonts w:ascii="Times New Roman" w:hAnsi="Times New Roman" w:eastAsia="Times New Roman"/>
+          <w:color w:val="000000"/>
+          <w:sz w:val="24"/>
+        </w:rPr>
+        <w:t>– Nghiệp vụ → Use Case (tổng quát, phân rã, đặc tả).</w:t>
+      </w:r>
+    </w:p>
+    <w:p>
+      <w:pPr>
+        <w:spacing w:line="276" w:lineRule="auto" w:after="60"/>
+        <w:ind w:firstLine="0" w:left="567"/>
+      </w:pPr>
+      <w:r>
+        <w:rPr>
+          <w:rFonts w:ascii="Times New Roman" w:hAnsi="Times New Roman" w:eastAsia="Times New Roman"/>
+          <w:color w:val="000000"/>
+          <w:sz w:val="24"/>
+        </w:rPr>
+        <w:t>– Activity (luồng bước của use case).</w:t>
+      </w:r>
+    </w:p>
+    <w:p>
+      <w:pPr>
+        <w:spacing w:line="276" w:lineRule="auto" w:after="60"/>
+        <w:ind w:firstLine="0" w:left="567"/>
+      </w:pPr>
+      <w:r>
+        <w:rPr>
+          <w:rFonts w:ascii="Times New Roman" w:hAnsi="Times New Roman" w:eastAsia="Times New Roman"/>
+          <w:color w:val="000000"/>
+          <w:sz w:val="24"/>
+        </w:rPr>
+        <w:t>– Sequence (tương tác giữa các đối tượng).</w:t>
+      </w:r>
+    </w:p>
+    <w:p>
+      <w:pPr>
+        <w:spacing w:line="276" w:lineRule="auto" w:after="60"/>
+        <w:ind w:firstLine="0" w:left="567"/>
+      </w:pPr>
+      <w:r>
+        <w:rPr>
+          <w:rFonts w:ascii="Times New Roman" w:hAnsi="Times New Roman" w:eastAsia="Times New Roman"/>
+          <w:color w:val="000000"/>
+          <w:sz w:val="24"/>
+        </w:rPr>
+        <w:t>– Class (lớp đối tượng và quan hệ).</w:t>
+      </w:r>
+    </w:p>
+    <w:p>
+      <w:pPr>
+        <w:spacing w:line="276" w:lineRule="auto" w:after="60"/>
+        <w:ind w:firstLine="0" w:left="567"/>
+      </w:pPr>
+      <w:r>
+        <w:rPr>
+          <w:rFonts w:ascii="Times New Roman" w:hAnsi="Times New Roman" w:eastAsia="Times New Roman"/>
+          <w:color w:val="000000"/>
+          <w:sz w:val="24"/>
+        </w:rPr>
+        <w:t>– State / Component (bổ sung); ERD + giao diện (thiết kế).</w:t>
       </w:r>
     </w:p>
     <w:p>
@@ -3833,7 +3903,21 @@
           <w:color w:val="000000"/>
           <w:sz w:val="24"/>
         </w:rPr>
-        <w:t>,</w:t>
+        <w:t>Sơ đồ vẽ bằng TikZ / pgf-umlcd / pgf-umlsd trên LaTeX.</w:t>
+      </w:r>
+    </w:p>
+    <w:p>
+      <w:pPr>
+        <w:pStyle w:val="Heading2"/>
+      </w:pPr>
+      <w:r>
+        <w:rPr>
+          <w:rFonts w:ascii="Times New Roman" w:hAnsi="Times New Roman" w:eastAsia="Times New Roman"/>
+          <w:b/>
+          <w:color w:val="000000"/>
+          <w:sz w:val="26"/>
+        </w:rPr>
+        <w:t>1.6 Kết luận chương</w:t>
       </w:r>
     </w:p>
     <w:p>
@@ -3847,7 +3931,7 @@
           <w:color w:val="000000"/>
           <w:sz w:val="24"/>
         </w:rPr>
-        <w:t>.</w:t>
+        <w:t>Chương 1: bối cảnh, phạm vi, yêu cầu;</w:t>
       </w:r>
     </w:p>
     <w:p>
@@ -3861,77 +3945,7 @@
           <w:color w:val="000000"/>
           <w:sz w:val="24"/>
         </w:rPr>
-        <w:t>Chuỗi UML OO:</w:t>
-      </w:r>
-    </w:p>
-    <w:p>
-      <w:pPr>
-        <w:spacing w:line="276" w:lineRule="auto" w:after="60"/>
-        <w:ind w:firstLine="0" w:left="567"/>
-      </w:pPr>
-      <w:r>
-        <w:rPr>
-          <w:rFonts w:ascii="Times New Roman" w:hAnsi="Times New Roman" w:eastAsia="Times New Roman"/>
-          <w:color w:val="000000"/>
-          <w:sz w:val="24"/>
-        </w:rPr>
-        <w:t>– Nghiệp vụ → Use Case (tổng quát, phân rã, đặc tả).</w:t>
-      </w:r>
-    </w:p>
-    <w:p>
-      <w:pPr>
-        <w:spacing w:line="276" w:lineRule="auto" w:after="60"/>
-        <w:ind w:firstLine="0" w:left="567"/>
-      </w:pPr>
-      <w:r>
-        <w:rPr>
-          <w:rFonts w:ascii="Times New Roman" w:hAnsi="Times New Roman" w:eastAsia="Times New Roman"/>
-          <w:color w:val="000000"/>
-          <w:sz w:val="24"/>
-        </w:rPr>
-        <w:t>– Activity (luồng bước của use case).</w:t>
-      </w:r>
-    </w:p>
-    <w:p>
-      <w:pPr>
-        <w:spacing w:line="276" w:lineRule="auto" w:after="60"/>
-        <w:ind w:firstLine="0" w:left="567"/>
-      </w:pPr>
-      <w:r>
-        <w:rPr>
-          <w:rFonts w:ascii="Times New Roman" w:hAnsi="Times New Roman" w:eastAsia="Times New Roman"/>
-          <w:color w:val="000000"/>
-          <w:sz w:val="24"/>
-        </w:rPr>
-        <w:t>– Sequence (tương tác giữa các đối tượng).</w:t>
-      </w:r>
-    </w:p>
-    <w:p>
-      <w:pPr>
-        <w:spacing w:line="276" w:lineRule="auto" w:after="60"/>
-        <w:ind w:firstLine="0" w:left="567"/>
-      </w:pPr>
-      <w:r>
-        <w:rPr>
-          <w:rFonts w:ascii="Times New Roman" w:hAnsi="Times New Roman" w:eastAsia="Times New Roman"/>
-          <w:color w:val="000000"/>
-          <w:sz w:val="24"/>
-        </w:rPr>
-        <w:t>– Class (lớp đối tượng và quan hệ).</w:t>
-      </w:r>
-    </w:p>
-    <w:p>
-      <w:pPr>
-        <w:spacing w:line="276" w:lineRule="auto" w:after="60"/>
-        <w:ind w:firstLine="0" w:left="567"/>
-      </w:pPr>
-      <w:r>
-        <w:rPr>
-          <w:rFonts w:ascii="Times New Roman" w:hAnsi="Times New Roman" w:eastAsia="Times New Roman"/>
-          <w:color w:val="000000"/>
-          <w:sz w:val="24"/>
-        </w:rPr>
-        <w:t>– State / Component (bổ sung); ERD + giao diện (thiết kế).</w:t>
+        <w:t>. Tiếp: Nghiệp vụ $</w:t>
       </w:r>
     </w:p>
     <w:p>
@@ -3945,21 +3959,7 @@
           <w:color w:val="000000"/>
           <w:sz w:val="24"/>
         </w:rPr>
-        <w:t>Sơ đồ vẽ bằng TikZ / pgf-umlcd / pgf-umlsd trên LaTeX.</w:t>
-      </w:r>
-    </w:p>
-    <w:p>
-      <w:pPr>
-        <w:pStyle w:val="Heading2"/>
-      </w:pPr>
-      <w:r>
-        <w:rPr>
-          <w:rFonts w:ascii="Times New Roman" w:hAnsi="Times New Roman" w:eastAsia="Times New Roman"/>
-          <w:b/>
-          <w:color w:val="000000"/>
-          <w:sz w:val="26"/>
-        </w:rPr>
-        <w:t>1.6 Kết luận chương</w:t>
+        <w:t>UC</w:t>
       </w:r>
     </w:p>
     <w:p>
@@ -3973,7 +3973,7 @@
           <w:color w:val="000000"/>
           <w:sz w:val="24"/>
         </w:rPr>
-        <w:t>Chương 1: bối cảnh, phạm vi, yêu cầu; khẳng định</w:t>
+        <w:t>Activity</w:t>
       </w:r>
     </w:p>
     <w:p>
@@ -3987,7 +3987,7 @@
           <w:color w:val="000000"/>
           <w:sz w:val="24"/>
         </w:rPr>
-        <w:t>. Tiếp: Nghiệp vụ $</w:t>
+        <w:t>Sequence</w:t>
       </w:r>
     </w:p>
     <w:p>
@@ -4001,7 +4001,7 @@
           <w:color w:val="000000"/>
           <w:sz w:val="24"/>
         </w:rPr>
-        <w:t>UC</w:t>
+        <w:t>Class</w:t>
       </w:r>
     </w:p>
     <w:p>
@@ -4015,7 +4015,35 @@
           <w:color w:val="000000"/>
           <w:sz w:val="24"/>
         </w:rPr>
-        <w:t>Activity</w:t>
+        <w:t>$ CSDL/UI.</w:t>
+      </w:r>
+    </w:p>
+    <w:p>
+      <w:pPr>
+        <w:pStyle w:val="Heading1"/>
+      </w:pPr>
+      <w:r>
+        <w:rPr>
+          <w:rFonts w:ascii="Times New Roman" w:hAnsi="Times New Roman" w:eastAsia="Times New Roman"/>
+          <w:b/>
+          <w:color w:val="000000"/>
+          <w:sz w:val="28"/>
+        </w:rPr>
+        <w:t>CHƯƠNG 2: MÔ TẢ NGHIỆP VỤ</w:t>
+      </w:r>
+    </w:p>
+    <w:p>
+      <w:pPr>
+        <w:pStyle w:val="Heading2"/>
+      </w:pPr>
+      <w:r>
+        <w:rPr>
+          <w:rFonts w:ascii="Times New Roman" w:hAnsi="Times New Roman" w:eastAsia="Times New Roman"/>
+          <w:b/>
+          <w:color w:val="000000"/>
+          <w:sz w:val="26"/>
+        </w:rPr>
+        <w:t>2.1 Quy trình phân tích -- thiết kế (hướng đối tượng)</w:t>
       </w:r>
     </w:p>
     <w:p>
@@ -4029,7 +4057,7 @@
           <w:color w:val="000000"/>
           <w:sz w:val="24"/>
         </w:rPr>
-        <w:t>Sequence</w:t>
+        <w:t>Báo cáo theo</w:t>
       </w:r>
     </w:p>
     <w:p>
@@ -4043,77 +4071,7 @@
           <w:color w:val="000000"/>
           <w:sz w:val="24"/>
         </w:rPr>
-        <w:t>Class</w:t>
-      </w:r>
-    </w:p>
-    <w:p>
-      <w:pPr>
-        <w:spacing w:line="276" w:lineRule="auto" w:after="120"/>
-        <w:ind w:firstLine="567"/>
-      </w:pPr>
-      <w:r>
-        <w:rPr>
-          <w:rFonts w:ascii="Times New Roman" w:hAnsi="Times New Roman" w:eastAsia="Times New Roman"/>
-          <w:color w:val="000000"/>
-          <w:sz w:val="24"/>
-        </w:rPr>
-        <w:t>$ CSDL/UI.</w:t>
-      </w:r>
-    </w:p>
-    <w:p>
-      <w:pPr>
-        <w:pStyle w:val="Heading1"/>
-      </w:pPr>
-      <w:r>
-        <w:rPr>
-          <w:rFonts w:ascii="Times New Roman" w:hAnsi="Times New Roman" w:eastAsia="Times New Roman"/>
-          <w:b/>
-          <w:color w:val="000000"/>
-          <w:sz w:val="28"/>
-        </w:rPr>
-        <w:t>CHƯƠNG 2: MÔ TẢ NGHIỆP VỤ</w:t>
-      </w:r>
-    </w:p>
-    <w:p>
-      <w:pPr>
-        <w:pStyle w:val="Heading2"/>
-      </w:pPr>
-      <w:r>
-        <w:rPr>
-          <w:rFonts w:ascii="Times New Roman" w:hAnsi="Times New Roman" w:eastAsia="Times New Roman"/>
-          <w:b/>
-          <w:color w:val="000000"/>
-          <w:sz w:val="26"/>
-        </w:rPr>
-        <w:t>2.1 Quy trình phân tích -- thiết kế (hướng đối tượng)</w:t>
-      </w:r>
-    </w:p>
-    <w:p>
-      <w:pPr>
-        <w:spacing w:line="276" w:lineRule="auto" w:after="120"/>
-        <w:ind w:firstLine="567"/>
-      </w:pPr>
-      <w:r>
-        <w:rPr>
-          <w:rFonts w:ascii="Times New Roman" w:hAnsi="Times New Roman" w:eastAsia="Times New Roman"/>
-          <w:color w:val="000000"/>
-          <w:sz w:val="24"/>
-        </w:rPr>
-        <w:t>Báo cáo theo</w:t>
-      </w:r>
-    </w:p>
-    <w:p>
-      <w:pPr>
-        <w:spacing w:line="276" w:lineRule="auto" w:after="120"/>
-        <w:ind w:firstLine="567"/>
-      </w:pPr>
-      <w:r>
-        <w:rPr>
-          <w:rFonts w:ascii="Times New Roman" w:hAnsi="Times New Roman" w:eastAsia="Times New Roman"/>
-          <w:color w:val="000000"/>
-          <w:sz w:val="24"/>
-        </w:rPr>
-        <w:t>, không dùng DFD/BFD (thuộc phân tích cấu trúc/hành vi).</w:t>
+        <w:t>(UML).</w:t>
       </w:r>
     </w:p>
     <w:p>
@@ -4985,7 +4943,7 @@
           <w:color w:val="000000"/>
           <w:sz w:val="24"/>
         </w:rPr>
-        <w:t>: xuất phát từ actor và mục tiêu (use case), không vẽ DFD/BFD.</w:t>
+        <w:t>: xuất phát từ actor và mục tiêu (use case).</w:t>
       </w:r>
     </w:p>
     <w:p>
@@ -11707,7 +11665,7 @@
           <w:color w:val="000000"/>
           <w:sz w:val="24"/>
         </w:rPr>
-        <w:t>Chương 7: CSDL (15 bảng) và giao diện. Cả báo cáo theo</w:t>
+        <w:t>Chương 7: CSDL (15 bảng) và giao diện. Báo cáo theo</w:t>
       </w:r>
     </w:p>
     <w:p>
@@ -11791,7 +11749,7 @@
           <w:color w:val="000000"/>
           <w:sz w:val="24"/>
         </w:rPr>
-        <w:t>$ CSDL/UI (không dùng DFD/BFD).</w:t>
+        <w:t>$ CSDL/UI.</w:t>
       </w:r>
     </w:p>
     <w:sectPr>

</xml_diff>

<commit_message>
Bổ sung sơ đồ Activity/Sequence/Class cho UC01 và UC03 - thêm activity diagram cho UC03/UC06/UC07 (hình 4.1-4.3), sequence diagram UC01 đăng nhập (hình 5.1), class diagram UC03 thêm tài khoản (hình 6.4), sơ đồ điều hướng màn hình (hình 7.3), cập nhật mục lục chương 4-7 (tăng từ 23 lên 30 hình), rút gọn mô tả activity/sequence từ dạng liệt kê thành câu ngắn gọn, đổi tên mục 4.6 từ "Kiểm kê (bổ sung)" thành "bổ sung ngh
</commit_message>
<xml_diff>
--- a/VIII.HUST/Phân tích và thiết kế hệ thống/BaoCao/BaoCao_QuanLyKhoHang.docx
+++ b/VIII.HUST/Phân tích và thiết kế hệ thống/BaoCao/BaoCao_QuanLyKhoHang.docx
@@ -1507,7 +1507,7 @@
           <w:color w:val="000000"/>
           <w:sz w:val="24"/>
         </w:rPr>
-        <w:t>4.6  Kiểm kê (bổ sung)</w:t>
+        <w:t>4.6  Kiểm kê (bổ sung nghiệp vụ)</w:t>
       </w:r>
       <w:r>
         <w:rPr>
@@ -1585,7 +1585,7 @@
           <w:color w:val="000000"/>
           <w:sz w:val="24"/>
         </w:rPr>
-        <w:t>5.1  UC06 -- Thêm hàng hóa</w:t>
+        <w:t>5.1  UC01 -- Đăng nhập</w:t>
       </w:r>
       <w:r>
         <w:rPr>
@@ -1611,7 +1611,7 @@
           <w:color w:val="000000"/>
           <w:sz w:val="24"/>
         </w:rPr>
-        <w:t>5.2  UC07 -- Tìm kiếm hàng hóa</w:t>
+        <w:t>5.2  UC06 -- Thêm hàng hóa</w:t>
       </w:r>
       <w:r>
         <w:rPr>
@@ -1637,7 +1637,7 @@
           <w:color w:val="000000"/>
           <w:sz w:val="24"/>
         </w:rPr>
-        <w:t>5.3  UC09 -- Lập phiếu nhập kho</w:t>
+        <w:t>5.3  UC07 -- Tìm kiếm hàng hóa</w:t>
       </w:r>
       <w:r>
         <w:rPr>
@@ -1663,7 +1663,7 @@
           <w:color w:val="000000"/>
           <w:sz w:val="24"/>
         </w:rPr>
-        <w:t>5.4  UC10 -- Lập phiếu xuất kho</w:t>
+        <w:t>5.4  UC09 -- Lập phiếu nhập kho</w:t>
       </w:r>
       <w:r>
         <w:rPr>
@@ -1689,7 +1689,7 @@
           <w:color w:val="000000"/>
           <w:sz w:val="24"/>
         </w:rPr>
-        <w:t>5.5  State machine phiếu</w:t>
+        <w:t>5.5  UC10 -- Lập phiếu xuất kho</w:t>
       </w:r>
       <w:r>
         <w:rPr>
@@ -1715,7 +1715,33 @@
           <w:color w:val="000000"/>
           <w:sz w:val="24"/>
         </w:rPr>
-        <w:t>5.6  Kết luận</w:t>
+        <w:t>5.6  State machine phiếu</w:t>
+      </w:r>
+      <w:r>
+        <w:rPr>
+          <w:rFonts w:ascii="Times New Roman" w:hAnsi="Times New Roman" w:eastAsia="Times New Roman"/>
+          <w:color w:val="000000"/>
+          <w:sz w:val="24"/>
+        </w:rPr>
+        <w:tab/>
+      </w:r>
+    </w:p>
+    <w:p>
+      <w:pPr>
+        <w:tabs>
+          <w:tab w:pos="8787" w:val="right" w:leader="dot"/>
+        </w:tabs>
+        <w:spacing w:after="40" w:before="20" w:line="276" w:lineRule="auto"/>
+        <w:ind w:firstLine="0" w:left="283"/>
+      </w:pPr>
+      <w:r>
+        <w:rPr>
+          <w:rFonts w:ascii="Times New Roman" w:hAnsi="Times New Roman" w:eastAsia="Times New Roman"/>
+          <w:b w:val="0"/>
+          <w:color w:val="000000"/>
+          <w:sz w:val="24"/>
+        </w:rPr>
+        <w:t>5.7  Kết luận</w:t>
       </w:r>
       <w:r>
         <w:rPr>
@@ -1845,7 +1871,7 @@
           <w:color w:val="000000"/>
           <w:sz w:val="24"/>
         </w:rPr>
-        <w:t>6.3.1  UC06 -- Thêm hàng hóa</w:t>
+        <w:t>6.3.1  UC03 -- Thêm tài khoản</w:t>
       </w:r>
       <w:r>
         <w:rPr>
@@ -1871,7 +1897,7 @@
           <w:color w:val="000000"/>
           <w:sz w:val="24"/>
         </w:rPr>
-        <w:t>6.3.2  UC09 -- Lập phiếu nhập</w:t>
+        <w:t>6.3.2  UC06 -- Thêm hàng hóa</w:t>
       </w:r>
       <w:r>
         <w:rPr>
@@ -1897,7 +1923,33 @@
           <w:color w:val="000000"/>
           <w:sz w:val="24"/>
         </w:rPr>
-        <w:t>6.3.3  UC10 -- Lập phiếu xuất</w:t>
+        <w:t>6.3.3  UC09 -- Lập phiếu nhập</w:t>
+      </w:r>
+      <w:r>
+        <w:rPr>
+          <w:rFonts w:ascii="Times New Roman" w:hAnsi="Times New Roman" w:eastAsia="Times New Roman"/>
+          <w:color w:val="000000"/>
+          <w:sz w:val="24"/>
+        </w:rPr>
+        <w:tab/>
+      </w:r>
+    </w:p>
+    <w:p>
+      <w:pPr>
+        <w:tabs>
+          <w:tab w:pos="8787" w:val="right" w:leader="dot"/>
+        </w:tabs>
+        <w:spacing w:after="40" w:before="20" w:line="276" w:lineRule="auto"/>
+        <w:ind w:firstLine="0" w:left="567"/>
+      </w:pPr>
+      <w:r>
+        <w:rPr>
+          <w:rFonts w:ascii="Times New Roman" w:hAnsi="Times New Roman" w:eastAsia="Times New Roman"/>
+          <w:b w:val="0"/>
+          <w:color w:val="000000"/>
+          <w:sz w:val="24"/>
+        </w:rPr>
+        <w:t>6.3.4  UC10 -- Lập phiếu xuất</w:t>
       </w:r>
       <w:r>
         <w:rPr>
@@ -2200,7 +2252,7 @@
           <w:tab w:pos="8787" w:val="right" w:leader="dot"/>
         </w:tabs>
         <w:spacing w:after="40" w:before="20" w:line="276" w:lineRule="auto"/>
-        <w:ind w:firstLine="0" w:left="283"/>
+        <w:ind w:firstLine="0" w:left="567"/>
       </w:pPr>
       <w:r>
         <w:rPr>
@@ -2209,7 +2261,7 @@
           <w:color w:val="000000"/>
           <w:sz w:val="24"/>
         </w:rPr>
-        <w:t>7.4  Kết luận chương</w:t>
+        <w:t>7.3.1  Sơ đồ điều hướng màn hình</w:t>
       </w:r>
       <w:r>
         <w:rPr>
@@ -2218,25 +2270,6 @@
           <w:sz w:val="24"/>
         </w:rPr>
         <w:tab/>
-      </w:r>
-    </w:p>
-    <w:p>
-      <w:r>
-        <w:br w:type="page"/>
-      </w:r>
-    </w:p>
-    <w:p>
-      <w:pPr>
-        <w:pStyle w:val="Heading1"/>
-      </w:pPr>
-      <w:r>
-        <w:rPr>
-          <w:rFonts w:ascii="Times New Roman" w:hAnsi="Times New Roman" w:eastAsia="Times New Roman"/>
-          <w:b/>
-          <w:color w:val="000000"/>
-          <w:sz w:val="28"/>
-        </w:rPr>
-        <w:t>Danh sách hình vẽ</w:t>
       </w:r>
     </w:p>
     <w:p>
@@ -2254,7 +2287,7 @@
           <w:color w:val="000000"/>
           <w:sz w:val="24"/>
         </w:rPr>
-        <w:t>3.1  Sơ đồ use case tổng quát (nhóm chức năng -- chưa phải UC chi tiết)</w:t>
+        <w:t>7.4  Kết luận chương</w:t>
       </w:r>
       <w:r>
         <w:rPr>
@@ -2263,6 +2296,25 @@
           <w:sz w:val="24"/>
         </w:rPr>
         <w:tab/>
+      </w:r>
+    </w:p>
+    <w:p>
+      <w:r>
+        <w:br w:type="page"/>
+      </w:r>
+    </w:p>
+    <w:p>
+      <w:pPr>
+        <w:pStyle w:val="Heading1"/>
+      </w:pPr>
+      <w:r>
+        <w:rPr>
+          <w:rFonts w:ascii="Times New Roman" w:hAnsi="Times New Roman" w:eastAsia="Times New Roman"/>
+          <w:b/>
+          <w:color w:val="000000"/>
+          <w:sz w:val="28"/>
+        </w:rPr>
+        <w:t>Danh sách hình vẽ</w:t>
       </w:r>
     </w:p>
     <w:p>
@@ -2280,7 +2332,7 @@
           <w:color w:val="000000"/>
           <w:sz w:val="24"/>
         </w:rPr>
-        <w:t>3.2  Use case phân rã -- Xác thực và thêm tài khoản</w:t>
+        <w:t>3.1  Sơ đồ use case tổng quát (nhóm chức năng -- chưa phải UC chi tiết)</w:t>
       </w:r>
       <w:r>
         <w:rPr>
@@ -2306,7 +2358,7 @@
           <w:color w:val="000000"/>
           <w:sz w:val="24"/>
         </w:rPr>
-        <w:t>3.3  Use case phân rã -- Thêm NCC, Thêm khách hàng</w:t>
+        <w:t>3.2  Use case phân rã -- Xác thực và thêm tài khoản</w:t>
       </w:r>
       <w:r>
         <w:rPr>
@@ -2332,7 +2384,7 @@
           <w:color w:val="000000"/>
           <w:sz w:val="24"/>
         </w:rPr>
-        <w:t>3.4  Use case phân rã -- Hàng hóa và kho</w:t>
+        <w:t>3.3  Use case phân rã -- Thêm NCC, Thêm khách hàng</w:t>
       </w:r>
       <w:r>
         <w:rPr>
@@ -2358,7 +2410,7 @@
           <w:color w:val="000000"/>
           <w:sz w:val="24"/>
         </w:rPr>
-        <w:t>3.5  Use case phân rã -- Lập phiếu nhập / xuất</w:t>
+        <w:t>3.4  Use case phân rã -- Hàng hóa và kho</w:t>
       </w:r>
       <w:r>
         <w:rPr>
@@ -2384,7 +2436,7 @@
           <w:color w:val="000000"/>
           <w:sz w:val="24"/>
         </w:rPr>
-        <w:t>4.1  Sơ đồ hoạt động quy trình nhập kho</w:t>
+        <w:t>3.5  Use case phân rã -- Lập phiếu nhập / xuất</w:t>
       </w:r>
       <w:r>
         <w:rPr>
@@ -2410,7 +2462,7 @@
           <w:color w:val="000000"/>
           <w:sz w:val="24"/>
         </w:rPr>
-        <w:t>4.2  Sơ đồ hoạt động quy trình xuất kho</w:t>
+        <w:t>4.1  Activity -- UC03 Thêm tài khoản</w:t>
       </w:r>
       <w:r>
         <w:rPr>
@@ -2436,7 +2488,7 @@
           <w:color w:val="000000"/>
           <w:sz w:val="24"/>
         </w:rPr>
-        <w:t>4.3  Sơ đồ hoạt động quy trình kiểm kê tồn kho</w:t>
+        <w:t>4.2  Activity -- UC06 Thêm hàng hóa</w:t>
       </w:r>
       <w:r>
         <w:rPr>
@@ -2462,7 +2514,7 @@
           <w:color w:val="000000"/>
           <w:sz w:val="24"/>
         </w:rPr>
-        <w:t>5.1  Sequence diagram UC06 -- Thêm hàng hóa</w:t>
+        <w:t>4.3  Activity -- UC07 Tìm kiếm hàng hóa</w:t>
       </w:r>
       <w:r>
         <w:rPr>
@@ -2488,7 +2540,7 @@
           <w:color w:val="000000"/>
           <w:sz w:val="24"/>
         </w:rPr>
-        <w:t>5.2  Sequence diagram UC07 -- Tìm kiếm hàng hóa</w:t>
+        <w:t>4.4  Activity -- UC09 Lập phiếu nhập kho</w:t>
       </w:r>
       <w:r>
         <w:rPr>
@@ -2514,7 +2566,7 @@
           <w:color w:val="000000"/>
           <w:sz w:val="24"/>
         </w:rPr>
-        <w:t>5.3  Sequence diagram UC09 -- Lập phiếu nhập kho</w:t>
+        <w:t>4.5  Activity -- UC10 Lập phiếu xuất kho</w:t>
       </w:r>
       <w:r>
         <w:rPr>
@@ -2540,7 +2592,7 @@
           <w:color w:val="000000"/>
           <w:sz w:val="24"/>
         </w:rPr>
-        <w:t>5.4  Sequence diagram UC10 -- Lập phiếu xuất kho</w:t>
+        <w:t>4.6  Sơ đồ hoạt động quy trình kiểm kê tồn kho</w:t>
       </w:r>
       <w:r>
         <w:rPr>
@@ -2566,7 +2618,7 @@
           <w:color w:val="000000"/>
           <w:sz w:val="24"/>
         </w:rPr>
-        <w:t>5.5  State Machine Diagram – Trạng thái phiếu nhập kho</w:t>
+        <w:t>5.1  Sequence diagram UC01 -- Đăng nhập</w:t>
       </w:r>
       <w:r>
         <w:rPr>
@@ -2592,7 +2644,7 @@
           <w:color w:val="000000"/>
           <w:sz w:val="24"/>
         </w:rPr>
-        <w:t>5.6  State Machine Diagram – Trạng thái phiếu xuất kho</w:t>
+        <w:t>5.2  Sequence diagram UC06 -- Thêm hàng hóa</w:t>
       </w:r>
       <w:r>
         <w:rPr>
@@ -2618,7 +2670,7 @@
           <w:color w:val="000000"/>
           <w:sz w:val="24"/>
         </w:rPr>
-        <w:t>6.1  Sơ đồ lớp danh mục (Master Data)</w:t>
+        <w:t>5.3  Sequence diagram UC07 -- Tìm kiếm hàng hóa</w:t>
       </w:r>
       <w:r>
         <w:rPr>
@@ -2644,7 +2696,7 @@
           <w:color w:val="000000"/>
           <w:sz w:val="24"/>
         </w:rPr>
-        <w:t>6.2  Sơ đồ lớp nghiệp vụ nhập xuất kho</w:t>
+        <w:t>5.4  Sequence diagram UC09 -- Lập phiếu nhập kho</w:t>
       </w:r>
       <w:r>
         <w:rPr>
@@ -2670,7 +2722,7 @@
           <w:color w:val="000000"/>
           <w:sz w:val="24"/>
         </w:rPr>
-        <w:t>6.3  Sơ đồ lớp kiểm kê và lịch sử thao tác</w:t>
+        <w:t>5.5  Sequence diagram UC10 -- Lập phiếu xuất kho</w:t>
       </w:r>
       <w:r>
         <w:rPr>
@@ -2696,7 +2748,7 @@
           <w:color w:val="000000"/>
           <w:sz w:val="24"/>
         </w:rPr>
-        <w:t>6.4  Biểu đồ lớp trong ca sử dụng UC06 -- Thêm hàng hóa</w:t>
+        <w:t>5.6  State Machine Diagram – Trạng thái phiếu nhập kho</w:t>
       </w:r>
       <w:r>
         <w:rPr>
@@ -2722,7 +2774,7 @@
           <w:color w:val="000000"/>
           <w:sz w:val="24"/>
         </w:rPr>
-        <w:t>6.5  Biểu đồ lớp trong ca sử dụng UC09 -- Lập phiếu nhập kho</w:t>
+        <w:t>5.7  State Machine Diagram – Trạng thái phiếu xuất kho</w:t>
       </w:r>
       <w:r>
         <w:rPr>
@@ -2748,7 +2800,7 @@
           <w:color w:val="000000"/>
           <w:sz w:val="24"/>
         </w:rPr>
-        <w:t>6.6  Biểu đồ lớp trong ca sử dụng UC10 -- Lập phiếu xuất kho</w:t>
+        <w:t>6.1  Sơ đồ lớp danh mục (Master Data)</w:t>
       </w:r>
       <w:r>
         <w:rPr>
@@ -2774,7 +2826,7 @@
           <w:color w:val="000000"/>
           <w:sz w:val="24"/>
         </w:rPr>
-        <w:t>6.7  Component Diagram – Kiến trúc thành phần hệ thống quản lý kho hàng</w:t>
+        <w:t>6.2  Sơ đồ lớp nghiệp vụ nhập xuất kho</w:t>
       </w:r>
       <w:r>
         <w:rPr>
@@ -2800,7 +2852,7 @@
           <w:color w:val="000000"/>
           <w:sz w:val="24"/>
         </w:rPr>
-        <w:t>7.1  Sơ đồ ERD -- Danh mục (Master Data)</w:t>
+        <w:t>6.3  Sơ đồ lớp kiểm kê và lịch sử thao tác</w:t>
       </w:r>
       <w:r>
         <w:rPr>
@@ -2826,7 +2878,189 @@
           <w:color w:val="000000"/>
           <w:sz w:val="24"/>
         </w:rPr>
+        <w:t>6.4  Class trong UC03 -- Thêm tài khoản</w:t>
+      </w:r>
+      <w:r>
+        <w:rPr>
+          <w:rFonts w:ascii="Times New Roman" w:hAnsi="Times New Roman" w:eastAsia="Times New Roman"/>
+          <w:color w:val="000000"/>
+          <w:sz w:val="24"/>
+        </w:rPr>
+        <w:tab/>
+      </w:r>
+    </w:p>
+    <w:p>
+      <w:pPr>
+        <w:tabs>
+          <w:tab w:pos="8787" w:val="right" w:leader="dot"/>
+        </w:tabs>
+        <w:spacing w:after="40" w:before="20" w:line="276" w:lineRule="auto"/>
+        <w:ind w:firstLine="0" w:left="283"/>
+      </w:pPr>
+      <w:r>
+        <w:rPr>
+          <w:rFonts w:ascii="Times New Roman" w:hAnsi="Times New Roman" w:eastAsia="Times New Roman"/>
+          <w:b w:val="0"/>
+          <w:color w:val="000000"/>
+          <w:sz w:val="24"/>
+        </w:rPr>
+        <w:t>6.5  Biểu đồ lớp trong ca sử dụng UC06 -- Thêm hàng hóa</w:t>
+      </w:r>
+      <w:r>
+        <w:rPr>
+          <w:rFonts w:ascii="Times New Roman" w:hAnsi="Times New Roman" w:eastAsia="Times New Roman"/>
+          <w:color w:val="000000"/>
+          <w:sz w:val="24"/>
+        </w:rPr>
+        <w:tab/>
+      </w:r>
+    </w:p>
+    <w:p>
+      <w:pPr>
+        <w:tabs>
+          <w:tab w:pos="8787" w:val="right" w:leader="dot"/>
+        </w:tabs>
+        <w:spacing w:after="40" w:before="20" w:line="276" w:lineRule="auto"/>
+        <w:ind w:firstLine="0" w:left="283"/>
+      </w:pPr>
+      <w:r>
+        <w:rPr>
+          <w:rFonts w:ascii="Times New Roman" w:hAnsi="Times New Roman" w:eastAsia="Times New Roman"/>
+          <w:b w:val="0"/>
+          <w:color w:val="000000"/>
+          <w:sz w:val="24"/>
+        </w:rPr>
+        <w:t>6.6  Biểu đồ lớp trong ca sử dụng UC09 -- Lập phiếu nhập kho</w:t>
+      </w:r>
+      <w:r>
+        <w:rPr>
+          <w:rFonts w:ascii="Times New Roman" w:hAnsi="Times New Roman" w:eastAsia="Times New Roman"/>
+          <w:color w:val="000000"/>
+          <w:sz w:val="24"/>
+        </w:rPr>
+        <w:tab/>
+      </w:r>
+    </w:p>
+    <w:p>
+      <w:pPr>
+        <w:tabs>
+          <w:tab w:pos="8787" w:val="right" w:leader="dot"/>
+        </w:tabs>
+        <w:spacing w:after="40" w:before="20" w:line="276" w:lineRule="auto"/>
+        <w:ind w:firstLine="0" w:left="283"/>
+      </w:pPr>
+      <w:r>
+        <w:rPr>
+          <w:rFonts w:ascii="Times New Roman" w:hAnsi="Times New Roman" w:eastAsia="Times New Roman"/>
+          <w:b w:val="0"/>
+          <w:color w:val="000000"/>
+          <w:sz w:val="24"/>
+        </w:rPr>
+        <w:t>6.7  Biểu đồ lớp trong ca sử dụng UC10 -- Lập phiếu xuất kho</w:t>
+      </w:r>
+      <w:r>
+        <w:rPr>
+          <w:rFonts w:ascii="Times New Roman" w:hAnsi="Times New Roman" w:eastAsia="Times New Roman"/>
+          <w:color w:val="000000"/>
+          <w:sz w:val="24"/>
+        </w:rPr>
+        <w:tab/>
+      </w:r>
+    </w:p>
+    <w:p>
+      <w:pPr>
+        <w:tabs>
+          <w:tab w:pos="8787" w:val="right" w:leader="dot"/>
+        </w:tabs>
+        <w:spacing w:after="40" w:before="20" w:line="276" w:lineRule="auto"/>
+        <w:ind w:firstLine="0" w:left="283"/>
+      </w:pPr>
+      <w:r>
+        <w:rPr>
+          <w:rFonts w:ascii="Times New Roman" w:hAnsi="Times New Roman" w:eastAsia="Times New Roman"/>
+          <w:b w:val="0"/>
+          <w:color w:val="000000"/>
+          <w:sz w:val="24"/>
+        </w:rPr>
+        <w:t>6.8  Component Diagram – Kiến trúc thành phần hệ thống quản lý kho hàng</w:t>
+      </w:r>
+      <w:r>
+        <w:rPr>
+          <w:rFonts w:ascii="Times New Roman" w:hAnsi="Times New Roman" w:eastAsia="Times New Roman"/>
+          <w:color w:val="000000"/>
+          <w:sz w:val="24"/>
+        </w:rPr>
+        <w:tab/>
+      </w:r>
+    </w:p>
+    <w:p>
+      <w:pPr>
+        <w:tabs>
+          <w:tab w:pos="8787" w:val="right" w:leader="dot"/>
+        </w:tabs>
+        <w:spacing w:after="40" w:before="20" w:line="276" w:lineRule="auto"/>
+        <w:ind w:firstLine="0" w:left="283"/>
+      </w:pPr>
+      <w:r>
+        <w:rPr>
+          <w:rFonts w:ascii="Times New Roman" w:hAnsi="Times New Roman" w:eastAsia="Times New Roman"/>
+          <w:b w:val="0"/>
+          <w:color w:val="000000"/>
+          <w:sz w:val="24"/>
+        </w:rPr>
+        <w:t>7.1  Sơ đồ ERD -- Danh mục (Master Data)</w:t>
+      </w:r>
+      <w:r>
+        <w:rPr>
+          <w:rFonts w:ascii="Times New Roman" w:hAnsi="Times New Roman" w:eastAsia="Times New Roman"/>
+          <w:color w:val="000000"/>
+          <w:sz w:val="24"/>
+        </w:rPr>
+        <w:tab/>
+      </w:r>
+    </w:p>
+    <w:p>
+      <w:pPr>
+        <w:tabs>
+          <w:tab w:pos="8787" w:val="right" w:leader="dot"/>
+        </w:tabs>
+        <w:spacing w:after="40" w:before="20" w:line="276" w:lineRule="auto"/>
+        <w:ind w:firstLine="0" w:left="283"/>
+      </w:pPr>
+      <w:r>
+        <w:rPr>
+          <w:rFonts w:ascii="Times New Roman" w:hAnsi="Times New Roman" w:eastAsia="Times New Roman"/>
+          <w:b w:val="0"/>
+          <w:color w:val="000000"/>
+          <w:sz w:val="24"/>
+        </w:rPr>
         <w:t>7.2  Sơ đồ ERD -- Nghiệp vụ (Transaction)</w:t>
+      </w:r>
+      <w:r>
+        <w:rPr>
+          <w:rFonts w:ascii="Times New Roman" w:hAnsi="Times New Roman" w:eastAsia="Times New Roman"/>
+          <w:color w:val="000000"/>
+          <w:sz w:val="24"/>
+        </w:rPr>
+        <w:tab/>
+      </w:r>
+    </w:p>
+    <w:p>
+      <w:pPr>
+        <w:tabs>
+          <w:tab w:pos="8787" w:val="right" w:leader="dot"/>
+        </w:tabs>
+        <w:spacing w:after="40" w:before="20" w:line="276" w:lineRule="auto"/>
+        <w:ind w:firstLine="0" w:left="283"/>
+      </w:pPr>
+      <w:r>
+        <w:rPr>
+          <w:rFonts w:ascii="Times New Roman" w:hAnsi="Times New Roman" w:eastAsia="Times New Roman"/>
+          <w:b w:val="0"/>
+          <w:color w:val="000000"/>
+          <w:sz w:val="24"/>
+        </w:rPr>
+        <w:t>7.3  Sơ đồ điều hướng màn hình chính (theo use case)</w:t>
       </w:r>
       <w:r>
         <w:rPr>
@@ -6660,21 +6894,7 @@
           <w:color w:val="000000"/>
           <w:sz w:val="24"/>
         </w:rPr>
-        <w:t>Activity mô tả các bước để đạt mục tiêu của use case (sau đặc tả UC).</w:t>
-      </w:r>
-    </w:p>
-    <w:p>
-      <w:pPr>
-        <w:pStyle w:val="Heading2"/>
-      </w:pPr>
-      <w:r>
-        <w:rPr>
-          <w:rFonts w:ascii="Times New Roman" w:hAnsi="Times New Roman" w:eastAsia="Times New Roman"/>
-          <w:b/>
-          <w:color w:val="000000"/>
-          <w:sz w:val="26"/>
-        </w:rPr>
-        <w:t>4.1 UC03 -- Thêm tài khoản</w:t>
+        <w:t>Sau đặc tả use case,</w:t>
       </w:r>
     </w:p>
     <w:p>
@@ -6688,49 +6908,7 @@
           <w:color w:val="000000"/>
           <w:sz w:val="24"/>
         </w:rPr>
-        <w:t>Mở form $</w:t>
-      </w:r>
-    </w:p>
-    <w:p>
-      <w:pPr>
-        <w:spacing w:line="276" w:lineRule="auto" w:after="120"/>
-        <w:ind w:firstLine="567"/>
-      </w:pPr>
-      <w:r>
-        <w:rPr>
-          <w:rFonts w:ascii="Times New Roman" w:hAnsi="Times New Roman" w:eastAsia="Times New Roman"/>
-          <w:color w:val="000000"/>
-          <w:sz w:val="24"/>
-        </w:rPr>
-        <w:t>nhập TT</w:t>
-      </w:r>
-    </w:p>
-    <w:p>
-      <w:pPr>
-        <w:spacing w:line="276" w:lineRule="auto" w:after="120"/>
-        <w:ind w:firstLine="567"/>
-      </w:pPr>
-      <w:r>
-        <w:rPr>
-          <w:rFonts w:ascii="Times New Roman" w:hAnsi="Times New Roman" w:eastAsia="Times New Roman"/>
-          <w:color w:val="000000"/>
-          <w:sz w:val="24"/>
-        </w:rPr>
-        <w:t>kiểm tra tên ĐN</w:t>
-      </w:r>
-    </w:p>
-    <w:p>
-      <w:pPr>
-        <w:spacing w:line="276" w:lineRule="auto" w:after="120"/>
-        <w:ind w:firstLine="567"/>
-      </w:pPr>
-      <w:r>
-        <w:rPr>
-          <w:rFonts w:ascii="Times New Roman" w:hAnsi="Times New Roman" w:eastAsia="Times New Roman"/>
-          <w:color w:val="000000"/>
-          <w:sz w:val="24"/>
-        </w:rPr>
-        <w:t>$ lưu / báo lỗi.</w:t>
+        <w:t>mô tả các bước actor đạt mục tiêu.</w:t>
       </w:r>
     </w:p>
     <w:p>
@@ -6744,133 +6922,7 @@
           <w:color w:val="000000"/>
           <w:sz w:val="26"/>
         </w:rPr>
-        <w:t>4.2 UC06 -- Thêm hàng hóa</w:t>
-      </w:r>
-    </w:p>
-    <w:p>
-      <w:pPr>
-        <w:spacing w:line="276" w:lineRule="auto" w:after="120"/>
-        <w:ind w:firstLine="567"/>
-      </w:pPr>
-      <w:r>
-        <w:rPr>
-          <w:rFonts w:ascii="Times New Roman" w:hAnsi="Times New Roman" w:eastAsia="Times New Roman"/>
-          <w:color w:val="000000"/>
-          <w:sz w:val="24"/>
-        </w:rPr>
-        <w:t>Mở form $</w:t>
-      </w:r>
-    </w:p>
-    <w:p>
-      <w:pPr>
-        <w:spacing w:line="276" w:lineRule="auto" w:after="120"/>
-        <w:ind w:firstLine="567"/>
-      </w:pPr>
-      <w:r>
-        <w:rPr>
-          <w:rFonts w:ascii="Times New Roman" w:hAnsi="Times New Roman" w:eastAsia="Times New Roman"/>
-          <w:color w:val="000000"/>
-          <w:sz w:val="24"/>
-        </w:rPr>
-        <w:t>nhập mã, tên, nhóm, ĐVT, giá</w:t>
-      </w:r>
-    </w:p>
-    <w:p>
-      <w:pPr>
-        <w:spacing w:line="276" w:lineRule="auto" w:after="120"/>
-        <w:ind w:firstLine="567"/>
-      </w:pPr>
-      <w:r>
-        <w:rPr>
-          <w:rFonts w:ascii="Times New Roman" w:hAnsi="Times New Roman" w:eastAsia="Times New Roman"/>
-          <w:color w:val="000000"/>
-          <w:sz w:val="24"/>
-        </w:rPr>
-        <w:t>kiểm tra mã</w:t>
-      </w:r>
-    </w:p>
-    <w:p>
-      <w:pPr>
-        <w:spacing w:line="276" w:lineRule="auto" w:after="120"/>
-        <w:ind w:firstLine="567"/>
-      </w:pPr>
-      <w:r>
-        <w:rPr>
-          <w:rFonts w:ascii="Times New Roman" w:hAnsi="Times New Roman" w:eastAsia="Times New Roman"/>
-          <w:color w:val="000000"/>
-          <w:sz w:val="24"/>
-        </w:rPr>
-        <w:t>$ lưu + tồn = 0.</w:t>
-      </w:r>
-    </w:p>
-    <w:p>
-      <w:pPr>
-        <w:pStyle w:val="Heading2"/>
-      </w:pPr>
-      <w:r>
-        <w:rPr>
-          <w:rFonts w:ascii="Times New Roman" w:hAnsi="Times New Roman" w:eastAsia="Times New Roman"/>
-          <w:b/>
-          <w:color w:val="000000"/>
-          <w:sz w:val="26"/>
-        </w:rPr>
-        <w:t>4.3 UC07 -- Tìm kiếm hàng hóa</w:t>
-      </w:r>
-    </w:p>
-    <w:p>
-      <w:pPr>
-        <w:spacing w:line="276" w:lineRule="auto" w:after="120"/>
-        <w:ind w:firstLine="567"/>
-      </w:pPr>
-      <w:r>
-        <w:rPr>
-          <w:rFonts w:ascii="Times New Roman" w:hAnsi="Times New Roman" w:eastAsia="Times New Roman"/>
-          <w:color w:val="000000"/>
-          <w:sz w:val="24"/>
-        </w:rPr>
-        <w:t>Nhập từ khóa/lọc $</w:t>
-      </w:r>
-    </w:p>
-    <w:p>
-      <w:pPr>
-        <w:spacing w:line="276" w:lineRule="auto" w:after="120"/>
-        <w:ind w:firstLine="567"/>
-      </w:pPr>
-      <w:r>
-        <w:rPr>
-          <w:rFonts w:ascii="Times New Roman" w:hAnsi="Times New Roman" w:eastAsia="Times New Roman"/>
-          <w:color w:val="000000"/>
-          <w:sz w:val="24"/>
-        </w:rPr>
-        <w:t>truy vấn</w:t>
-      </w:r>
-    </w:p>
-    <w:p>
-      <w:pPr>
-        <w:spacing w:line="276" w:lineRule="auto" w:after="120"/>
-        <w:ind w:firstLine="567"/>
-      </w:pPr>
-      <w:r>
-        <w:rPr>
-          <w:rFonts w:ascii="Times New Roman" w:hAnsi="Times New Roman" w:eastAsia="Times New Roman"/>
-          <w:color w:val="000000"/>
-          <w:sz w:val="24"/>
-        </w:rPr>
-        <w:t>$ hiện danh sách kèm tồn.</w:t>
-      </w:r>
-    </w:p>
-    <w:p>
-      <w:pPr>
-        <w:pStyle w:val="Heading2"/>
-      </w:pPr>
-      <w:r>
-        <w:rPr>
-          <w:rFonts w:ascii="Times New Roman" w:hAnsi="Times New Roman" w:eastAsia="Times New Roman"/>
-          <w:b/>
-          <w:color w:val="000000"/>
-          <w:sz w:val="26"/>
-        </w:rPr>
-        <w:t>4.4 UC09 -- Lập phiếu nhập kho</w:t>
+        <w:t>4.1 UC03 -- Thêm tài khoản</w:t>
       </w:r>
     </w:p>
     <w:p>
@@ -6882,7 +6934,7 @@
       <w:r>
         <w:drawing>
           <wp:inline xmlns:a="http://schemas.openxmlformats.org/drawingml/2006/main" xmlns:pic="http://schemas.openxmlformats.org/drawingml/2006/picture">
-            <wp:extent cx="5580000" cy="7221176"/>
+            <wp:extent cx="5580000" cy="5824677"/>
             <wp:docPr id="6" name="Picture 6"/>
             <wp:cNvGraphicFramePr>
               <a:graphicFrameLocks noChangeAspect="1"/>
@@ -6891,7 +6943,7 @@
               <a:graphicData uri="http://schemas.openxmlformats.org/drawingml/2006/picture">
                 <pic:pic>
                   <pic:nvPicPr>
-                    <pic:cNvPr id="0" name="2.1_activity_nhapkho.png"/>
+                    <pic:cNvPr id="0" name="4.7_activity_uc03.png"/>
                     <pic:cNvPicPr/>
                   </pic:nvPicPr>
                   <pic:blipFill>
@@ -6903,7 +6955,7 @@
                   <pic:spPr>
                     <a:xfrm>
                       <a:off x="0" y="0"/>
-                      <a:ext cx="5580000" cy="7221176"/>
+                      <a:ext cx="5580000" cy="5824677"/>
                     </a:xfrm>
                     <a:prstGeom prst="rect"/>
                   </pic:spPr>
@@ -6927,7 +6979,7 @@
           <w:color w:val="000000"/>
           <w:sz w:val="22"/>
         </w:rPr>
-        <w:t>Hình 4.1: Sơ đồ hoạt động quy trình nhập kho</w:t>
+        <w:t>Hình 4.1: Activity -- UC03 Thêm tài khoản</w:t>
       </w:r>
     </w:p>
     <w:p>
@@ -6941,7 +6993,7 @@
           <w:color w:val="000000"/>
           <w:sz w:val="26"/>
         </w:rPr>
-        <w:t>4.5 UC10 -- Lập phiếu xuất kho</w:t>
+        <w:t>4.2 UC06 -- Thêm hàng hóa</w:t>
       </w:r>
     </w:p>
     <w:p>
@@ -6953,7 +7005,7 @@
       <w:r>
         <w:drawing>
           <wp:inline xmlns:a="http://schemas.openxmlformats.org/drawingml/2006/main" xmlns:pic="http://schemas.openxmlformats.org/drawingml/2006/picture">
-            <wp:extent cx="5580000" cy="7221176"/>
+            <wp:extent cx="5580000" cy="6193261"/>
             <wp:docPr id="7" name="Picture 7"/>
             <wp:cNvGraphicFramePr>
               <a:graphicFrameLocks noChangeAspect="1"/>
@@ -6962,7 +7014,7 @@
               <a:graphicData uri="http://schemas.openxmlformats.org/drawingml/2006/picture">
                 <pic:pic>
                   <pic:nvPicPr>
-                    <pic:cNvPr id="0" name="2.2_activity_xuatkho.png"/>
+                    <pic:cNvPr id="0" name="4.8_activity_uc06.png"/>
                     <pic:cNvPicPr/>
                   </pic:nvPicPr>
                   <pic:blipFill>
@@ -6974,7 +7026,7 @@
                   <pic:spPr>
                     <a:xfrm>
                       <a:off x="0" y="0"/>
-                      <a:ext cx="5580000" cy="7221176"/>
+                      <a:ext cx="5580000" cy="6193261"/>
                     </a:xfrm>
                     <a:prstGeom prst="rect"/>
                   </pic:spPr>
@@ -6998,7 +7050,7 @@
           <w:color w:val="000000"/>
           <w:sz w:val="22"/>
         </w:rPr>
-        <w:t>Hình 4.2: Sơ đồ hoạt động quy trình xuất kho</w:t>
+        <w:t>Hình 4.2: Activity -- UC06 Thêm hàng hóa</w:t>
       </w:r>
     </w:p>
     <w:p>
@@ -7012,7 +7064,7 @@
           <w:color w:val="000000"/>
           <w:sz w:val="26"/>
         </w:rPr>
-        <w:t>4.6 Kiểm kê (bổ sung)</w:t>
+        <w:t>4.3 UC07 -- Tìm kiếm hàng hóa</w:t>
       </w:r>
     </w:p>
     <w:p>
@@ -7024,7 +7076,7 @@
       <w:r>
         <w:drawing>
           <wp:inline xmlns:a="http://schemas.openxmlformats.org/drawingml/2006/main" xmlns:pic="http://schemas.openxmlformats.org/drawingml/2006/picture">
-            <wp:extent cx="5580000" cy="7221176"/>
+            <wp:extent cx="5580000" cy="4875857"/>
             <wp:docPr id="8" name="Picture 8"/>
             <wp:cNvGraphicFramePr>
               <a:graphicFrameLocks noChangeAspect="1"/>
@@ -7033,7 +7085,7 @@
               <a:graphicData uri="http://schemas.openxmlformats.org/drawingml/2006/picture">
                 <pic:pic>
                   <pic:nvPicPr>
-                    <pic:cNvPr id="0" name="2.3_activity_kiemke.png"/>
+                    <pic:cNvPr id="0" name="4.9_activity_uc07.png"/>
                     <pic:cNvPicPr/>
                   </pic:nvPicPr>
                   <pic:blipFill>
@@ -7045,7 +7097,7 @@
                   <pic:spPr>
                     <a:xfrm>
                       <a:off x="0" y="0"/>
-                      <a:ext cx="5580000" cy="7221176"/>
+                      <a:ext cx="5580000" cy="4875857"/>
                     </a:xfrm>
                     <a:prstGeom prst="rect"/>
                   </pic:spPr>
@@ -7069,7 +7121,7 @@
           <w:color w:val="000000"/>
           <w:sz w:val="22"/>
         </w:rPr>
-        <w:t>Hình 4.3: Sơ đồ hoạt động quy trình kiểm kê tồn kho</w:t>
+        <w:t>Hình 4.3: Activity -- UC07 Tìm kiếm hàng hóa</w:t>
       </w:r>
     </w:p>
     <w:p>
@@ -7083,147 +7135,7 @@
           <w:color w:val="000000"/>
           <w:sz w:val="26"/>
         </w:rPr>
-        <w:t>4.7 Kết luận</w:t>
-      </w:r>
-    </w:p>
-    <w:p>
-      <w:pPr>
-        <w:spacing w:line="276" w:lineRule="auto" w:after="120"/>
-        <w:ind w:firstLine="567"/>
-      </w:pPr>
-      <w:r>
-        <w:rPr>
-          <w:rFonts w:ascii="Times New Roman" w:hAnsi="Times New Roman" w:eastAsia="Times New Roman"/>
-          <w:color w:val="000000"/>
-          <w:sz w:val="24"/>
-        </w:rPr>
-        <w:t>Tiếp theo: Sequence (Ch.5), Class (Ch.6).</w:t>
-      </w:r>
-    </w:p>
-    <w:p>
-      <w:pPr>
-        <w:pStyle w:val="Heading1"/>
-      </w:pPr>
-      <w:r>
-        <w:rPr>
-          <w:rFonts w:ascii="Times New Roman" w:hAnsi="Times New Roman" w:eastAsia="Times New Roman"/>
-          <w:b/>
-          <w:color w:val="000000"/>
-          <w:sz w:val="28"/>
-        </w:rPr>
-        <w:t>CHƯƠNG 5: SƠ ĐỒ TRÌNH TỰ (SEQUENCE DIAGRAM)</w:t>
-      </w:r>
-    </w:p>
-    <w:p>
-      <w:pPr>
-        <w:spacing w:line="276" w:lineRule="auto" w:after="120"/>
-        <w:ind w:firstLine="567"/>
-      </w:pPr>
-      <w:r>
-        <w:rPr>
-          <w:rFonts w:ascii="Times New Roman" w:hAnsi="Times New Roman" w:eastAsia="Times New Roman"/>
-          <w:color w:val="000000"/>
-          <w:sz w:val="24"/>
-        </w:rPr>
-        <w:t>Sequence: tương tác đối tượng theo thời gian cho các use case chính.</w:t>
-      </w:r>
-    </w:p>
-    <w:p>
-      <w:pPr>
-        <w:pStyle w:val="Heading2"/>
-      </w:pPr>
-      <w:r>
-        <w:rPr>
-          <w:rFonts w:ascii="Times New Roman" w:hAnsi="Times New Roman" w:eastAsia="Times New Roman"/>
-          <w:b/>
-          <w:color w:val="000000"/>
-          <w:sz w:val="26"/>
-        </w:rPr>
-        <w:t>5.1 UC06 -- Thêm hàng hóa</w:t>
-      </w:r>
-    </w:p>
-    <w:p>
-      <w:pPr>
-        <w:spacing w:line="276" w:lineRule="auto" w:after="120"/>
-        <w:ind w:firstLine="567"/>
-      </w:pPr>
-      <w:r>
-        <w:rPr>
-          <w:rFonts w:ascii="Times New Roman" w:hAnsi="Times New Roman" w:eastAsia="Times New Roman"/>
-          <w:color w:val="000000"/>
-          <w:sz w:val="24"/>
-        </w:rPr>
-        <w:t>NV $</w:t>
-      </w:r>
-    </w:p>
-    <w:p>
-      <w:pPr>
-        <w:spacing w:line="276" w:lineRule="auto" w:after="120"/>
-        <w:ind w:firstLine="567"/>
-      </w:pPr>
-      <w:r>
-        <w:rPr>
-          <w:rFonts w:ascii="Times New Roman" w:hAnsi="Times New Roman" w:eastAsia="Times New Roman"/>
-          <w:color w:val="000000"/>
-          <w:sz w:val="24"/>
-        </w:rPr>
-        <w:t>Giao diện</w:t>
-      </w:r>
-    </w:p>
-    <w:p>
-      <w:pPr>
-        <w:spacing w:line="276" w:lineRule="auto" w:after="120"/>
-        <w:ind w:firstLine="567"/>
-      </w:pPr>
-      <w:r>
-        <w:rPr>
-          <w:rFonts w:ascii="Times New Roman" w:hAnsi="Times New Roman" w:eastAsia="Times New Roman"/>
-          <w:color w:val="000000"/>
-          <w:sz w:val="24"/>
-        </w:rPr>
-        <w:t>HangHoaController</w:t>
-      </w:r>
-    </w:p>
-    <w:p>
-      <w:pPr>
-        <w:spacing w:line="276" w:lineRule="auto" w:after="120"/>
-        <w:ind w:firstLine="567"/>
-      </w:pPr>
-      <w:r>
-        <w:rPr>
-          <w:rFonts w:ascii="Times New Roman" w:hAnsi="Times New Roman" w:eastAsia="Times New Roman"/>
-          <w:color w:val="000000"/>
-          <w:sz w:val="24"/>
-        </w:rPr>
-        <w:t>HangHoaDAO (kiểm tra mã, lưu)</w:t>
-      </w:r>
-    </w:p>
-    <w:p>
-      <w:pPr>
-        <w:spacing w:line="276" w:lineRule="auto" w:after="120"/>
-        <w:ind w:firstLine="567"/>
-      </w:pPr>
-      <w:r>
-        <w:rPr>
-          <w:rFonts w:ascii="Times New Roman" w:hAnsi="Times New Roman" w:eastAsia="Times New Roman"/>
-          <w:color w:val="000000"/>
-          <w:sz w:val="24"/>
-        </w:rPr>
-        <w:t>TonKhoDAO (tồn = 0)</w:t>
-      </w:r>
-    </w:p>
-    <w:p>
-      <w:pPr>
-        <w:spacing w:line="276" w:lineRule="auto" w:after="120"/>
-        <w:ind w:firstLine="567"/>
-      </w:pPr>
-      <w:r>
-        <w:rPr>
-          <w:rFonts w:ascii="Times New Roman" w:hAnsi="Times New Roman" w:eastAsia="Times New Roman"/>
-          <w:color w:val="000000"/>
-          <w:sz w:val="24"/>
-        </w:rPr>
-        <w:t>$ thông báo.</w:t>
+        <w:t>4.4 UC09 -- Lập phiếu nhập kho</w:t>
       </w:r>
     </w:p>
     <w:p>
@@ -7244,7 +7156,7 @@
               <a:graphicData uri="http://schemas.openxmlformats.org/drawingml/2006/picture">
                 <pic:pic>
                   <pic:nvPicPr>
-                    <pic:cNvPr id="0" name="5.1_sequence_uc05.png"/>
+                    <pic:cNvPr id="0" name="2.1_activity_nhapkho.png"/>
                     <pic:cNvPicPr/>
                   </pic:nvPicPr>
                   <pic:blipFill>
@@ -7280,7 +7192,7 @@
           <w:color w:val="000000"/>
           <w:sz w:val="22"/>
         </w:rPr>
-        <w:t>Hình 5.1: Sequence diagram UC06 -- Thêm hàng hóa</w:t>
+        <w:t>Hình 4.4: Activity -- UC09 Lập phiếu nhập kho</w:t>
       </w:r>
     </w:p>
     <w:p>
@@ -7294,63 +7206,7 @@
           <w:color w:val="000000"/>
           <w:sz w:val="26"/>
         </w:rPr>
-        <w:t>5.2 UC07 -- Tìm kiếm hàng hóa</w:t>
-      </w:r>
-    </w:p>
-    <w:p>
-      <w:pPr>
-        <w:spacing w:line="276" w:lineRule="auto" w:after="120"/>
-        <w:ind w:firstLine="567"/>
-      </w:pPr>
-      <w:r>
-        <w:rPr>
-          <w:rFonts w:ascii="Times New Roman" w:hAnsi="Times New Roman" w:eastAsia="Times New Roman"/>
-          <w:color w:val="000000"/>
-          <w:sz w:val="24"/>
-        </w:rPr>
-        <w:t>Nhập điều kiện $</w:t>
-      </w:r>
-    </w:p>
-    <w:p>
-      <w:pPr>
-        <w:spacing w:line="276" w:lineRule="auto" w:after="120"/>
-        <w:ind w:firstLine="567"/>
-      </w:pPr>
-      <w:r>
-        <w:rPr>
-          <w:rFonts w:ascii="Times New Roman" w:hAnsi="Times New Roman" w:eastAsia="Times New Roman"/>
-          <w:color w:val="000000"/>
-          <w:sz w:val="24"/>
-        </w:rPr>
-        <w:t>HangHoaController</w:t>
-      </w:r>
-    </w:p>
-    <w:p>
-      <w:pPr>
-        <w:spacing w:line="276" w:lineRule="auto" w:after="120"/>
-        <w:ind w:firstLine="567"/>
-      </w:pPr>
-      <w:r>
-        <w:rPr>
-          <w:rFonts w:ascii="Times New Roman" w:hAnsi="Times New Roman" w:eastAsia="Times New Roman"/>
-          <w:color w:val="000000"/>
-          <w:sz w:val="24"/>
-        </w:rPr>
-        <w:t>HangHoaDAO + TonKhoDAO</w:t>
-      </w:r>
-    </w:p>
-    <w:p>
-      <w:pPr>
-        <w:spacing w:line="276" w:lineRule="auto" w:after="120"/>
-        <w:ind w:firstLine="567"/>
-      </w:pPr>
-      <w:r>
-        <w:rPr>
-          <w:rFonts w:ascii="Times New Roman" w:hAnsi="Times New Roman" w:eastAsia="Times New Roman"/>
-          <w:color w:val="000000"/>
-          <w:sz w:val="24"/>
-        </w:rPr>
-        <w:t>$ danh sách.</w:t>
+        <w:t>4.5 UC10 -- Lập phiếu xuất kho</w:t>
       </w:r>
     </w:p>
     <w:p>
@@ -7371,7 +7227,7 @@
               <a:graphicData uri="http://schemas.openxmlformats.org/drawingml/2006/picture">
                 <pic:pic>
                   <pic:nvPicPr>
-                    <pic:cNvPr id="0" name="5.2_sequence_uc06.png"/>
+                    <pic:cNvPr id="0" name="2.2_activity_xuatkho.png"/>
                     <pic:cNvPicPr/>
                   </pic:nvPicPr>
                   <pic:blipFill>
@@ -7407,7 +7263,7 @@
           <w:color w:val="000000"/>
           <w:sz w:val="22"/>
         </w:rPr>
-        <w:t>Hình 5.2: Sequence diagram UC07 -- Tìm kiếm hàng hóa</w:t>
+        <w:t>Hình 4.5: Activity -- UC10 Lập phiếu xuất kho</w:t>
       </w:r>
     </w:p>
     <w:p>
@@ -7421,35 +7277,7 @@
           <w:color w:val="000000"/>
           <w:sz w:val="26"/>
         </w:rPr>
-        <w:t>5.3 UC09 -- Lập phiếu nhập kho</w:t>
-      </w:r>
-    </w:p>
-    <w:p>
-      <w:pPr>
-        <w:spacing w:line="276" w:lineRule="auto" w:after="120"/>
-        <w:ind w:firstLine="567"/>
-      </w:pPr>
-      <w:r>
-        <w:rPr>
-          <w:rFonts w:ascii="Times New Roman" w:hAnsi="Times New Roman" w:eastAsia="Times New Roman"/>
-          <w:color w:val="000000"/>
-          <w:sz w:val="24"/>
-        </w:rPr>
-        <w:t>NV lập phiếu, thêm chi tiết, gửi duyệt; QL duyệt $</w:t>
-      </w:r>
-    </w:p>
-    <w:p>
-      <w:pPr>
-        <w:spacing w:line="276" w:lineRule="auto" w:after="120"/>
-        <w:ind w:firstLine="567"/>
-      </w:pPr>
-      <w:r>
-        <w:rPr>
-          <w:rFonts w:ascii="Times New Roman" w:hAnsi="Times New Roman" w:eastAsia="Times New Roman"/>
-          <w:color w:val="000000"/>
-          <w:sz w:val="24"/>
-        </w:rPr>
-        <w:t>$ tăng tồn, log.</w:t>
+        <w:t>4.6 Kiểm kê (bổ sung nghiệp vụ)</w:t>
       </w:r>
     </w:p>
     <w:p>
@@ -7470,7 +7298,7 @@
               <a:graphicData uri="http://schemas.openxmlformats.org/drawingml/2006/picture">
                 <pic:pic>
                   <pic:nvPicPr>
-                    <pic:cNvPr id="0" name="5.3_sequence_uc09.png"/>
+                    <pic:cNvPr id="0" name="2.3_activity_kiemke.png"/>
                     <pic:cNvPicPr/>
                   </pic:nvPicPr>
                   <pic:blipFill>
@@ -7506,7 +7334,7 @@
           <w:color w:val="000000"/>
           <w:sz w:val="22"/>
         </w:rPr>
-        <w:t>Hình 5.3: Sequence diagram UC09 -- Lập phiếu nhập kho</w:t>
+        <w:t>Hình 4.6: Sơ đồ hoạt động quy trình kiểm kê tồn kho</w:t>
       </w:r>
     </w:p>
     <w:p>
@@ -7520,7 +7348,7 @@
           <w:color w:val="000000"/>
           <w:sz w:val="26"/>
         </w:rPr>
-        <w:t>5.4 UC10 -- Lập phiếu xuất kho</w:t>
+        <w:t>4.7 Kết luận</w:t>
       </w:r>
     </w:p>
     <w:p>
@@ -7534,7 +7362,21 @@
           <w:color w:val="000000"/>
           <w:sz w:val="24"/>
         </w:rPr>
-        <w:t>NV lập phiếu (kiểm tra tồn), gửi duyệt; QL duyệt $</w:t>
+        <w:t>Activity cho các UC cốt lõi đã đủ. Tiếp: Sequence (Ch.5), Class (Ch.6).</w:t>
+      </w:r>
+    </w:p>
+    <w:p>
+      <w:pPr>
+        <w:pStyle w:val="Heading1"/>
+      </w:pPr>
+      <w:r>
+        <w:rPr>
+          <w:rFonts w:ascii="Times New Roman" w:hAnsi="Times New Roman" w:eastAsia="Times New Roman"/>
+          <w:b/>
+          <w:color w:val="000000"/>
+          <w:sz w:val="28"/>
+        </w:rPr>
+        <w:t>CHƯƠNG 5: SƠ ĐỒ TRÌNH TỰ (SEQUENCE DIAGRAM)</w:t>
       </w:r>
     </w:p>
     <w:p>
@@ -7548,7 +7390,77 @@
           <w:color w:val="000000"/>
           <w:sz w:val="24"/>
         </w:rPr>
-        <w:t>$ giảm tồn, log.</w:t>
+        <w:t>Sequence: tương tác đối tượng theo thời gian cho các use case chính.</w:t>
+      </w:r>
+    </w:p>
+    <w:p>
+      <w:pPr>
+        <w:pStyle w:val="Heading2"/>
+      </w:pPr>
+      <w:r>
+        <w:rPr>
+          <w:rFonts w:ascii="Times New Roman" w:hAnsi="Times New Roman" w:eastAsia="Times New Roman"/>
+          <w:b/>
+          <w:color w:val="000000"/>
+          <w:sz w:val="26"/>
+        </w:rPr>
+        <w:t>5.1 UC01 -- Đăng nhập</w:t>
+      </w:r>
+    </w:p>
+    <w:p>
+      <w:pPr>
+        <w:spacing w:line="276" w:lineRule="auto" w:after="120"/>
+        <w:ind w:firstLine="567"/>
+      </w:pPr>
+      <w:r>
+        <w:rPr>
+          <w:rFonts w:ascii="Times New Roman" w:hAnsi="Times New Roman" w:eastAsia="Times New Roman"/>
+          <w:color w:val="000000"/>
+          <w:sz w:val="24"/>
+        </w:rPr>
+        <w:t>Người dùng $</w:t>
+      </w:r>
+    </w:p>
+    <w:p>
+      <w:pPr>
+        <w:spacing w:line="276" w:lineRule="auto" w:after="120"/>
+        <w:ind w:firstLine="567"/>
+      </w:pPr>
+      <w:r>
+        <w:rPr>
+          <w:rFonts w:ascii="Times New Roman" w:hAnsi="Times New Roman" w:eastAsia="Times New Roman"/>
+          <w:color w:val="000000"/>
+          <w:sz w:val="24"/>
+        </w:rPr>
+        <w:t>form đăng nhập</w:t>
+      </w:r>
+    </w:p>
+    <w:p>
+      <w:pPr>
+        <w:spacing w:line="276" w:lineRule="auto" w:after="120"/>
+        <w:ind w:firstLine="567"/>
+      </w:pPr>
+      <w:r>
+        <w:rPr>
+          <w:rFonts w:ascii="Times New Roman" w:hAnsi="Times New Roman" w:eastAsia="Times New Roman"/>
+          <w:color w:val="000000"/>
+          <w:sz w:val="24"/>
+        </w:rPr>
+        <w:t>hệ thống kiểm tra CSDL</w:t>
+      </w:r>
+    </w:p>
+    <w:p>
+      <w:pPr>
+        <w:spacing w:line="276" w:lineRule="auto" w:after="120"/>
+        <w:ind w:firstLine="567"/>
+      </w:pPr>
+      <w:r>
+        <w:rPr>
+          <w:rFonts w:ascii="Times New Roman" w:hAnsi="Times New Roman" w:eastAsia="Times New Roman"/>
+          <w:color w:val="000000"/>
+          <w:sz w:val="24"/>
+        </w:rPr>
+        <w:t>$ tạo phiên / báo lỗi.</w:t>
       </w:r>
     </w:p>
     <w:p>
@@ -7560,7 +7472,7 @@
       <w:r>
         <w:drawing>
           <wp:inline xmlns:a="http://schemas.openxmlformats.org/drawingml/2006/main" xmlns:pic="http://schemas.openxmlformats.org/drawingml/2006/picture">
-            <wp:extent cx="5580000" cy="7221176"/>
+            <wp:extent cx="5580000" cy="3247765"/>
             <wp:docPr id="12" name="Picture 12"/>
             <wp:cNvGraphicFramePr>
               <a:graphicFrameLocks noChangeAspect="1"/>
@@ -7569,7 +7481,7 @@
               <a:graphicData uri="http://schemas.openxmlformats.org/drawingml/2006/picture">
                 <pic:pic>
                   <pic:nvPicPr>
-                    <pic:cNvPr id="0" name="5.4_sequence_uc10.png"/>
+                    <pic:cNvPr id="0" name="5.7_sequence_uc01.png"/>
                     <pic:cNvPicPr/>
                   </pic:nvPicPr>
                   <pic:blipFill>
@@ -7581,7 +7493,7 @@
                   <pic:spPr>
                     <a:xfrm>
                       <a:off x="0" y="0"/>
-                      <a:ext cx="5580000" cy="7221176"/>
+                      <a:ext cx="5580000" cy="3247765"/>
                     </a:xfrm>
                     <a:prstGeom prst="rect"/>
                   </pic:spPr>
@@ -7605,7 +7517,7 @@
           <w:color w:val="000000"/>
           <w:sz w:val="22"/>
         </w:rPr>
-        <w:t>Hình 5.4: Sequence diagram UC10 -- Lập phiếu xuất kho</w:t>
+        <w:t>Hình 5.1: Sequence diagram UC01 -- Đăng nhập</w:t>
       </w:r>
     </w:p>
     <w:p>
@@ -7619,7 +7531,63 @@
           <w:color w:val="000000"/>
           <w:sz w:val="26"/>
         </w:rPr>
-        <w:t>5.5 State machine phiếu</w:t>
+        <w:t>5.2 UC06 -- Thêm hàng hóa</w:t>
+      </w:r>
+    </w:p>
+    <w:p>
+      <w:pPr>
+        <w:spacing w:line="276" w:lineRule="auto" w:after="120"/>
+        <w:ind w:firstLine="567"/>
+      </w:pPr>
+      <w:r>
+        <w:rPr>
+          <w:rFonts w:ascii="Times New Roman" w:hAnsi="Times New Roman" w:eastAsia="Times New Roman"/>
+          <w:color w:val="000000"/>
+          <w:sz w:val="24"/>
+        </w:rPr>
+        <w:t>NV $</w:t>
+      </w:r>
+    </w:p>
+    <w:p>
+      <w:pPr>
+        <w:spacing w:line="276" w:lineRule="auto" w:after="120"/>
+        <w:ind w:firstLine="567"/>
+      </w:pPr>
+      <w:r>
+        <w:rPr>
+          <w:rFonts w:ascii="Times New Roman" w:hAnsi="Times New Roman" w:eastAsia="Times New Roman"/>
+          <w:color w:val="000000"/>
+          <w:sz w:val="24"/>
+        </w:rPr>
+        <w:t>Giao diện</w:t>
+      </w:r>
+    </w:p>
+    <w:p>
+      <w:pPr>
+        <w:spacing w:line="276" w:lineRule="auto" w:after="120"/>
+        <w:ind w:firstLine="567"/>
+      </w:pPr>
+      <w:r>
+        <w:rPr>
+          <w:rFonts w:ascii="Times New Roman" w:hAnsi="Times New Roman" w:eastAsia="Times New Roman"/>
+          <w:color w:val="000000"/>
+          <w:sz w:val="24"/>
+        </w:rPr>
+        <w:t>Hệ thống</w:t>
+      </w:r>
+    </w:p>
+    <w:p>
+      <w:pPr>
+        <w:spacing w:line="276" w:lineRule="auto" w:after="120"/>
+        <w:ind w:firstLine="567"/>
+      </w:pPr>
+      <w:r>
+        <w:rPr>
+          <w:rFonts w:ascii="Times New Roman" w:hAnsi="Times New Roman" w:eastAsia="Times New Roman"/>
+          <w:color w:val="000000"/>
+          <w:sz w:val="24"/>
+        </w:rPr>
+        <w:t>$ CSDL (lưu hàng + tồn = 0).</w:t>
       </w:r>
     </w:p>
     <w:p>
@@ -7640,7 +7608,7 @@
               <a:graphicData uri="http://schemas.openxmlformats.org/drawingml/2006/picture">
                 <pic:pic>
                   <pic:nvPicPr>
-                    <pic:cNvPr id="0" name="5.5_state_phieu_nhap.png"/>
+                    <pic:cNvPr id="0" name="5.1_sequence_uc05.png"/>
                     <pic:cNvPicPr/>
                   </pic:nvPicPr>
                   <pic:blipFill>
@@ -7676,7 +7644,63 @@
           <w:color w:val="000000"/>
           <w:sz w:val="22"/>
         </w:rPr>
-        <w:t>Hình 5.5: State Machine Diagram – Trạng thái phiếu nhập kho</w:t>
+        <w:t>Hình 5.2: Sequence diagram UC06 -- Thêm hàng hóa</w:t>
+      </w:r>
+    </w:p>
+    <w:p>
+      <w:pPr>
+        <w:pStyle w:val="Heading2"/>
+      </w:pPr>
+      <w:r>
+        <w:rPr>
+          <w:rFonts w:ascii="Times New Roman" w:hAnsi="Times New Roman" w:eastAsia="Times New Roman"/>
+          <w:b/>
+          <w:color w:val="000000"/>
+          <w:sz w:val="26"/>
+        </w:rPr>
+        <w:t>5.3 UC07 -- Tìm kiếm hàng hóa</w:t>
+      </w:r>
+    </w:p>
+    <w:p>
+      <w:pPr>
+        <w:spacing w:line="276" w:lineRule="auto" w:after="120"/>
+        <w:ind w:firstLine="567"/>
+      </w:pPr>
+      <w:r>
+        <w:rPr>
+          <w:rFonts w:ascii="Times New Roman" w:hAnsi="Times New Roman" w:eastAsia="Times New Roman"/>
+          <w:color w:val="000000"/>
+          <w:sz w:val="24"/>
+        </w:rPr>
+        <w:t>Nhập điều kiện $</w:t>
+      </w:r>
+    </w:p>
+    <w:p>
+      <w:pPr>
+        <w:spacing w:line="276" w:lineRule="auto" w:after="120"/>
+        <w:ind w:firstLine="567"/>
+      </w:pPr>
+      <w:r>
+        <w:rPr>
+          <w:rFonts w:ascii="Times New Roman" w:hAnsi="Times New Roman" w:eastAsia="Times New Roman"/>
+          <w:color w:val="000000"/>
+          <w:sz w:val="24"/>
+        </w:rPr>
+        <w:t>truy vấn HangHoa + TonKho</w:t>
+      </w:r>
+    </w:p>
+    <w:p>
+      <w:pPr>
+        <w:spacing w:line="276" w:lineRule="auto" w:after="120"/>
+        <w:ind w:firstLine="567"/>
+      </w:pPr>
+      <w:r>
+        <w:rPr>
+          <w:rFonts w:ascii="Times New Roman" w:hAnsi="Times New Roman" w:eastAsia="Times New Roman"/>
+          <w:color w:val="000000"/>
+          <w:sz w:val="24"/>
+        </w:rPr>
+        <w:t>$ danh sách.</w:t>
       </w:r>
     </w:p>
     <w:p>
@@ -7697,7 +7721,7 @@
               <a:graphicData uri="http://schemas.openxmlformats.org/drawingml/2006/picture">
                 <pic:pic>
                   <pic:nvPicPr>
-                    <pic:cNvPr id="0" name="5.6_state_phieu_xuat.png"/>
+                    <pic:cNvPr id="0" name="5.2_sequence_uc06.png"/>
                     <pic:cNvPicPr/>
                   </pic:nvPicPr>
                   <pic:blipFill>
@@ -7733,7 +7757,7 @@
           <w:color w:val="000000"/>
           <w:sz w:val="22"/>
         </w:rPr>
-        <w:t>Hình 5.6: State Machine Diagram – Trạng thái phiếu xuất kho</w:t>
+        <w:t>Hình 5.3: Sequence diagram UC07 -- Tìm kiếm hàng hóa</w:t>
       </w:r>
     </w:p>
     <w:p>
@@ -7747,7 +7771,7 @@
           <w:color w:val="000000"/>
           <w:sz w:val="26"/>
         </w:rPr>
-        <w:t>5.6 Kết luận</w:t>
+        <w:t>5.4 UC09 -- Lập phiếu nhập kho</w:t>
       </w:r>
     </w:p>
     <w:p>
@@ -7761,21 +7785,7 @@
           <w:color w:val="000000"/>
           <w:sz w:val="24"/>
         </w:rPr>
-        <w:t>Tiếp: Class diagram (Ch.6).</w:t>
-      </w:r>
-    </w:p>
-    <w:p>
-      <w:pPr>
-        <w:pStyle w:val="Heading1"/>
-      </w:pPr>
-      <w:r>
-        <w:rPr>
-          <w:rFonts w:ascii="Times New Roman" w:hAnsi="Times New Roman" w:eastAsia="Times New Roman"/>
-          <w:b/>
-          <w:color w:val="000000"/>
-          <w:sz w:val="28"/>
-        </w:rPr>
-        <w:t>CHƯƠNG 6: SƠ ĐỒ LỚP (CLASS DIAGRAM)</w:t>
+        <w:t>NV lập phiếu, gửi duyệt; QL duyệt $</w:t>
       </w:r>
     </w:p>
     <w:p>
@@ -7789,49 +7799,7 @@
           <w:color w:val="000000"/>
           <w:sz w:val="24"/>
         </w:rPr>
-        <w:t>Class diagram sau use case -- activity -- sequence.</w:t>
-      </w:r>
-    </w:p>
-    <w:p>
-      <w:pPr>
-        <w:pStyle w:val="Heading2"/>
-      </w:pPr>
-      <w:r>
-        <w:rPr>
-          <w:rFonts w:ascii="Times New Roman" w:hAnsi="Times New Roman" w:eastAsia="Times New Roman"/>
-          <w:b/>
-          <w:color w:val="000000"/>
-          <w:sz w:val="26"/>
-        </w:rPr>
-        <w:t>6.1 Các lớp chính</w:t>
-      </w:r>
-    </w:p>
-    <w:p>
-      <w:pPr>
-        <w:spacing w:line="276" w:lineRule="auto" w:after="120"/>
-        <w:ind w:firstLine="567"/>
-      </w:pPr>
-      <w:r>
-        <w:rPr>
-          <w:rFonts w:ascii="Times New Roman" w:hAnsi="Times New Roman" w:eastAsia="Times New Roman"/>
-          <w:color w:val="000000"/>
-          <w:sz w:val="24"/>
-        </w:rPr>
-        <w:t>NguoiDung; HangHoa, NhomHangHoa, DonViTinh; NhaCungCap, KhachHang; Kho, TonKho; PhieuNhapKho, ChiTietPhieuNhap; PhieuXuatKho, ChiTietPhieuXuat; PhieuKiemKe, ChiTietKiemKe; LichSuThaoTac.</w:t>
-      </w:r>
-    </w:p>
-    <w:p>
-      <w:pPr>
-        <w:pStyle w:val="Heading2"/>
-      </w:pPr>
-      <w:r>
-        <w:rPr>
-          <w:rFonts w:ascii="Times New Roman" w:hAnsi="Times New Roman" w:eastAsia="Times New Roman"/>
-          <w:b/>
-          <w:color w:val="000000"/>
-          <w:sz w:val="26"/>
-        </w:rPr>
-        <w:t>6.2 Sơ đồ lớp tổng thể</w:t>
+        <w:t>$ tăng tồn, log.</w:t>
       </w:r>
     </w:p>
     <w:p>
@@ -7852,7 +7820,7 @@
               <a:graphicData uri="http://schemas.openxmlformats.org/drawingml/2006/picture">
                 <pic:pic>
                   <pic:nvPicPr>
-                    <pic:cNvPr id="0" name="4.1_classdiagram_master.png"/>
+                    <pic:cNvPr id="0" name="5.3_sequence_uc09.png"/>
                     <pic:cNvPicPr/>
                   </pic:nvPicPr>
                   <pic:blipFill>
@@ -7888,7 +7856,49 @@
           <w:color w:val="000000"/>
           <w:sz w:val="22"/>
         </w:rPr>
-        <w:t>Hình 6.1: Sơ đồ lớp danh mục (Master Data)</w:t>
+        <w:t>Hình 5.4: Sequence diagram UC09 -- Lập phiếu nhập kho</w:t>
+      </w:r>
+    </w:p>
+    <w:p>
+      <w:pPr>
+        <w:pStyle w:val="Heading2"/>
+      </w:pPr>
+      <w:r>
+        <w:rPr>
+          <w:rFonts w:ascii="Times New Roman" w:hAnsi="Times New Roman" w:eastAsia="Times New Roman"/>
+          <w:b/>
+          <w:color w:val="000000"/>
+          <w:sz w:val="26"/>
+        </w:rPr>
+        <w:t>5.5 UC10 -- Lập phiếu xuất kho</w:t>
+      </w:r>
+    </w:p>
+    <w:p>
+      <w:pPr>
+        <w:spacing w:line="276" w:lineRule="auto" w:after="120"/>
+        <w:ind w:firstLine="567"/>
+      </w:pPr>
+      <w:r>
+        <w:rPr>
+          <w:rFonts w:ascii="Times New Roman" w:hAnsi="Times New Roman" w:eastAsia="Times New Roman"/>
+          <w:color w:val="000000"/>
+          <w:sz w:val="24"/>
+        </w:rPr>
+        <w:t>NV lập phiếu (kiểm tra tồn); QL duyệt $</w:t>
+      </w:r>
+    </w:p>
+    <w:p>
+      <w:pPr>
+        <w:spacing w:line="276" w:lineRule="auto" w:after="120"/>
+        <w:ind w:firstLine="567"/>
+      </w:pPr>
+      <w:r>
+        <w:rPr>
+          <w:rFonts w:ascii="Times New Roman" w:hAnsi="Times New Roman" w:eastAsia="Times New Roman"/>
+          <w:color w:val="000000"/>
+          <w:sz w:val="24"/>
+        </w:rPr>
+        <w:t>$ giảm tồn, log.</w:t>
       </w:r>
     </w:p>
     <w:p>
@@ -7909,7 +7919,7 @@
               <a:graphicData uri="http://schemas.openxmlformats.org/drawingml/2006/picture">
                 <pic:pic>
                   <pic:nvPicPr>
-                    <pic:cNvPr id="0" name="4.2_classdiagram_nhapxuat.png"/>
+                    <pic:cNvPr id="0" name="5.4_sequence_uc10.png"/>
                     <pic:cNvPicPr/>
                   </pic:nvPicPr>
                   <pic:blipFill>
@@ -7945,7 +7955,21 @@
           <w:color w:val="000000"/>
           <w:sz w:val="22"/>
         </w:rPr>
-        <w:t>Hình 6.2: Sơ đồ lớp nghiệp vụ nhập xuất kho</w:t>
+        <w:t>Hình 5.5: Sequence diagram UC10 -- Lập phiếu xuất kho</w:t>
+      </w:r>
+    </w:p>
+    <w:p>
+      <w:pPr>
+        <w:pStyle w:val="Heading2"/>
+      </w:pPr>
+      <w:r>
+        <w:rPr>
+          <w:rFonts w:ascii="Times New Roman" w:hAnsi="Times New Roman" w:eastAsia="Times New Roman"/>
+          <w:b/>
+          <w:color w:val="000000"/>
+          <w:sz w:val="26"/>
+        </w:rPr>
+        <w:t>5.6 State machine phiếu</w:t>
       </w:r>
     </w:p>
     <w:p>
@@ -7957,7 +7981,7 @@
       <w:r>
         <w:drawing>
           <wp:inline xmlns:a="http://schemas.openxmlformats.org/drawingml/2006/main" xmlns:pic="http://schemas.openxmlformats.org/drawingml/2006/picture">
-            <wp:extent cx="5580000" cy="3471210"/>
+            <wp:extent cx="5580000" cy="7221176"/>
             <wp:docPr id="17" name="Picture 17"/>
             <wp:cNvGraphicFramePr>
               <a:graphicFrameLocks noChangeAspect="1"/>
@@ -7966,7 +7990,7 @@
               <a:graphicData uri="http://schemas.openxmlformats.org/drawingml/2006/picture">
                 <pic:pic>
                   <pic:nvPicPr>
-                    <pic:cNvPr id="0" name="4.3_classdiagram_kiemke_donhang.png"/>
+                    <pic:cNvPr id="0" name="5.5_state_phieu_nhap.png"/>
                     <pic:cNvPicPr/>
                   </pic:nvPicPr>
                   <pic:blipFill>
@@ -7978,7 +8002,7 @@
                   <pic:spPr>
                     <a:xfrm>
                       <a:off x="0" y="0"/>
-                      <a:ext cx="5580000" cy="3471210"/>
+                      <a:ext cx="5580000" cy="7221176"/>
                     </a:xfrm>
                     <a:prstGeom prst="rect"/>
                   </pic:spPr>
@@ -8002,35 +8026,7 @@
           <w:color w:val="000000"/>
           <w:sz w:val="22"/>
         </w:rPr>
-        <w:t>Hình 6.3: Sơ đồ lớp kiểm kê và lịch sử thao tác</w:t>
-      </w:r>
-    </w:p>
-    <w:p>
-      <w:pPr>
-        <w:pStyle w:val="Heading2"/>
-      </w:pPr>
-      <w:r>
-        <w:rPr>
-          <w:rFonts w:ascii="Times New Roman" w:hAnsi="Times New Roman" w:eastAsia="Times New Roman"/>
-          <w:b/>
-          <w:color w:val="000000"/>
-          <w:sz w:val="26"/>
-        </w:rPr>
-        <w:t>6.3 Class trong use case</w:t>
-      </w:r>
-    </w:p>
-    <w:p>
-      <w:pPr>
-        <w:pStyle w:val="Heading3"/>
-      </w:pPr>
-      <w:r>
-        <w:rPr>
-          <w:rFonts w:ascii="Times New Roman" w:hAnsi="Times New Roman" w:eastAsia="Times New Roman"/>
-          <w:b/>
-          <w:color w:val="000000"/>
-          <w:sz w:val="24"/>
-        </w:rPr>
-        <w:t>6.3.1 UC06 -- Thêm hàng hóa</w:t>
+        <w:t>Hình 5.6: State Machine Diagram – Trạng thái phiếu nhập kho</w:t>
       </w:r>
     </w:p>
     <w:p>
@@ -8051,7 +8047,7 @@
               <a:graphicData uri="http://schemas.openxmlformats.org/drawingml/2006/picture">
                 <pic:pic>
                   <pic:nvPicPr>
-                    <pic:cNvPr id="0" name="4.4_class_uc05.png"/>
+                    <pic:cNvPr id="0" name="5.6_state_phieu_xuat.png"/>
                     <pic:cNvPicPr/>
                   </pic:nvPicPr>
                   <pic:blipFill>
@@ -8087,21 +8083,105 @@
           <w:color w:val="000000"/>
           <w:sz w:val="22"/>
         </w:rPr>
-        <w:t>Hình 6.4: Biểu đồ lớp trong ca sử dụng UC06 -- Thêm hàng hóa</w:t>
-      </w:r>
-    </w:p>
-    <w:p>
-      <w:pPr>
-        <w:pStyle w:val="Heading3"/>
+        <w:t>Hình 5.7: State Machine Diagram – Trạng thái phiếu xuất kho</w:t>
+      </w:r>
+    </w:p>
+    <w:p>
+      <w:pPr>
+        <w:pStyle w:val="Heading2"/>
       </w:pPr>
       <w:r>
         <w:rPr>
           <w:rFonts w:ascii="Times New Roman" w:hAnsi="Times New Roman" w:eastAsia="Times New Roman"/>
           <w:b/>
           <w:color w:val="000000"/>
-          <w:sz w:val="24"/>
-        </w:rPr>
-        <w:t>6.3.2 UC09 -- Lập phiếu nhập</w:t>
+          <w:sz w:val="26"/>
+        </w:rPr>
+        <w:t>5.7 Kết luận</w:t>
+      </w:r>
+    </w:p>
+    <w:p>
+      <w:pPr>
+        <w:spacing w:line="276" w:lineRule="auto" w:after="120"/>
+        <w:ind w:firstLine="567"/>
+      </w:pPr>
+      <w:r>
+        <w:rPr>
+          <w:rFonts w:ascii="Times New Roman" w:hAnsi="Times New Roman" w:eastAsia="Times New Roman"/>
+          <w:color w:val="000000"/>
+          <w:sz w:val="24"/>
+        </w:rPr>
+        <w:t>Tiếp: Class diagram (Ch.6).</w:t>
+      </w:r>
+    </w:p>
+    <w:p>
+      <w:pPr>
+        <w:pStyle w:val="Heading1"/>
+      </w:pPr>
+      <w:r>
+        <w:rPr>
+          <w:rFonts w:ascii="Times New Roman" w:hAnsi="Times New Roman" w:eastAsia="Times New Roman"/>
+          <w:b/>
+          <w:color w:val="000000"/>
+          <w:sz w:val="28"/>
+        </w:rPr>
+        <w:t>CHƯƠNG 6: SƠ ĐỒ LỚP (CLASS DIAGRAM)</w:t>
+      </w:r>
+    </w:p>
+    <w:p>
+      <w:pPr>
+        <w:spacing w:line="276" w:lineRule="auto" w:after="120"/>
+        <w:ind w:firstLine="567"/>
+      </w:pPr>
+      <w:r>
+        <w:rPr>
+          <w:rFonts w:ascii="Times New Roman" w:hAnsi="Times New Roman" w:eastAsia="Times New Roman"/>
+          <w:color w:val="000000"/>
+          <w:sz w:val="24"/>
+        </w:rPr>
+        <w:t>Class diagram sau use case -- activity -- sequence.</w:t>
+      </w:r>
+    </w:p>
+    <w:p>
+      <w:pPr>
+        <w:pStyle w:val="Heading2"/>
+      </w:pPr>
+      <w:r>
+        <w:rPr>
+          <w:rFonts w:ascii="Times New Roman" w:hAnsi="Times New Roman" w:eastAsia="Times New Roman"/>
+          <w:b/>
+          <w:color w:val="000000"/>
+          <w:sz w:val="26"/>
+        </w:rPr>
+        <w:t>6.1 Các lớp chính</w:t>
+      </w:r>
+    </w:p>
+    <w:p>
+      <w:pPr>
+        <w:spacing w:line="276" w:lineRule="auto" w:after="120"/>
+        <w:ind w:firstLine="567"/>
+      </w:pPr>
+      <w:r>
+        <w:rPr>
+          <w:rFonts w:ascii="Times New Roman" w:hAnsi="Times New Roman" w:eastAsia="Times New Roman"/>
+          <w:color w:val="000000"/>
+          <w:sz w:val="24"/>
+        </w:rPr>
+        <w:t>NguoiDung; HangHoa, NhomHangHoa, DonViTinh; NhaCungCap, KhachHang; Kho, TonKho; PhieuNhapKho, ChiTietPhieuNhap; PhieuXuatKho, ChiTietPhieuXuat; PhieuKiemKe, ChiTietKiemKe; LichSuThaoTac.</w:t>
+      </w:r>
+    </w:p>
+    <w:p>
+      <w:pPr>
+        <w:pStyle w:val="Heading2"/>
+      </w:pPr>
+      <w:r>
+        <w:rPr>
+          <w:rFonts w:ascii="Times New Roman" w:hAnsi="Times New Roman" w:eastAsia="Times New Roman"/>
+          <w:b/>
+          <w:color w:val="000000"/>
+          <w:sz w:val="26"/>
+        </w:rPr>
+        <w:t>6.2 Sơ đồ lớp tổng thể</w:t>
       </w:r>
     </w:p>
     <w:p>
@@ -8122,7 +8202,7 @@
               <a:graphicData uri="http://schemas.openxmlformats.org/drawingml/2006/picture">
                 <pic:pic>
                   <pic:nvPicPr>
-                    <pic:cNvPr id="0" name="4.5_class_uc09.png"/>
+                    <pic:cNvPr id="0" name="4.1_classdiagram_master.png"/>
                     <pic:cNvPicPr/>
                   </pic:nvPicPr>
                   <pic:blipFill>
@@ -8158,21 +8238,7 @@
           <w:color w:val="000000"/>
           <w:sz w:val="22"/>
         </w:rPr>
-        <w:t>Hình 6.5: Biểu đồ lớp trong ca sử dụng UC09 -- Lập phiếu nhập kho</w:t>
-      </w:r>
-    </w:p>
-    <w:p>
-      <w:pPr>
-        <w:pStyle w:val="Heading3"/>
-      </w:pPr>
-      <w:r>
-        <w:rPr>
-          <w:rFonts w:ascii="Times New Roman" w:hAnsi="Times New Roman" w:eastAsia="Times New Roman"/>
-          <w:b/>
-          <w:color w:val="000000"/>
-          <w:sz w:val="24"/>
-        </w:rPr>
-        <w:t>6.3.3 UC10 -- Lập phiếu xuất</w:t>
+        <w:t>Hình 6.1: Sơ đồ lớp danh mục (Master Data)</w:t>
       </w:r>
     </w:p>
     <w:p>
@@ -8193,7 +8259,7 @@
               <a:graphicData uri="http://schemas.openxmlformats.org/drawingml/2006/picture">
                 <pic:pic>
                   <pic:nvPicPr>
-                    <pic:cNvPr id="0" name="4.6_class_uc10.png"/>
+                    <pic:cNvPr id="0" name="4.2_classdiagram_nhapxuat.png"/>
                     <pic:cNvPicPr/>
                   </pic:nvPicPr>
                   <pic:blipFill>
@@ -8229,7 +8295,362 @@
           <w:color w:val="000000"/>
           <w:sz w:val="22"/>
         </w:rPr>
-        <w:t>Hình 6.6: Biểu đồ lớp trong ca sử dụng UC10 -- Lập phiếu xuất kho</w:t>
+        <w:t>Hình 6.2: Sơ đồ lớp nghiệp vụ nhập xuất kho</w:t>
+      </w:r>
+    </w:p>
+    <w:p>
+      <w:pPr>
+        <w:spacing w:before="160" w:after="80"/>
+        <w:ind w:firstLine="0"/>
+        <w:jc w:val="center"/>
+      </w:pPr>
+      <w:r>
+        <w:drawing>
+          <wp:inline xmlns:a="http://schemas.openxmlformats.org/drawingml/2006/main" xmlns:pic="http://schemas.openxmlformats.org/drawingml/2006/picture">
+            <wp:extent cx="5580000" cy="3471210"/>
+            <wp:docPr id="21" name="Picture 21"/>
+            <wp:cNvGraphicFramePr>
+              <a:graphicFrameLocks noChangeAspect="1"/>
+            </wp:cNvGraphicFramePr>
+            <a:graphic>
+              <a:graphicData uri="http://schemas.openxmlformats.org/drawingml/2006/picture">
+                <pic:pic>
+                  <pic:nvPicPr>
+                    <pic:cNvPr id="0" name="4.3_classdiagram_kiemke_donhang.png"/>
+                    <pic:cNvPicPr/>
+                  </pic:nvPicPr>
+                  <pic:blipFill>
+                    <a:blip r:embed="rId31"/>
+                    <a:stretch>
+                      <a:fillRect/>
+                    </a:stretch>
+                  </pic:blipFill>
+                  <pic:spPr>
+                    <a:xfrm>
+                      <a:off x="0" y="0"/>
+                      <a:ext cx="5580000" cy="3471210"/>
+                    </a:xfrm>
+                    <a:prstGeom prst="rect"/>
+                  </pic:spPr>
+                </pic:pic>
+              </a:graphicData>
+            </a:graphic>
+          </wp:inline>
+        </w:drawing>
+      </w:r>
+    </w:p>
+    <w:p>
+      <w:pPr>
+        <w:spacing w:after="200"/>
+        <w:ind w:firstLine="0"/>
+        <w:jc w:val="center"/>
+      </w:pPr>
+      <w:r>
+        <w:rPr>
+          <w:rFonts w:ascii="Times New Roman" w:hAnsi="Times New Roman" w:eastAsia="Times New Roman"/>
+          <w:i/>
+          <w:color w:val="000000"/>
+          <w:sz w:val="22"/>
+        </w:rPr>
+        <w:t>Hình 6.3: Sơ đồ lớp kiểm kê và lịch sử thao tác</w:t>
+      </w:r>
+    </w:p>
+    <w:p>
+      <w:pPr>
+        <w:pStyle w:val="Heading2"/>
+      </w:pPr>
+      <w:r>
+        <w:rPr>
+          <w:rFonts w:ascii="Times New Roman" w:hAnsi="Times New Roman" w:eastAsia="Times New Roman"/>
+          <w:b/>
+          <w:color w:val="000000"/>
+          <w:sz w:val="26"/>
+        </w:rPr>
+        <w:t>6.3 Class trong use case</w:t>
+      </w:r>
+    </w:p>
+    <w:p>
+      <w:pPr>
+        <w:pStyle w:val="Heading3"/>
+      </w:pPr>
+      <w:r>
+        <w:rPr>
+          <w:rFonts w:ascii="Times New Roman" w:hAnsi="Times New Roman" w:eastAsia="Times New Roman"/>
+          <w:b/>
+          <w:color w:val="000000"/>
+          <w:sz w:val="24"/>
+        </w:rPr>
+        <w:t>6.3.1 UC03 -- Thêm tài khoản</w:t>
+      </w:r>
+    </w:p>
+    <w:p>
+      <w:pPr>
+        <w:spacing w:before="160" w:after="80"/>
+        <w:ind w:firstLine="0"/>
+        <w:jc w:val="center"/>
+      </w:pPr>
+      <w:r>
+        <w:drawing>
+          <wp:inline xmlns:a="http://schemas.openxmlformats.org/drawingml/2006/main" xmlns:pic="http://schemas.openxmlformats.org/drawingml/2006/picture">
+            <wp:extent cx="5580000" cy="2524742"/>
+            <wp:docPr id="22" name="Picture 22"/>
+            <wp:cNvGraphicFramePr>
+              <a:graphicFrameLocks noChangeAspect="1"/>
+            </wp:cNvGraphicFramePr>
+            <a:graphic>
+              <a:graphicData uri="http://schemas.openxmlformats.org/drawingml/2006/picture">
+                <pic:pic>
+                  <pic:nvPicPr>
+                    <pic:cNvPr id="0" name="6.2_class_uc03.png"/>
+                    <pic:cNvPicPr/>
+                  </pic:nvPicPr>
+                  <pic:blipFill>
+                    <a:blip r:embed="rId32"/>
+                    <a:stretch>
+                      <a:fillRect/>
+                    </a:stretch>
+                  </pic:blipFill>
+                  <pic:spPr>
+                    <a:xfrm>
+                      <a:off x="0" y="0"/>
+                      <a:ext cx="5580000" cy="2524742"/>
+                    </a:xfrm>
+                    <a:prstGeom prst="rect"/>
+                  </pic:spPr>
+                </pic:pic>
+              </a:graphicData>
+            </a:graphic>
+          </wp:inline>
+        </w:drawing>
+      </w:r>
+    </w:p>
+    <w:p>
+      <w:pPr>
+        <w:spacing w:after="200"/>
+        <w:ind w:firstLine="0"/>
+        <w:jc w:val="center"/>
+      </w:pPr>
+      <w:r>
+        <w:rPr>
+          <w:rFonts w:ascii="Times New Roman" w:hAnsi="Times New Roman" w:eastAsia="Times New Roman"/>
+          <w:i/>
+          <w:color w:val="000000"/>
+          <w:sz w:val="22"/>
+        </w:rPr>
+        <w:t>Hình 6.4: Class trong UC03 -- Thêm tài khoản</w:t>
+      </w:r>
+    </w:p>
+    <w:p>
+      <w:pPr>
+        <w:pStyle w:val="Heading3"/>
+      </w:pPr>
+      <w:r>
+        <w:rPr>
+          <w:rFonts w:ascii="Times New Roman" w:hAnsi="Times New Roman" w:eastAsia="Times New Roman"/>
+          <w:b/>
+          <w:color w:val="000000"/>
+          <w:sz w:val="24"/>
+        </w:rPr>
+        <w:t>6.3.2 UC06 -- Thêm hàng hóa</w:t>
+      </w:r>
+    </w:p>
+    <w:p>
+      <w:pPr>
+        <w:spacing w:before="160" w:after="80"/>
+        <w:ind w:firstLine="0"/>
+        <w:jc w:val="center"/>
+      </w:pPr>
+      <w:r>
+        <w:drawing>
+          <wp:inline xmlns:a="http://schemas.openxmlformats.org/drawingml/2006/main" xmlns:pic="http://schemas.openxmlformats.org/drawingml/2006/picture">
+            <wp:extent cx="5580000" cy="7221176"/>
+            <wp:docPr id="23" name="Picture 23"/>
+            <wp:cNvGraphicFramePr>
+              <a:graphicFrameLocks noChangeAspect="1"/>
+            </wp:cNvGraphicFramePr>
+            <a:graphic>
+              <a:graphicData uri="http://schemas.openxmlformats.org/drawingml/2006/picture">
+                <pic:pic>
+                  <pic:nvPicPr>
+                    <pic:cNvPr id="0" name="4.4_class_uc05.png"/>
+                    <pic:cNvPicPr/>
+                  </pic:nvPicPr>
+                  <pic:blipFill>
+                    <a:blip r:embed="rId33"/>
+                    <a:stretch>
+                      <a:fillRect/>
+                    </a:stretch>
+                  </pic:blipFill>
+                  <pic:spPr>
+                    <a:xfrm>
+                      <a:off x="0" y="0"/>
+                      <a:ext cx="5580000" cy="7221176"/>
+                    </a:xfrm>
+                    <a:prstGeom prst="rect"/>
+                  </pic:spPr>
+                </pic:pic>
+              </a:graphicData>
+            </a:graphic>
+          </wp:inline>
+        </w:drawing>
+      </w:r>
+    </w:p>
+    <w:p>
+      <w:pPr>
+        <w:spacing w:after="200"/>
+        <w:ind w:firstLine="0"/>
+        <w:jc w:val="center"/>
+      </w:pPr>
+      <w:r>
+        <w:rPr>
+          <w:rFonts w:ascii="Times New Roman" w:hAnsi="Times New Roman" w:eastAsia="Times New Roman"/>
+          <w:i/>
+          <w:color w:val="000000"/>
+          <w:sz w:val="22"/>
+        </w:rPr>
+        <w:t>Hình 6.5: Biểu đồ lớp trong ca sử dụng UC06 -- Thêm hàng hóa</w:t>
+      </w:r>
+    </w:p>
+    <w:p>
+      <w:pPr>
+        <w:pStyle w:val="Heading3"/>
+      </w:pPr>
+      <w:r>
+        <w:rPr>
+          <w:rFonts w:ascii="Times New Roman" w:hAnsi="Times New Roman" w:eastAsia="Times New Roman"/>
+          <w:b/>
+          <w:color w:val="000000"/>
+          <w:sz w:val="24"/>
+        </w:rPr>
+        <w:t>6.3.3 UC09 -- Lập phiếu nhập</w:t>
+      </w:r>
+    </w:p>
+    <w:p>
+      <w:pPr>
+        <w:spacing w:before="160" w:after="80"/>
+        <w:ind w:firstLine="0"/>
+        <w:jc w:val="center"/>
+      </w:pPr>
+      <w:r>
+        <w:drawing>
+          <wp:inline xmlns:a="http://schemas.openxmlformats.org/drawingml/2006/main" xmlns:pic="http://schemas.openxmlformats.org/drawingml/2006/picture">
+            <wp:extent cx="5580000" cy="7221176"/>
+            <wp:docPr id="24" name="Picture 24"/>
+            <wp:cNvGraphicFramePr>
+              <a:graphicFrameLocks noChangeAspect="1"/>
+            </wp:cNvGraphicFramePr>
+            <a:graphic>
+              <a:graphicData uri="http://schemas.openxmlformats.org/drawingml/2006/picture">
+                <pic:pic>
+                  <pic:nvPicPr>
+                    <pic:cNvPr id="0" name="4.5_class_uc09.png"/>
+                    <pic:cNvPicPr/>
+                  </pic:nvPicPr>
+                  <pic:blipFill>
+                    <a:blip r:embed="rId34"/>
+                    <a:stretch>
+                      <a:fillRect/>
+                    </a:stretch>
+                  </pic:blipFill>
+                  <pic:spPr>
+                    <a:xfrm>
+                      <a:off x="0" y="0"/>
+                      <a:ext cx="5580000" cy="7221176"/>
+                    </a:xfrm>
+                    <a:prstGeom prst="rect"/>
+                  </pic:spPr>
+                </pic:pic>
+              </a:graphicData>
+            </a:graphic>
+          </wp:inline>
+        </w:drawing>
+      </w:r>
+    </w:p>
+    <w:p>
+      <w:pPr>
+        <w:spacing w:after="200"/>
+        <w:ind w:firstLine="0"/>
+        <w:jc w:val="center"/>
+      </w:pPr>
+      <w:r>
+        <w:rPr>
+          <w:rFonts w:ascii="Times New Roman" w:hAnsi="Times New Roman" w:eastAsia="Times New Roman"/>
+          <w:i/>
+          <w:color w:val="000000"/>
+          <w:sz w:val="22"/>
+        </w:rPr>
+        <w:t>Hình 6.6: Biểu đồ lớp trong ca sử dụng UC09 -- Lập phiếu nhập kho</w:t>
+      </w:r>
+    </w:p>
+    <w:p>
+      <w:pPr>
+        <w:pStyle w:val="Heading3"/>
+      </w:pPr>
+      <w:r>
+        <w:rPr>
+          <w:rFonts w:ascii="Times New Roman" w:hAnsi="Times New Roman" w:eastAsia="Times New Roman"/>
+          <w:b/>
+          <w:color w:val="000000"/>
+          <w:sz w:val="24"/>
+        </w:rPr>
+        <w:t>6.3.4 UC10 -- Lập phiếu xuất</w:t>
+      </w:r>
+    </w:p>
+    <w:p>
+      <w:pPr>
+        <w:spacing w:before="160" w:after="80"/>
+        <w:ind w:firstLine="0"/>
+        <w:jc w:val="center"/>
+      </w:pPr>
+      <w:r>
+        <w:drawing>
+          <wp:inline xmlns:a="http://schemas.openxmlformats.org/drawingml/2006/main" xmlns:pic="http://schemas.openxmlformats.org/drawingml/2006/picture">
+            <wp:extent cx="5580000" cy="7221176"/>
+            <wp:docPr id="25" name="Picture 25"/>
+            <wp:cNvGraphicFramePr>
+              <a:graphicFrameLocks noChangeAspect="1"/>
+            </wp:cNvGraphicFramePr>
+            <a:graphic>
+              <a:graphicData uri="http://schemas.openxmlformats.org/drawingml/2006/picture">
+                <pic:pic>
+                  <pic:nvPicPr>
+                    <pic:cNvPr id="0" name="4.6_class_uc10.png"/>
+                    <pic:cNvPicPr/>
+                  </pic:nvPicPr>
+                  <pic:blipFill>
+                    <a:blip r:embed="rId35"/>
+                    <a:stretch>
+                      <a:fillRect/>
+                    </a:stretch>
+                  </pic:blipFill>
+                  <pic:spPr>
+                    <a:xfrm>
+                      <a:off x="0" y="0"/>
+                      <a:ext cx="5580000" cy="7221176"/>
+                    </a:xfrm>
+                    <a:prstGeom prst="rect"/>
+                  </pic:spPr>
+                </pic:pic>
+              </a:graphicData>
+            </a:graphic>
+          </wp:inline>
+        </w:drawing>
+      </w:r>
+    </w:p>
+    <w:p>
+      <w:pPr>
+        <w:spacing w:after="200"/>
+        <w:ind w:firstLine="0"/>
+        <w:jc w:val="center"/>
+      </w:pPr>
+      <w:r>
+        <w:rPr>
+          <w:rFonts w:ascii="Times New Roman" w:hAnsi="Times New Roman" w:eastAsia="Times New Roman"/>
+          <w:i/>
+          <w:color w:val="000000"/>
+          <w:sz w:val="22"/>
+        </w:rPr>
+        <w:t>Hình 6.7: Biểu đồ lớp trong ca sử dụng UC10 -- Lập phiếu xuất kho</w:t>
       </w:r>
     </w:p>
     <w:p>
@@ -8711,7 +9132,7 @@
         <w:drawing>
           <wp:inline xmlns:a="http://schemas.openxmlformats.org/drawingml/2006/main" xmlns:pic="http://schemas.openxmlformats.org/drawingml/2006/picture">
             <wp:extent cx="5580000" cy="3657229"/>
-            <wp:docPr id="21" name="Picture 21"/>
+            <wp:docPr id="26" name="Picture 26"/>
             <wp:cNvGraphicFramePr>
               <a:graphicFrameLocks noChangeAspect="1"/>
             </wp:cNvGraphicFramePr>
@@ -8723,7 +9144,7 @@
                     <pic:cNvPicPr/>
                   </pic:nvPicPr>
                   <pic:blipFill>
-                    <a:blip r:embed="rId31"/>
+                    <a:blip r:embed="rId36"/>
                     <a:stretch>
                       <a:fillRect/>
                     </a:stretch>
@@ -8755,7 +9176,7 @@
           <w:color w:val="000000"/>
           <w:sz w:val="22"/>
         </w:rPr>
-        <w:t>Hình 6.7: Component Diagram – Kiến trúc thành phần hệ thống quản lý kho hàng</w:t>
+        <w:t>Hình 6.8: Component Diagram – Kiến trúc thành phần hệ thống quản lý kho hàng</w:t>
       </w:r>
     </w:p>
     <w:p>
@@ -9528,7 +9949,7 @@
         <w:drawing>
           <wp:inline xmlns:a="http://schemas.openxmlformats.org/drawingml/2006/main" xmlns:pic="http://schemas.openxmlformats.org/drawingml/2006/picture">
             <wp:extent cx="5580000" cy="7221176"/>
-            <wp:docPr id="22" name="Picture 22"/>
+            <wp:docPr id="27" name="Picture 27"/>
             <wp:cNvGraphicFramePr>
               <a:graphicFrameLocks noChangeAspect="1"/>
             </wp:cNvGraphicFramePr>
@@ -9540,7 +9961,7 @@
                     <pic:cNvPicPr/>
                   </pic:nvPicPr>
                   <pic:blipFill>
-                    <a:blip r:embed="rId32"/>
+                    <a:blip r:embed="rId37"/>
                     <a:stretch>
                       <a:fillRect/>
                     </a:stretch>
@@ -9585,7 +10006,7 @@
         <w:drawing>
           <wp:inline xmlns:a="http://schemas.openxmlformats.org/drawingml/2006/main" xmlns:pic="http://schemas.openxmlformats.org/drawingml/2006/picture">
             <wp:extent cx="5580000" cy="3213542"/>
-            <wp:docPr id="23" name="Picture 23"/>
+            <wp:docPr id="28" name="Picture 28"/>
             <wp:cNvGraphicFramePr>
               <a:graphicFrameLocks noChangeAspect="1"/>
             </wp:cNvGraphicFramePr>
@@ -9597,7 +10018,7 @@
                     <pic:cNvPicPr/>
                   </pic:nvPicPr>
                   <pic:blipFill>
-                    <a:blip r:embed="rId33"/>
+                    <a:blip r:embed="rId38"/>
                     <a:stretch>
                       <a:fillRect/>
                     </a:stretch>
@@ -11502,6 +11923,77 @@
     </w:p>
     <w:p>
       <w:pPr>
+        <w:pStyle w:val="Heading3"/>
+      </w:pPr>
+      <w:r>
+        <w:rPr>
+          <w:rFonts w:ascii="Times New Roman" w:hAnsi="Times New Roman" w:eastAsia="Times New Roman"/>
+          <w:b/>
+          <w:color w:val="000000"/>
+          <w:sz w:val="24"/>
+        </w:rPr>
+        <w:t>7.3.1 Sơ đồ điều hướng màn hình</w:t>
+      </w:r>
+    </w:p>
+    <w:p>
+      <w:pPr>
+        <w:spacing w:before="160" w:after="80"/>
+        <w:ind w:firstLine="0"/>
+        <w:jc w:val="center"/>
+      </w:pPr>
+      <w:r>
+        <w:drawing>
+          <wp:inline xmlns:a="http://schemas.openxmlformats.org/drawingml/2006/main" xmlns:pic="http://schemas.openxmlformats.org/drawingml/2006/picture">
+            <wp:extent cx="5580000" cy="3441633"/>
+            <wp:docPr id="29" name="Picture 29"/>
+            <wp:cNvGraphicFramePr>
+              <a:graphicFrameLocks noChangeAspect="1"/>
+            </wp:cNvGraphicFramePr>
+            <a:graphic>
+              <a:graphicData uri="http://schemas.openxmlformats.org/drawingml/2006/picture">
+                <pic:pic>
+                  <pic:nvPicPr>
+                    <pic:cNvPr id="0" name="7.3_ui_navigation.png"/>
+                    <pic:cNvPicPr/>
+                  </pic:nvPicPr>
+                  <pic:blipFill>
+                    <a:blip r:embed="rId39"/>
+                    <a:stretch>
+                      <a:fillRect/>
+                    </a:stretch>
+                  </pic:blipFill>
+                  <pic:spPr>
+                    <a:xfrm>
+                      <a:off x="0" y="0"/>
+                      <a:ext cx="5580000" cy="3441633"/>
+                    </a:xfrm>
+                    <a:prstGeom prst="rect"/>
+                  </pic:spPr>
+                </pic:pic>
+              </a:graphicData>
+            </a:graphic>
+          </wp:inline>
+        </w:drawing>
+      </w:r>
+    </w:p>
+    <w:p>
+      <w:pPr>
+        <w:spacing w:after="200"/>
+        <w:ind w:firstLine="0"/>
+        <w:jc w:val="center"/>
+      </w:pPr>
+      <w:r>
+        <w:rPr>
+          <w:rFonts w:ascii="Times New Roman" w:hAnsi="Times New Roman" w:eastAsia="Times New Roman"/>
+          <w:i/>
+          <w:color w:val="000000"/>
+          <w:sz w:val="22"/>
+        </w:rPr>
+        <w:t>Hình 7.3: Sơ đồ điều hướng màn hình chính (theo use case)</w:t>
+      </w:r>
+    </w:p>
+    <w:p>
+      <w:pPr>
         <w:spacing w:line="276" w:lineRule="auto" w:after="120"/>
         <w:ind w:firstLine="567"/>
       </w:pPr>
@@ -11511,7 +12003,7 @@
           <w:color w:val="000000"/>
           <w:sz w:val="24"/>
         </w:rPr>
-        <w:t>Hệ thống được thiết kế theo mô hình ứng dụng web với giao diện thân thiện, hỗ trợ tiếng Việt đầy đủ, responsive trên cả máy tính và máy tính bảng. Các màn hình chính bao gồm:</w:t>
+        <w:t>Hệ thống web, tiếng Việt, responsive. Các màn hình chính:</w:t>
       </w:r>
     </w:p>
     <w:p>

</xml_diff>

<commit_message>
Loại bỏ mục "Mục đích giai đoạn" khỏi chương 5 - xóa phần giới thiệu 3 giai đoạn phân tích OO và bảng so sánh (chức năng/cấu trúc/hành vi), rút gọn phần mở đầu mục 5.1 từ "Mỗi sơ đồ trình tự gắn với một use case" thành "Sau phân tích chức năng và cấu trúc, chương này dùng biểu đồ trình tự", điều chỉnh đánh số mục từ 5.1-5.4 xuống 5.1-5.3 (gộp giới thiệu vào 5.1, đổi 5.2-5.3 thành 5
</commit_message>
<xml_diff>
--- a/VIII.HUST/Phân tích và thiết kế hệ thống/BaoCao/BaoCao_QuanLyKhoHang.docx
+++ b/VIII.HUST/Phân tích và thiết kế hệ thống/BaoCao/BaoCao_QuanLyKhoHang.docx
@@ -2365,7 +2365,137 @@
           <w:color w:val="000000"/>
           <w:sz w:val="24"/>
         </w:rPr>
-        <w:t>5.1  Mục đích giai đoạn</w:t>
+        <w:t>5.1  Phân tích hành vi bằng biểu đồ trình tự</w:t>
+      </w:r>
+      <w:r>
+        <w:rPr>
+          <w:rFonts w:ascii="Times New Roman" w:hAnsi="Times New Roman" w:eastAsia="Times New Roman"/>
+          <w:color w:val="000000"/>
+          <w:sz w:val="24"/>
+        </w:rPr>
+        <w:tab/>
+      </w:r>
+    </w:p>
+    <w:p>
+      <w:pPr>
+        <w:tabs>
+          <w:tab w:pos="8787" w:val="right" w:leader="dot"/>
+        </w:tabs>
+        <w:spacing w:after="40" w:before="20" w:line="276" w:lineRule="auto"/>
+        <w:ind w:firstLine="0" w:left="567"/>
+      </w:pPr>
+      <w:r>
+        <w:rPr>
+          <w:rFonts w:ascii="Times New Roman" w:hAnsi="Times New Roman" w:eastAsia="Times New Roman"/>
+          <w:b w:val="0"/>
+          <w:color w:val="000000"/>
+          <w:sz w:val="24"/>
+        </w:rPr>
+        <w:t>5.1.1  UC01 -- Đăng nhập</w:t>
+      </w:r>
+      <w:r>
+        <w:rPr>
+          <w:rFonts w:ascii="Times New Roman" w:hAnsi="Times New Roman" w:eastAsia="Times New Roman"/>
+          <w:color w:val="000000"/>
+          <w:sz w:val="24"/>
+        </w:rPr>
+        <w:tab/>
+      </w:r>
+    </w:p>
+    <w:p>
+      <w:pPr>
+        <w:tabs>
+          <w:tab w:pos="8787" w:val="right" w:leader="dot"/>
+        </w:tabs>
+        <w:spacing w:after="40" w:before="20" w:line="276" w:lineRule="auto"/>
+        <w:ind w:firstLine="0" w:left="567"/>
+      </w:pPr>
+      <w:r>
+        <w:rPr>
+          <w:rFonts w:ascii="Times New Roman" w:hAnsi="Times New Roman" w:eastAsia="Times New Roman"/>
+          <w:b w:val="0"/>
+          <w:color w:val="000000"/>
+          <w:sz w:val="24"/>
+        </w:rPr>
+        <w:t>5.1.2  UC06 -- Thêm hàng hóa</w:t>
+      </w:r>
+      <w:r>
+        <w:rPr>
+          <w:rFonts w:ascii="Times New Roman" w:hAnsi="Times New Roman" w:eastAsia="Times New Roman"/>
+          <w:color w:val="000000"/>
+          <w:sz w:val="24"/>
+        </w:rPr>
+        <w:tab/>
+      </w:r>
+    </w:p>
+    <w:p>
+      <w:pPr>
+        <w:tabs>
+          <w:tab w:pos="8787" w:val="right" w:leader="dot"/>
+        </w:tabs>
+        <w:spacing w:after="40" w:before="20" w:line="276" w:lineRule="auto"/>
+        <w:ind w:firstLine="0" w:left="567"/>
+      </w:pPr>
+      <w:r>
+        <w:rPr>
+          <w:rFonts w:ascii="Times New Roman" w:hAnsi="Times New Roman" w:eastAsia="Times New Roman"/>
+          <w:b w:val="0"/>
+          <w:color w:val="000000"/>
+          <w:sz w:val="24"/>
+        </w:rPr>
+        <w:t>5.1.3  UC07 -- Tìm kiếm hàng hóa</w:t>
+      </w:r>
+      <w:r>
+        <w:rPr>
+          <w:rFonts w:ascii="Times New Roman" w:hAnsi="Times New Roman" w:eastAsia="Times New Roman"/>
+          <w:color w:val="000000"/>
+          <w:sz w:val="24"/>
+        </w:rPr>
+        <w:tab/>
+      </w:r>
+    </w:p>
+    <w:p>
+      <w:pPr>
+        <w:tabs>
+          <w:tab w:pos="8787" w:val="right" w:leader="dot"/>
+        </w:tabs>
+        <w:spacing w:after="40" w:before="20" w:line="276" w:lineRule="auto"/>
+        <w:ind w:firstLine="0" w:left="567"/>
+      </w:pPr>
+      <w:r>
+        <w:rPr>
+          <w:rFonts w:ascii="Times New Roman" w:hAnsi="Times New Roman" w:eastAsia="Times New Roman"/>
+          <w:b w:val="0"/>
+          <w:color w:val="000000"/>
+          <w:sz w:val="24"/>
+        </w:rPr>
+        <w:t>5.1.4  UC09 -- Lập phiếu nhập kho</w:t>
+      </w:r>
+      <w:r>
+        <w:rPr>
+          <w:rFonts w:ascii="Times New Roman" w:hAnsi="Times New Roman" w:eastAsia="Times New Roman"/>
+          <w:color w:val="000000"/>
+          <w:sz w:val="24"/>
+        </w:rPr>
+        <w:tab/>
+      </w:r>
+    </w:p>
+    <w:p>
+      <w:pPr>
+        <w:tabs>
+          <w:tab w:pos="8787" w:val="right" w:leader="dot"/>
+        </w:tabs>
+        <w:spacing w:after="40" w:before="20" w:line="276" w:lineRule="auto"/>
+        <w:ind w:firstLine="0" w:left="567"/>
+      </w:pPr>
+      <w:r>
+        <w:rPr>
+          <w:rFonts w:ascii="Times New Roman" w:hAnsi="Times New Roman" w:eastAsia="Times New Roman"/>
+          <w:b w:val="0"/>
+          <w:color w:val="000000"/>
+          <w:sz w:val="24"/>
+        </w:rPr>
+        <w:t>5.1.5  UC10 -- Lập phiếu xuất kho</w:t>
       </w:r>
       <w:r>
         <w:rPr>
@@ -2391,7 +2521,7 @@
           <w:color w:val="000000"/>
           <w:sz w:val="24"/>
         </w:rPr>
-        <w:t>5.2  Phân tích hành vi bằng biểu đồ trình tự</w:t>
+        <w:t>5.2  Phân tích hành vi đối tượng phiếu (biểu đồ trạng thái)</w:t>
       </w:r>
       <w:r>
         <w:rPr>
@@ -2417,7 +2547,7 @@
           <w:color w:val="000000"/>
           <w:sz w:val="24"/>
         </w:rPr>
-        <w:t>5.2.1  UC01 -- Đăng nhập</w:t>
+        <w:t>5.2.1  Phiếu nhập kho</w:t>
       </w:r>
       <w:r>
         <w:rPr>
@@ -2443,85 +2573,7 @@
           <w:color w:val="000000"/>
           <w:sz w:val="24"/>
         </w:rPr>
-        <w:t>5.2.2  UC06 -- Thêm hàng hóa</w:t>
-      </w:r>
-      <w:r>
-        <w:rPr>
-          <w:rFonts w:ascii="Times New Roman" w:hAnsi="Times New Roman" w:eastAsia="Times New Roman"/>
-          <w:color w:val="000000"/>
-          <w:sz w:val="24"/>
-        </w:rPr>
-        <w:tab/>
-      </w:r>
-    </w:p>
-    <w:p>
-      <w:pPr>
-        <w:tabs>
-          <w:tab w:pos="8787" w:val="right" w:leader="dot"/>
-        </w:tabs>
-        <w:spacing w:after="40" w:before="20" w:line="276" w:lineRule="auto"/>
-        <w:ind w:firstLine="0" w:left="567"/>
-      </w:pPr>
-      <w:r>
-        <w:rPr>
-          <w:rFonts w:ascii="Times New Roman" w:hAnsi="Times New Roman" w:eastAsia="Times New Roman"/>
-          <w:b w:val="0"/>
-          <w:color w:val="000000"/>
-          <w:sz w:val="24"/>
-        </w:rPr>
-        <w:t>5.2.3  UC07 -- Tìm kiếm hàng hóa</w:t>
-      </w:r>
-      <w:r>
-        <w:rPr>
-          <w:rFonts w:ascii="Times New Roman" w:hAnsi="Times New Roman" w:eastAsia="Times New Roman"/>
-          <w:color w:val="000000"/>
-          <w:sz w:val="24"/>
-        </w:rPr>
-        <w:tab/>
-      </w:r>
-    </w:p>
-    <w:p>
-      <w:pPr>
-        <w:tabs>
-          <w:tab w:pos="8787" w:val="right" w:leader="dot"/>
-        </w:tabs>
-        <w:spacing w:after="40" w:before="20" w:line="276" w:lineRule="auto"/>
-        <w:ind w:firstLine="0" w:left="567"/>
-      </w:pPr>
-      <w:r>
-        <w:rPr>
-          <w:rFonts w:ascii="Times New Roman" w:hAnsi="Times New Roman" w:eastAsia="Times New Roman"/>
-          <w:b w:val="0"/>
-          <w:color w:val="000000"/>
-          <w:sz w:val="24"/>
-        </w:rPr>
-        <w:t>5.2.4  UC09 -- Lập phiếu nhập kho</w:t>
-      </w:r>
-      <w:r>
-        <w:rPr>
-          <w:rFonts w:ascii="Times New Roman" w:hAnsi="Times New Roman" w:eastAsia="Times New Roman"/>
-          <w:color w:val="000000"/>
-          <w:sz w:val="24"/>
-        </w:rPr>
-        <w:tab/>
-      </w:r>
-    </w:p>
-    <w:p>
-      <w:pPr>
-        <w:tabs>
-          <w:tab w:pos="8787" w:val="right" w:leader="dot"/>
-        </w:tabs>
-        <w:spacing w:after="40" w:before="20" w:line="276" w:lineRule="auto"/>
-        <w:ind w:firstLine="0" w:left="567"/>
-      </w:pPr>
-      <w:r>
-        <w:rPr>
-          <w:rFonts w:ascii="Times New Roman" w:hAnsi="Times New Roman" w:eastAsia="Times New Roman"/>
-          <w:b w:val="0"/>
-          <w:color w:val="000000"/>
-          <w:sz w:val="24"/>
-        </w:rPr>
-        <w:t>5.2.5  UC10 -- Lập phiếu xuất kho</w:t>
+        <w:t>5.2.2  Phiếu xuất kho</w:t>
       </w:r>
       <w:r>
         <w:rPr>
@@ -2547,85 +2599,7 @@
           <w:color w:val="000000"/>
           <w:sz w:val="24"/>
         </w:rPr>
-        <w:t>5.3  Phân tích hành vi đối tượng phiếu (biểu đồ trạng thái)</w:t>
-      </w:r>
-      <w:r>
-        <w:rPr>
-          <w:rFonts w:ascii="Times New Roman" w:hAnsi="Times New Roman" w:eastAsia="Times New Roman"/>
-          <w:color w:val="000000"/>
-          <w:sz w:val="24"/>
-        </w:rPr>
-        <w:tab/>
-      </w:r>
-    </w:p>
-    <w:p>
-      <w:pPr>
-        <w:tabs>
-          <w:tab w:pos="8787" w:val="right" w:leader="dot"/>
-        </w:tabs>
-        <w:spacing w:after="40" w:before="20" w:line="276" w:lineRule="auto"/>
-        <w:ind w:firstLine="0" w:left="567"/>
-      </w:pPr>
-      <w:r>
-        <w:rPr>
-          <w:rFonts w:ascii="Times New Roman" w:hAnsi="Times New Roman" w:eastAsia="Times New Roman"/>
-          <w:b w:val="0"/>
-          <w:color w:val="000000"/>
-          <w:sz w:val="24"/>
-        </w:rPr>
-        <w:t>5.3.1  Phiếu nhập kho</w:t>
-      </w:r>
-      <w:r>
-        <w:rPr>
-          <w:rFonts w:ascii="Times New Roman" w:hAnsi="Times New Roman" w:eastAsia="Times New Roman"/>
-          <w:color w:val="000000"/>
-          <w:sz w:val="24"/>
-        </w:rPr>
-        <w:tab/>
-      </w:r>
-    </w:p>
-    <w:p>
-      <w:pPr>
-        <w:tabs>
-          <w:tab w:pos="8787" w:val="right" w:leader="dot"/>
-        </w:tabs>
-        <w:spacing w:after="40" w:before="20" w:line="276" w:lineRule="auto"/>
-        <w:ind w:firstLine="0" w:left="567"/>
-      </w:pPr>
-      <w:r>
-        <w:rPr>
-          <w:rFonts w:ascii="Times New Roman" w:hAnsi="Times New Roman" w:eastAsia="Times New Roman"/>
-          <w:b w:val="0"/>
-          <w:color w:val="000000"/>
-          <w:sz w:val="24"/>
-        </w:rPr>
-        <w:t>5.3.2  Phiếu xuất kho</w:t>
-      </w:r>
-      <w:r>
-        <w:rPr>
-          <w:rFonts w:ascii="Times New Roman" w:hAnsi="Times New Roman" w:eastAsia="Times New Roman"/>
-          <w:color w:val="000000"/>
-          <w:sz w:val="24"/>
-        </w:rPr>
-        <w:tab/>
-      </w:r>
-    </w:p>
-    <w:p>
-      <w:pPr>
-        <w:tabs>
-          <w:tab w:pos="8787" w:val="right" w:leader="dot"/>
-        </w:tabs>
-        <w:spacing w:after="40" w:before="20" w:line="276" w:lineRule="auto"/>
-        <w:ind w:firstLine="0" w:left="283"/>
-      </w:pPr>
-      <w:r>
-        <w:rPr>
-          <w:rFonts w:ascii="Times New Roman" w:hAnsi="Times New Roman" w:eastAsia="Times New Roman"/>
-          <w:b w:val="0"/>
-          <w:color w:val="000000"/>
-          <w:sz w:val="24"/>
-        </w:rPr>
-        <w:t>5.4  Kết luận chương</w:t>
+        <w:t>5.3  Kết luận chương</w:t>
       </w:r>
       <w:r>
         <w:rPr>
@@ -24072,7 +24046,7 @@
           <w:color w:val="000000"/>
           <w:sz w:val="26"/>
         </w:rPr>
-        <w:t>5.1 Mục đích giai đoạn</w:t>
+        <w:t>5.1 Phân tích hành vi bằng biểu đồ trình tự</w:t>
       </w:r>
     </w:p>
     <w:p>
@@ -24086,7 +24060,7 @@
           <w:color w:val="000000"/>
           <w:sz w:val="24"/>
         </w:rPr>
-        <w:t>Đây là</w:t>
+        <w:t>Sau phân tích chức năng (use case) và cấu trúc (lớp), chương này dùng</w:t>
       </w:r>
     </w:p>
     <w:p>
@@ -24100,7 +24074,7 @@
           <w:color w:val="000000"/>
           <w:sz w:val="24"/>
         </w:rPr>
-        <w:t>giai đoạn 3 / 3</w:t>
+        <w:t>biểu đồ trình tự (Sequence)</w:t>
       </w:r>
     </w:p>
     <w:p>
@@ -24114,334 +24088,21 @@
           <w:color w:val="000000"/>
           <w:sz w:val="24"/>
         </w:rPr>
-        <w:t>của phân tích hướng đối tượng.</w:t>
-      </w:r>
-    </w:p>
-    <w:p>
-      <w:pPr>
-        <w:spacing w:line="276" w:lineRule="auto" w:after="60"/>
-        <w:ind w:firstLine="0" w:left="567"/>
-      </w:pPr>
-      <w:r>
-        <w:rPr>
-          <w:rFonts w:ascii="Times New Roman" w:hAnsi="Times New Roman" w:eastAsia="Times New Roman"/>
-          <w:color w:val="000000"/>
-          <w:sz w:val="24"/>
-        </w:rPr>
-        <w:t>• Phân tích hành vi trả lời: để hoàn thành một use case, các đối tượng tương tác theo thời gian ra sao (ai gọi ai, thứ tự bước nào).</w:t>
-      </w:r>
-    </w:p>
-    <w:p>
-      <w:pPr>
-        <w:spacing w:line="276" w:lineRule="auto" w:after="60"/>
-        <w:ind w:firstLine="0" w:left="567"/>
-      </w:pPr>
-      <w:r>
-        <w:rPr>
-          <w:rFonts w:ascii="Times New Roman" w:hAnsi="Times New Roman" w:eastAsia="Times New Roman"/>
-          <w:color w:val="000000"/>
-          <w:sz w:val="24"/>
-        </w:rPr>
-        <w:t>• Biểu đồ dùng để phân tích: Sequence Diagram (biểu đồ trình tự).</w:t>
-      </w:r>
-    </w:p>
-    <w:p>
-      <w:pPr>
-        <w:spacing w:line="276" w:lineRule="auto" w:after="60"/>
-        <w:ind w:firstLine="0" w:left="567"/>
-      </w:pPr>
-      <w:r>
-        <w:rPr>
-          <w:rFonts w:ascii="Times New Roman" w:hAnsi="Times New Roman" w:eastAsia="Times New Roman"/>
-          <w:color w:val="000000"/>
-          <w:sz w:val="24"/>
-        </w:rPr>
-        <w:t>• Bổ sung: State Machine -- hành vi nội tại của đối tượng phiếu (vòng đời trạng thái).</w:t>
-      </w:r>
-    </w:p>
-    <w:p>
-      <w:pPr>
-        <w:spacing w:line="276" w:lineRule="auto" w:after="60"/>
-        <w:ind w:firstLine="0" w:left="567"/>
-      </w:pPr>
-      <w:r>
-        <w:rPr>
-          <w:rFonts w:ascii="Times New Roman" w:hAnsi="Times New Roman" w:eastAsia="Times New Roman"/>
-          <w:color w:val="000000"/>
-          <w:sz w:val="24"/>
-        </w:rPr>
-        <w:t>• Đầu vào: use case (Ch.3) + lớp/quan hệ (Ch.4).</w:t>
-      </w:r>
-    </w:p>
-    <w:tbl>
-      <w:tblPr>
-        <w:tblStyle w:val="TableGrid"/>
-        <w:tblW w:type="auto" w:w="0"/>
-        <w:jc w:val="center"/>
-        <w:tblLook w:firstColumn="1" w:firstRow="1" w:lastColumn="0" w:lastRow="0" w:noHBand="0" w:noVBand="1" w:val="04A0"/>
-      </w:tblPr>
-      <w:tblGrid>
-        <w:gridCol w:w="3024"/>
-        <w:gridCol w:w="3024"/>
-        <w:gridCol w:w="3024"/>
-      </w:tblGrid>
-      <w:tr>
-        <w:tc>
-          <w:tcPr>
-            <w:tcW w:type="dxa" w:w="3024"/>
-          </w:tcPr>
-          <w:p>
-            <w:r/>
-            <w:r>
-              <w:rPr>
-                <w:rFonts w:ascii="Times New Roman" w:hAnsi="Times New Roman" w:eastAsia="Times New Roman"/>
-                <w:b/>
-                <w:color w:val="000000"/>
-                <w:sz w:val="22"/>
-              </w:rPr>
-              <w:t>|p5cm|p4.5cm|</w:t>
-              <w:br/>
-              <w:br/>
-              <w:t>Giai đoạn</w:t>
-            </w:r>
-          </w:p>
-        </w:tc>
-        <w:tc>
-          <w:tcPr>
-            <w:tcW w:type="dxa" w:w="3024"/>
-          </w:tcPr>
-          <w:p>
-            <w:r/>
-            <w:r>
-              <w:rPr>
-                <w:rFonts w:ascii="Times New Roman" w:hAnsi="Times New Roman" w:eastAsia="Times New Roman"/>
-                <w:b/>
-                <w:color w:val="000000"/>
-                <w:sz w:val="22"/>
-              </w:rPr>
-              <w:t>Câu hỏi</w:t>
-            </w:r>
-          </w:p>
-        </w:tc>
-        <w:tc>
-          <w:tcPr>
-            <w:tcW w:type="dxa" w:w="3024"/>
-          </w:tcPr>
-          <w:p>
-            <w:r/>
-            <w:r>
-              <w:rPr>
-                <w:rFonts w:ascii="Times New Roman" w:hAnsi="Times New Roman" w:eastAsia="Times New Roman"/>
-                <w:b/>
-                <w:color w:val="000000"/>
-                <w:sz w:val="22"/>
-              </w:rPr>
-              <w:t>Biểu đồ</w:t>
-            </w:r>
-          </w:p>
-        </w:tc>
-      </w:tr>
-      <w:tr>
-        <w:tc>
-          <w:tcPr>
-            <w:tcW w:type="dxa" w:w="3024"/>
-          </w:tcPr>
-          <w:p>
-            <w:r/>
-            <w:r>
-              <w:rPr>
-                <w:rFonts w:ascii="Times New Roman" w:hAnsi="Times New Roman" w:eastAsia="Times New Roman"/>
-                <w:b w:val="0"/>
-                <w:color w:val="000000"/>
-                <w:sz w:val="22"/>
-              </w:rPr>
-              <w:t>Chức năng (Ch.3)</w:t>
-            </w:r>
-          </w:p>
-        </w:tc>
-        <w:tc>
-          <w:tcPr>
-            <w:tcW w:type="dxa" w:w="3024"/>
-          </w:tcPr>
-          <w:p>
-            <w:r/>
-            <w:r>
-              <w:rPr>
-                <w:rFonts w:ascii="Times New Roman" w:hAnsi="Times New Roman" w:eastAsia="Times New Roman"/>
-                <w:b w:val="0"/>
-                <w:color w:val="000000"/>
-                <w:sz w:val="22"/>
-              </w:rPr>
-              <w:t>Hệ thống làm gì? Ai dùng?</w:t>
-            </w:r>
-          </w:p>
-        </w:tc>
-        <w:tc>
-          <w:tcPr>
-            <w:tcW w:type="dxa" w:w="3024"/>
-          </w:tcPr>
-          <w:p>
-            <w:r/>
-            <w:r>
-              <w:rPr>
-                <w:rFonts w:ascii="Times New Roman" w:hAnsi="Times New Roman" w:eastAsia="Times New Roman"/>
-                <w:b w:val="0"/>
-                <w:color w:val="000000"/>
-                <w:sz w:val="22"/>
-              </w:rPr>
-              <w:t>Use Case</w:t>
-            </w:r>
-          </w:p>
-        </w:tc>
-      </w:tr>
-      <w:tr>
-        <w:tc>
-          <w:tcPr>
-            <w:tcW w:type="dxa" w:w="3024"/>
-          </w:tcPr>
-          <w:p>
-            <w:r/>
-            <w:r>
-              <w:rPr>
-                <w:rFonts w:ascii="Times New Roman" w:hAnsi="Times New Roman" w:eastAsia="Times New Roman"/>
-                <w:b w:val="0"/>
-                <w:color w:val="000000"/>
-                <w:sz w:val="22"/>
-              </w:rPr>
-              <w:t>Cấu trúc (Ch.4)</w:t>
-            </w:r>
-          </w:p>
-        </w:tc>
-        <w:tc>
-          <w:tcPr>
-            <w:tcW w:type="dxa" w:w="3024"/>
-          </w:tcPr>
-          <w:p>
-            <w:r/>
-            <w:r>
-              <w:rPr>
-                <w:rFonts w:ascii="Times New Roman" w:hAnsi="Times New Roman" w:eastAsia="Times New Roman"/>
-                <w:b w:val="0"/>
-                <w:color w:val="000000"/>
-                <w:sz w:val="22"/>
-              </w:rPr>
-              <w:t>Có những lớp nào? Quan hệ?</w:t>
-            </w:r>
-          </w:p>
-        </w:tc>
-        <w:tc>
-          <w:tcPr>
-            <w:tcW w:type="dxa" w:w="3024"/>
-          </w:tcPr>
-          <w:p>
-            <w:r/>
-            <w:r>
-              <w:rPr>
-                <w:rFonts w:ascii="Times New Roman" w:hAnsi="Times New Roman" w:eastAsia="Times New Roman"/>
-                <w:b w:val="0"/>
-                <w:color w:val="000000"/>
-                <w:sz w:val="22"/>
-              </w:rPr>
-              <w:t>Class</w:t>
-            </w:r>
-          </w:p>
-        </w:tc>
-      </w:tr>
-      <w:tr>
-        <w:tc>
-          <w:tcPr>
-            <w:tcW w:type="dxa" w:w="3024"/>
-          </w:tcPr>
-          <w:p>
-            <w:r/>
-            <w:r>
-              <w:rPr>
-                <w:rFonts w:ascii="Times New Roman" w:hAnsi="Times New Roman" w:eastAsia="Times New Roman"/>
-                <w:b w:val="0"/>
-                <w:color w:val="000000"/>
-                <w:sz w:val="22"/>
-              </w:rPr>
-              <w:t>Hành vi (Ch.5)</w:t>
-            </w:r>
-          </w:p>
-        </w:tc>
-        <w:tc>
-          <w:tcPr>
-            <w:tcW w:type="dxa" w:w="3024"/>
-          </w:tcPr>
-          <w:p>
-            <w:r/>
-            <w:r>
-              <w:rPr>
-                <w:rFonts w:ascii="Times New Roman" w:hAnsi="Times New Roman" w:eastAsia="Times New Roman"/>
-                <w:b w:val="0"/>
-                <w:color w:val="000000"/>
-                <w:sz w:val="22"/>
-              </w:rPr>
-              <w:t>Lớp tương tác thế nào theo thời gian?</w:t>
-            </w:r>
-          </w:p>
-        </w:tc>
-        <w:tc>
-          <w:tcPr>
-            <w:tcW w:type="dxa" w:w="3024"/>
-          </w:tcPr>
-          <w:p>
-            <w:r/>
-            <w:r>
-              <w:rPr>
-                <w:rFonts w:ascii="Times New Roman" w:hAnsi="Times New Roman" w:eastAsia="Times New Roman"/>
-                <w:b w:val="0"/>
-                <w:color w:val="000000"/>
-                <w:sz w:val="22"/>
-              </w:rPr>
-              <w:t>Sequence</w:t>
-            </w:r>
-          </w:p>
-        </w:tc>
-      </w:tr>
-    </w:tbl>
-    <w:p/>
-    <w:p>
-      <w:pPr>
-        <w:pStyle w:val="Heading2"/>
+        <w:t>để mô tả các đối tượng tương tác theo thời gian khi thực hiện use case. Mỗi sơ đồ gắn một use case đã đặc tả: actor, giao diện, phần xử lý và dữ liệu.</w:t>
+      </w:r>
+    </w:p>
+    <w:p>
+      <w:pPr>
+        <w:pStyle w:val="Heading3"/>
       </w:pPr>
       <w:r>
         <w:rPr>
           <w:rFonts w:ascii="Times New Roman" w:hAnsi="Times New Roman" w:eastAsia="Times New Roman"/>
           <w:b/>
           <w:color w:val="000000"/>
-          <w:sz w:val="26"/>
-        </w:rPr>
-        <w:t>5.2 Phân tích hành vi bằng biểu đồ trình tự</w:t>
-      </w:r>
-    </w:p>
-    <w:p>
-      <w:pPr>
-        <w:spacing w:line="276" w:lineRule="auto" w:after="120"/>
-        <w:ind w:firstLine="567"/>
-      </w:pPr>
-      <w:r>
-        <w:rPr>
-          <w:rFonts w:ascii="Times New Roman" w:hAnsi="Times New Roman" w:eastAsia="Times New Roman"/>
-          <w:color w:val="000000"/>
-          <w:sz w:val="24"/>
-        </w:rPr>
-        <w:t>Mỗi sơ đồ trình tự gắn với một use case đã đặc tả: thể hiện actor, giao diện, phần xử lý và dữ liệu trao đổi thông điệp.</w:t>
-      </w:r>
-    </w:p>
-    <w:p>
-      <w:pPr>
-        <w:pStyle w:val="Heading3"/>
-      </w:pPr>
-      <w:r>
-        <w:rPr>
-          <w:rFonts w:ascii="Times New Roman" w:hAnsi="Times New Roman" w:eastAsia="Times New Roman"/>
-          <w:b/>
-          <w:color w:val="000000"/>
-          <w:sz w:val="24"/>
-        </w:rPr>
-        <w:t>5.2.1 UC01 -- Đăng nhập</w:t>
+          <w:sz w:val="24"/>
+        </w:rPr>
+        <w:t>5.1.1 UC01 -- Đăng nhập</w:t>
       </w:r>
     </w:p>
     <w:p>
@@ -24750,7 +24411,7 @@
           <w:color w:val="000000"/>
           <w:sz w:val="24"/>
         </w:rPr>
-        <w:t>5.2.2 UC06 -- Thêm hàng hóa</w:t>
+        <w:t>5.1.2 UC06 -- Thêm hàng hóa</w:t>
       </w:r>
     </w:p>
     <w:p>
@@ -25185,7 +24846,7 @@
           <w:color w:val="000000"/>
           <w:sz w:val="24"/>
         </w:rPr>
-        <w:t>5.2.3 UC07 -- Tìm kiếm hàng hóa</w:t>
+        <w:t>5.1.3 UC07 -- Tìm kiếm hàng hóa</w:t>
       </w:r>
     </w:p>
     <w:p>
@@ -25480,7 +25141,7 @@
           <w:color w:val="000000"/>
           <w:sz w:val="24"/>
         </w:rPr>
-        <w:t>5.2.4 UC09 -- Lập phiếu nhập kho</w:t>
+        <w:t>5.1.4 UC09 -- Lập phiếu nhập kho</w:t>
       </w:r>
     </w:p>
     <w:p>
@@ -25873,7 +25534,7 @@
           <w:color w:val="000000"/>
           <w:sz w:val="24"/>
         </w:rPr>
-        <w:t>5.2.5 UC10 -- Lập phiếu xuất kho</w:t>
+        <w:t>5.1.5 UC10 -- Lập phiếu xuất kho</w:t>
       </w:r>
     </w:p>
     <w:p>
@@ -26182,7 +25843,7 @@
           <w:color w:val="000000"/>
           <w:sz w:val="26"/>
         </w:rPr>
-        <w:t>5.3 Phân tích hành vi đối tượng phiếu (biểu đồ trạng thái)</w:t>
+        <w:t>5.2 Phân tích hành vi đối tượng phiếu (biểu đồ trạng thái)</w:t>
       </w:r>
     </w:p>
     <w:p>
@@ -26266,7 +25927,7 @@
           <w:color w:val="000000"/>
           <w:sz w:val="24"/>
         </w:rPr>
-        <w:t>5.3.1 Phiếu nhập kho</w:t>
+        <w:t>5.2.1 Phiếu nhập kho</w:t>
       </w:r>
     </w:p>
     <w:p>
@@ -26505,7 +26166,7 @@
           <w:color w:val="000000"/>
           <w:sz w:val="24"/>
         </w:rPr>
-        <w:t>5.3.2 Phiếu xuất kho</w:t>
+        <w:t>5.2.2 Phiếu xuất kho</w:t>
       </w:r>
     </w:p>
     <w:p>
@@ -26632,7 +26293,7 @@
           <w:color w:val="000000"/>
           <w:sz w:val="26"/>
         </w:rPr>
-        <w:t>5.4 Kết luận chương</w:t>
+        <w:t>5.3 Kết luận chương</w:t>
       </w:r>
     </w:p>
     <w:p>

</xml_diff>

<commit_message>
Điều chỉnh phân quyền actor cho module kho và báo cáo - loại bỏ QTV khỏi UC18-22 (quản lý kho) và UC34 (báo cáo tồn), chỉ giữ lại Quản lý kho; cập nhật mô tả actor QTV từ "quản lý kho, báo cáo" thành "chỉ quản lý tài khoản và đăng nhập/đăng xuất", sửa giải thích sơ đồ use case tổng quát (QTV không nối kho/báo cáo), bổ sung lưu ý "QTV không tham gia" vào giải thích UC18-22, đổi tiêu đề hình 7.1 từ "theo use case" thành "menu
</commit_message>
<xml_diff>
--- a/VIII.HUST/Phân tích và thiết kế hệ thống/BaoCao/BaoCao_QuanLyKhoHang.docx
+++ b/VIII.HUST/Phân tích và thiết kế hệ thống/BaoCao/BaoCao_QuanLyKhoHang.docx
@@ -4126,7 +4126,7 @@
           <w:color w:val="000000"/>
           <w:sz w:val="24"/>
         </w:rPr>
-        <w:t>7.1  Sơ đồ điều hướng màn hình chính (theo use case)</w:t>
+        <w:t>7.1  Sơ đồ điều hướng màn hình (menu theo vai trò: QTV chủ yếu Tài khoản)</w:t>
       </w:r>
       <w:r>
         <w:rPr>
@@ -7074,7 +7074,7 @@
           <w:color w:val="000000"/>
           <w:sz w:val="24"/>
         </w:rPr>
-        <w:t>: QL kho, QTV.</w:t>
+        <w:t>: Quản lý kho (QTV không quản lý kho).</w:t>
       </w:r>
     </w:p>
     <w:p>
@@ -8138,7 +8138,7 @@
           <w:color w:val="000000"/>
           <w:sz w:val="24"/>
         </w:rPr>
-        <w:t>: QL, QTV.</w:t>
+        <w:t>: Quản lý kho (QTV không xem báo cáo nghiệp vụ).</w:t>
       </w:r>
     </w:p>
     <w:p>
@@ -9336,7 +9336,7 @@
                 <w:color w:val="000000"/>
                 <w:sz w:val="22"/>
               </w:rPr>
-              <w:t>Quản lý tài khoản, phân quyền; quản lý kho; xem báo cáo nhập xuất tồn.</w:t>
+              <w:t>Chỉ quản lý tài khoản (thêm/sửa/xóa/tìm/xem DS) và đăng nhập/đăng xuất. Không thao tác kho, phiếu, báo cáo.</w:t>
             </w:r>
           </w:p>
         </w:tc>
@@ -9372,7 +9372,7 @@
                 <w:color w:val="000000"/>
                 <w:sz w:val="22"/>
               </w:rPr>
-              <w:t>Duyệt phiếu; quản lý NCC, hàng, kho (đủ thêm/sửa/xóa/tìm/xem); xem báo cáo.</w:t>
+              <w:t>Duyệt phiếu; quản lý NCC, hàng, kho; xem báo cáo tồn.</w:t>
             </w:r>
           </w:p>
         </w:tc>
@@ -9651,7 +9651,7 @@
           <w:color w:val="000000"/>
           <w:sz w:val="24"/>
         </w:rPr>
-        <w:t>• Đường nối actor--oval: actor đó được quyền tham gia nhóm chức năng tương ứng (ví dụ NV không nối “Báo cáo tồn” nếu chỉ QL/QTV xem báo cáo; QTV nối tài khoản và kho).</w:t>
+        <w:t>• Đường nối actor--oval: QTV chỉ nối Đăng nhập/Đăng xuất và Quản lý tài khoản; không nối kho hay báo cáo. QL nối các nghiệp vụ kho + báo cáo; NV nối danh mục/phiếu (không báo cáo, không quản lý kho master).</w:t>
       </w:r>
     </w:p>
     <w:p>
@@ -10312,7 +10312,7 @@
           <w:color w:val="000000"/>
           <w:sz w:val="24"/>
         </w:rPr>
-        <w:t>(Thêm/Sửa/Xóa/Tìm/Xem DS), NV+QL. Cột phải --</w:t>
+        <w:t>(Thêm/Sửa/Xóa/Tìm/Xem DS), NV và QL. Cột phải --</w:t>
       </w:r>
     </w:p>
     <w:p>
@@ -10340,7 +10340,35 @@
           <w:color w:val="000000"/>
           <w:sz w:val="24"/>
         </w:rPr>
-        <w:t>cùng năm thao tác, chủ yếu QL/QTV. Nguyên tắc: thêm được thì phải sửa/xóa/tìm/xem được.</w:t>
+        <w:t>,</w:t>
+      </w:r>
+    </w:p>
+    <w:p>
+      <w:pPr>
+        <w:spacing w:line="276" w:lineRule="auto" w:after="120"/>
+        <w:ind w:firstLine="0"/>
+      </w:pPr>
+      <w:r>
+        <w:rPr>
+          <w:rFonts w:ascii="Times New Roman" w:hAnsi="Times New Roman" w:eastAsia="Times New Roman"/>
+          <w:color w:val="000000"/>
+          <w:sz w:val="24"/>
+        </w:rPr>
+        <w:t>chỉ Quản lý kho</w:t>
+      </w:r>
+    </w:p>
+    <w:p>
+      <w:pPr>
+        <w:spacing w:line="276" w:lineRule="auto" w:after="120"/>
+        <w:ind w:firstLine="567"/>
+      </w:pPr>
+      <w:r>
+        <w:rPr>
+          <w:rFonts w:ascii="Times New Roman" w:hAnsi="Times New Roman" w:eastAsia="Times New Roman"/>
+          <w:color w:val="000000"/>
+          <w:sz w:val="24"/>
+        </w:rPr>
+        <w:t>(QTV không tham gia). Nguyên tắc: thêm được thì phải sửa/xóa/tìm/xem được.</w:t>
       </w:r>
     </w:p>
     <w:p>
@@ -11878,7 +11906,7 @@
                 <w:color w:val="000000"/>
                 <w:sz w:val="22"/>
               </w:rPr>
-              <w:t>QL, QTV</w:t>
+              <w:t>QL</w:t>
             </w:r>
           </w:p>
         </w:tc>
@@ -11948,7 +11976,7 @@
                 <w:color w:val="000000"/>
                 <w:sz w:val="22"/>
               </w:rPr>
-              <w:t>QL, QTV</w:t>
+              <w:t>QL</w:t>
             </w:r>
           </w:p>
         </w:tc>
@@ -12018,7 +12046,7 @@
                 <w:color w:val="000000"/>
                 <w:sz w:val="22"/>
               </w:rPr>
-              <w:t>QL, QTV</w:t>
+              <w:t>QL</w:t>
             </w:r>
           </w:p>
         </w:tc>
@@ -12088,7 +12116,7 @@
                 <w:color w:val="000000"/>
                 <w:sz w:val="22"/>
               </w:rPr>
-              <w:t>QL, QTV</w:t>
+              <w:t>QL</w:t>
             </w:r>
           </w:p>
         </w:tc>
@@ -12158,7 +12186,7 @@
                 <w:color w:val="000000"/>
                 <w:sz w:val="22"/>
               </w:rPr>
-              <w:t>QL, QTV</w:t>
+              <w:t>QL</w:t>
             </w:r>
           </w:p>
         </w:tc>
@@ -12998,7 +13026,7 @@
                 <w:color w:val="000000"/>
                 <w:sz w:val="22"/>
               </w:rPr>
-              <w:t>QL, QTV</w:t>
+              <w:t>QL</w:t>
             </w:r>
           </w:p>
         </w:tc>
@@ -17031,7 +17059,7 @@
           <w:color w:val="000000"/>
           <w:sz w:val="24"/>
         </w:rPr>
-        <w:t>• Tác nhân chính: QL, QTV.</w:t>
+        <w:t>• Tác nhân chính: Quản lý kho.</w:t>
       </w:r>
     </w:p>
     <w:p>
@@ -17229,7 +17257,7 @@
           <w:color w:val="000000"/>
           <w:sz w:val="24"/>
         </w:rPr>
-        <w:t>• Tác nhân chính: QL, QTV.</w:t>
+        <w:t>• Tác nhân chính: Quản lý kho.</w:t>
       </w:r>
     </w:p>
     <w:p>
@@ -17413,7 +17441,7 @@
           <w:color w:val="000000"/>
           <w:sz w:val="24"/>
         </w:rPr>
-        <w:t>• Tác nhân chính: QL, QTV.</w:t>
+        <w:t>• Tác nhân chính: Quản lý kho.</w:t>
       </w:r>
     </w:p>
     <w:p>
@@ -17597,7 +17625,7 @@
           <w:color w:val="000000"/>
           <w:sz w:val="24"/>
         </w:rPr>
-        <w:t>• Tác nhân chính: QL, QTV.</w:t>
+        <w:t>• Tác nhân chính: Quản lý kho.</w:t>
       </w:r>
     </w:p>
     <w:p>
@@ -17781,7 +17809,7 @@
           <w:color w:val="000000"/>
           <w:sz w:val="24"/>
         </w:rPr>
-        <w:t>• Tác nhân chính: QL, QTV.</w:t>
+        <w:t>• Tác nhân chính: Quản lý kho.</w:t>
       </w:r>
     </w:p>
     <w:p>
@@ -19145,7 +19173,7 @@
           <w:color w:val="000000"/>
           <w:sz w:val="24"/>
         </w:rPr>
-        <w:t>• Tác nhân: QL, QTV.</w:t>
+        <w:t>• Tác nhân: Quản lý kho.</w:t>
       </w:r>
     </w:p>
     <w:p>
@@ -31608,7 +31636,7 @@
           <w:color w:val="000000"/>
           <w:sz w:val="22"/>
         </w:rPr>
-        <w:t>Hình 7.1: Sơ đồ điều hướng màn hình chính (theo use case)</w:t>
+        <w:t>Hình 7.1: Sơ đồ điều hướng màn hình (menu theo vai trò: QTV chủ yếu Tài khoản)</w:t>
       </w:r>
     </w:p>
     <w:p>
@@ -31678,7 +31706,21 @@
           <w:color w:val="000000"/>
           <w:sz w:val="24"/>
         </w:rPr>
-        <w:t>• Từ trang chủ tỏa ra các màn chức năng: Hàng hóa (UC13--UC17), NCC (UC08--UC12), Kho (UC18--UC22), Tài khoản (UC03--UC07), Báo cáo (UC34), Phiếu nhập (UC23--UC27), Phiếu xuất (UC28--UC32), Kiểm kê (UC33).</w:t>
+        <w:t>• Từ trang chủ tỏa ra các màn chức năng (theo vai trò): QTV chủ yếu thấy Tài khoản (UC03--UC07); QL/NV thấy hàng, NCC, kho, phiếu, báo cáo tương ứng quyền.</w:t>
+      </w:r>
+    </w:p>
+    <w:p>
+      <w:pPr>
+        <w:spacing w:line="276" w:lineRule="auto" w:after="60"/>
+        <w:ind w:firstLine="0" w:left="567"/>
+      </w:pPr>
+      <w:r>
+        <w:rPr>
+          <w:rFonts w:ascii="Times New Roman" w:hAnsi="Times New Roman" w:eastAsia="Times New Roman"/>
+          <w:color w:val="000000"/>
+          <w:sz w:val="24"/>
+        </w:rPr>
+        <w:t>• Sơ đồ vẽ đủ các màn hệ thống; khi triển khai, menu ẩn mục không thuộc quyền actor (QTV không vào kho/báo cáo).</w:t>
       </w:r>
     </w:p>
     <w:p>

</xml_diff>